<commit_message>
fix(research): correct plan A school identity
Co-authored-by: Codex <codex@openai.com>
</commit_message>
<xml_diff>
--- a/public/docs/classroom-research/p4-multiply-race-research-plan-a.docx
+++ b/public/docs/classroom-research/p4-multiply-race-research-plan-a.docx
@@ -124,9 +124,11 @@
       </w:pPr>
       <w:r>
         <w:rPr>
-          <w:rFonts w:cs="TH Sarabun New"/>
-        </w:rPr>
-        <w:t>สำนักงานเขตพื้นที่การศึกษาประถมศึกษากาฬสินธุ์ เขต 3</w:t>
+          <w:rFonts w:ascii="TH Sarabun New" w:hAnsi="TH Sarabun New" w:eastAsia="TH Sarabun New" w:cs="TH Sarabun New"/>
+          <w:b w:val="0"/>
+          <w:sz w:val="32"/>
+        </w:rPr>
+        <w:t>กลุ่มเครือข่ายโรงเรียนกุมภวาปี 1 · สำนักงานเขตพื้นที่การศึกษาประถมศึกษาอุดรธานี เขต 2</w:t>
       </w:r>
     </w:p>
     <w:p>
@@ -376,10 +378,11 @@
           <w:p>
             <w:r>
               <w:rPr>
-                <w:rFonts w:cs="TH Sarabun New"/>
-                <w:sz w:val="30"/>
-              </w:rPr>
-              <w:t>โรงเรียนบ้านคำไผ่</w:t>
+                <w:rFonts w:ascii="TH Sarabun New" w:hAnsi="TH Sarabun New" w:eastAsia="TH Sarabun New" w:cs="TH Sarabun New"/>
+                <w:b w:val="0"/>
+                <w:sz w:val="28"/>
+              </w:rPr>
+              <w:t>โรงเรียนบ้านคำไผ่ · กลุ่มเครือข่ายโรงเรียนกุมภวาปี 1 · สพป.อุดรธานี เขต 2</w:t>
             </w:r>
           </w:p>
         </w:tc>
@@ -658,9 +661,11 @@
       </w:pPr>
       <w:r>
         <w:rPr>
-          <w:rFonts w:ascii="TH Sarabun New" w:eastAsia="TH Sarabun New" w:hAnsi="TH Sarabun New" w:cs="TH Sarabun New"/>
-        </w:rPr>
-        <w:t>ข้อมูลสถานศึกษา (จากหน้าเว็บโรงเรียน)</w:t>
+          <w:rFonts w:ascii="TH Sarabun New" w:hAnsi="TH Sarabun New" w:eastAsia="TH Sarabun New" w:cs="TH Sarabun New"/>
+          <w:b w:val="0"/>
+          <w:sz w:val="32"/>
+        </w:rPr>
+        <w:t>ข้อมูลสถานศึกษา (ข้อมูลยืนยันล่าสุด)</w:t>
       </w:r>
     </w:p>
     <w:tbl>
@@ -736,25 +741,26 @@
         </w:tc>
       </w:tr>
       <w:tr>
-        <w:trPr>
-          <w:jc w:val="center"/>
-        </w:trPr>
-        <w:tc>
-          <w:tcPr>
-            <w:tcW w:w="2232" w:type="dxa"/>
-            <w:tcMar>
-              <w:top w:w="90" w:type="dxa"/>
-              <w:left w:w="120" w:type="dxa"/>
-              <w:bottom w:w="90" w:type="dxa"/>
-              <w:right w:w="120" w:type="dxa"/>
-            </w:tcMar>
-            <w:vAlign w:val="center"/>
-          </w:tcPr>
-          <w:p>
-            <w:r>
-              <w:rPr>
-                <w:rFonts w:cs="TH Sarabun New"/>
-                <w:sz w:val="26"/>
+        <w:tc>
+          <w:tcPr>
+            <w:tcW w:type="dxa" w:w="2232"/>
+            <w:tcMar>
+              <w:top w:w="90" w:type="dxa"/>
+              <w:bottom w:w="90" w:type="dxa"/>
+              <w:start w:w="120" w:type="dxa"/>
+              <w:end w:w="120" w:type="dxa"/>
+            </w:tcMar>
+            <w:vAlign w:val="center"/>
+            <w:shd w:fill="F2F4F7"/>
+          </w:tcPr>
+          <w:p>
+            <w:r/>
+            <w:r>
+              <w:rPr>
+                <w:rFonts w:ascii="TH Sarabun New" w:hAnsi="TH Sarabun New" w:eastAsia="TH Sarabun New" w:cs="TH Sarabun New"/>
+                <w:b/>
+                <w:color w:val="17365D"/>
+                <w:sz w:val="28"/>
               </w:rPr>
               <w:t>ชื่อสถานศึกษา</w:t>
             </w:r>
@@ -762,140 +768,149 @@
         </w:tc>
         <w:tc>
           <w:tcPr>
-            <w:tcW w:w="7416" w:type="dxa"/>
-            <w:tcMar>
-              <w:top w:w="90" w:type="dxa"/>
-              <w:left w:w="120" w:type="dxa"/>
-              <w:bottom w:w="90" w:type="dxa"/>
-              <w:right w:w="120" w:type="dxa"/>
-            </w:tcMar>
-            <w:vAlign w:val="center"/>
-          </w:tcPr>
-          <w:p>
-            <w:r>
-              <w:rPr>
-                <w:rFonts w:cs="TH Sarabun New"/>
-                <w:sz w:val="26"/>
-              </w:rPr>
-              <w:t>โรงเรียนบ้านคำไผ่ (เดิมชื่อโรงเรียนวัดบ้านคำไผ่)</w:t>
+            <w:tcW w:type="dxa" w:w="7416"/>
+            <w:tcMar>
+              <w:top w:w="90" w:type="dxa"/>
+              <w:bottom w:w="90" w:type="dxa"/>
+              <w:start w:w="120" w:type="dxa"/>
+              <w:end w:w="120" w:type="dxa"/>
+            </w:tcMar>
+            <w:vAlign w:val="center"/>
+          </w:tcPr>
+          <w:p>
+            <w:r/>
+            <w:r>
+              <w:rPr>
+                <w:rFonts w:ascii="TH Sarabun New" w:hAnsi="TH Sarabun New" w:eastAsia="TH Sarabun New" w:cs="TH Sarabun New"/>
+                <w:b w:val="0"/>
+                <w:sz w:val="28"/>
+              </w:rPr>
+              <w:t>โรงเรียนบ้านคำไผ่</w:t>
             </w:r>
           </w:p>
         </w:tc>
       </w:tr>
       <w:tr>
-        <w:trPr>
-          <w:jc w:val="center"/>
-        </w:trPr>
-        <w:tc>
-          <w:tcPr>
-            <w:tcW w:w="2232" w:type="dxa"/>
-            <w:tcMar>
-              <w:top w:w="90" w:type="dxa"/>
-              <w:left w:w="120" w:type="dxa"/>
-              <w:bottom w:w="90" w:type="dxa"/>
-              <w:right w:w="120" w:type="dxa"/>
-            </w:tcMar>
-            <w:vAlign w:val="center"/>
-          </w:tcPr>
-          <w:p>
-            <w:r>
-              <w:rPr>
-                <w:rFonts w:cs="TH Sarabun New"/>
-                <w:sz w:val="26"/>
-              </w:rPr>
-              <w:t>ที่ตั้ง</w:t>
-            </w:r>
-          </w:p>
-        </w:tc>
-        <w:tc>
-          <w:tcPr>
-            <w:tcW w:w="7416" w:type="dxa"/>
-            <w:tcMar>
-              <w:top w:w="90" w:type="dxa"/>
-              <w:left w:w="120" w:type="dxa"/>
-              <w:bottom w:w="90" w:type="dxa"/>
-              <w:right w:w="120" w:type="dxa"/>
-            </w:tcMar>
-            <w:vAlign w:val="center"/>
-          </w:tcPr>
-          <w:p>
-            <w:r>
-              <w:rPr>
-                <w:rFonts w:cs="TH Sarabun New"/>
-                <w:sz w:val="26"/>
-              </w:rPr>
-              <w:t>บ้านคำไผ่ หมู่ที่ 6 ตำบลหนองแวง อำเภอสมเด็จ จังหวัดกาฬสินธุ์ 46150</w:t>
+        <w:tc>
+          <w:tcPr>
+            <w:tcW w:type="dxa" w:w="2232"/>
+            <w:tcMar>
+              <w:top w:w="90" w:type="dxa"/>
+              <w:bottom w:w="90" w:type="dxa"/>
+              <w:start w:w="120" w:type="dxa"/>
+              <w:end w:w="120" w:type="dxa"/>
+            </w:tcMar>
+            <w:vAlign w:val="center"/>
+            <w:shd w:fill="F2F4F7"/>
+          </w:tcPr>
+          <w:p>
+            <w:r/>
+            <w:r>
+              <w:rPr>
+                <w:rFonts w:ascii="TH Sarabun New" w:hAnsi="TH Sarabun New" w:eastAsia="TH Sarabun New" w:cs="TH Sarabun New"/>
+                <w:b/>
+                <w:color w:val="17365D"/>
+                <w:sz w:val="28"/>
+              </w:rPr>
+              <w:t>กลุ่มเครือข่าย</w:t>
+            </w:r>
+          </w:p>
+        </w:tc>
+        <w:tc>
+          <w:tcPr>
+            <w:tcW w:type="dxa" w:w="7416"/>
+            <w:tcMar>
+              <w:top w:w="90" w:type="dxa"/>
+              <w:bottom w:w="90" w:type="dxa"/>
+              <w:start w:w="120" w:type="dxa"/>
+              <w:end w:w="120" w:type="dxa"/>
+            </w:tcMar>
+            <w:vAlign w:val="center"/>
+          </w:tcPr>
+          <w:p>
+            <w:r/>
+            <w:r>
+              <w:rPr>
+                <w:rFonts w:ascii="TH Sarabun New" w:hAnsi="TH Sarabun New" w:eastAsia="TH Sarabun New" w:cs="TH Sarabun New"/>
+                <w:b w:val="0"/>
+                <w:sz w:val="28"/>
+              </w:rPr>
+              <w:t>กลุ่มเครือข่ายโรงเรียนกุมภวาปี 1</w:t>
             </w:r>
           </w:p>
         </w:tc>
       </w:tr>
       <w:tr>
-        <w:trPr>
-          <w:jc w:val="center"/>
-        </w:trPr>
-        <w:tc>
-          <w:tcPr>
-            <w:tcW w:w="2232" w:type="dxa"/>
-            <w:tcMar>
-              <w:top w:w="90" w:type="dxa"/>
-              <w:left w:w="120" w:type="dxa"/>
-              <w:bottom w:w="90" w:type="dxa"/>
-              <w:right w:w="120" w:type="dxa"/>
-            </w:tcMar>
-            <w:vAlign w:val="center"/>
-          </w:tcPr>
-          <w:p>
-            <w:r>
-              <w:rPr>
-                <w:rFonts w:cs="TH Sarabun New"/>
-                <w:sz w:val="26"/>
-              </w:rPr>
-              <w:t>โทรศัพท์</w:t>
-            </w:r>
-          </w:p>
-        </w:tc>
-        <w:tc>
-          <w:tcPr>
-            <w:tcW w:w="7416" w:type="dxa"/>
-            <w:tcMar>
-              <w:top w:w="90" w:type="dxa"/>
-              <w:left w:w="120" w:type="dxa"/>
-              <w:bottom w:w="90" w:type="dxa"/>
-              <w:right w:w="120" w:type="dxa"/>
-            </w:tcMar>
-            <w:vAlign w:val="center"/>
-          </w:tcPr>
-          <w:p>
-            <w:r>
-              <w:rPr>
-                <w:rFonts w:cs="TH Sarabun New"/>
-                <w:sz w:val="26"/>
-              </w:rPr>
-              <w:t>043-890-187</w:t>
+        <w:tc>
+          <w:tcPr>
+            <w:tcW w:type="dxa" w:w="2232"/>
+            <w:tcMar>
+              <w:top w:w="90" w:type="dxa"/>
+              <w:bottom w:w="90" w:type="dxa"/>
+              <w:start w:w="120" w:type="dxa"/>
+              <w:end w:w="120" w:type="dxa"/>
+            </w:tcMar>
+            <w:vAlign w:val="center"/>
+            <w:shd w:fill="F2F4F7"/>
+          </w:tcPr>
+          <w:p>
+            <w:r/>
+            <w:r>
+              <w:rPr>
+                <w:rFonts w:ascii="TH Sarabun New" w:hAnsi="TH Sarabun New" w:eastAsia="TH Sarabun New" w:cs="TH Sarabun New"/>
+                <w:b/>
+                <w:color w:val="17365D"/>
+                <w:sz w:val="28"/>
+              </w:rPr>
+              <w:t>ที่ตั้ง</w:t>
+            </w:r>
+          </w:p>
+        </w:tc>
+        <w:tc>
+          <w:tcPr>
+            <w:tcW w:type="dxa" w:w="7416"/>
+            <w:tcMar>
+              <w:top w:w="90" w:type="dxa"/>
+              <w:bottom w:w="90" w:type="dxa"/>
+              <w:start w:w="120" w:type="dxa"/>
+              <w:end w:w="120" w:type="dxa"/>
+            </w:tcMar>
+            <w:vAlign w:val="center"/>
+          </w:tcPr>
+          <w:p>
+            <w:r/>
+            <w:r>
+              <w:rPr>
+                <w:rFonts w:ascii="TH Sarabun New" w:hAnsi="TH Sarabun New" w:eastAsia="TH Sarabun New" w:cs="TH Sarabun New"/>
+                <w:b w:val="0"/>
+                <w:sz w:val="28"/>
+              </w:rPr>
+              <w:t>เลขที่ 159 หมู่ 9 ตำบลเวียงคำ อำเภอกุมภวาปี จังหวัดอุดรธานี 41110</w:t>
             </w:r>
           </w:p>
         </w:tc>
       </w:tr>
       <w:tr>
-        <w:trPr>
-          <w:jc w:val="center"/>
-        </w:trPr>
-        <w:tc>
-          <w:tcPr>
-            <w:tcW w:w="2232" w:type="dxa"/>
-            <w:tcMar>
-              <w:top w:w="90" w:type="dxa"/>
-              <w:left w:w="120" w:type="dxa"/>
-              <w:bottom w:w="90" w:type="dxa"/>
-              <w:right w:w="120" w:type="dxa"/>
-            </w:tcMar>
-            <w:vAlign w:val="center"/>
-          </w:tcPr>
-          <w:p>
-            <w:r>
-              <w:rPr>
-                <w:rFonts w:cs="TH Sarabun New"/>
-                <w:sz w:val="26"/>
+        <w:tc>
+          <w:tcPr>
+            <w:tcW w:type="dxa" w:w="2232"/>
+            <w:tcMar>
+              <w:top w:w="90" w:type="dxa"/>
+              <w:bottom w:w="90" w:type="dxa"/>
+              <w:start w:w="120" w:type="dxa"/>
+              <w:end w:w="120" w:type="dxa"/>
+            </w:tcMar>
+            <w:vAlign w:val="center"/>
+            <w:shd w:fill="F2F4F7"/>
+          </w:tcPr>
+          <w:p>
+            <w:r/>
+            <w:r>
+              <w:rPr>
+                <w:rFonts w:ascii="TH Sarabun New" w:hAnsi="TH Sarabun New" w:eastAsia="TH Sarabun New" w:cs="TH Sarabun New"/>
+                <w:b/>
+                <w:color w:val="17365D"/>
+                <w:sz w:val="28"/>
               </w:rPr>
               <w:t>สังกัด</w:t>
             </w:r>
@@ -903,248 +918,249 @@
         </w:tc>
         <w:tc>
           <w:tcPr>
-            <w:tcW w:w="7416" w:type="dxa"/>
-            <w:tcMar>
-              <w:top w:w="90" w:type="dxa"/>
-              <w:left w:w="120" w:type="dxa"/>
-              <w:bottom w:w="90" w:type="dxa"/>
-              <w:right w:w="120" w:type="dxa"/>
-            </w:tcMar>
-            <w:vAlign w:val="center"/>
-          </w:tcPr>
-          <w:p>
-            <w:r>
-              <w:rPr>
-                <w:rFonts w:cs="TH Sarabun New"/>
-                <w:sz w:val="26"/>
-              </w:rPr>
-              <w:t>สำนักงานเขตพื้นที่การศึกษาประถมศึกษากาฬสินธุ์ เขต 3</w:t>
+            <w:tcW w:type="dxa" w:w="7416"/>
+            <w:tcMar>
+              <w:top w:w="90" w:type="dxa"/>
+              <w:bottom w:w="90" w:type="dxa"/>
+              <w:start w:w="120" w:type="dxa"/>
+              <w:end w:w="120" w:type="dxa"/>
+            </w:tcMar>
+            <w:vAlign w:val="center"/>
+          </w:tcPr>
+          <w:p>
+            <w:r/>
+            <w:r>
+              <w:rPr>
+                <w:rFonts w:ascii="TH Sarabun New" w:hAnsi="TH Sarabun New" w:eastAsia="TH Sarabun New" w:cs="TH Sarabun New"/>
+                <w:b w:val="0"/>
+                <w:sz w:val="28"/>
+              </w:rPr>
+              <w:t>สำนักงานเขตพื้นที่การศึกษาประถมศึกษาอุดรธานี เขต 2</w:t>
             </w:r>
           </w:p>
         </w:tc>
       </w:tr>
       <w:tr>
-        <w:trPr>
-          <w:jc w:val="center"/>
-        </w:trPr>
-        <w:tc>
-          <w:tcPr>
-            <w:tcW w:w="2232" w:type="dxa"/>
-            <w:tcMar>
-              <w:top w:w="90" w:type="dxa"/>
-              <w:left w:w="120" w:type="dxa"/>
-              <w:bottom w:w="90" w:type="dxa"/>
-              <w:right w:w="120" w:type="dxa"/>
-            </w:tcMar>
-            <w:vAlign w:val="center"/>
-          </w:tcPr>
-          <w:p>
-            <w:r>
-              <w:rPr>
-                <w:rFonts w:cs="TH Sarabun New"/>
-                <w:sz w:val="26"/>
-              </w:rPr>
-              <w:t>ระดับที่เปิดสอน</w:t>
-            </w:r>
-          </w:p>
-        </w:tc>
-        <w:tc>
-          <w:tcPr>
-            <w:tcW w:w="7416" w:type="dxa"/>
-            <w:tcMar>
-              <w:top w:w="90" w:type="dxa"/>
-              <w:left w:w="120" w:type="dxa"/>
-              <w:bottom w:w="90" w:type="dxa"/>
-              <w:right w:w="120" w:type="dxa"/>
-            </w:tcMar>
-            <w:vAlign w:val="center"/>
-          </w:tcPr>
-          <w:p>
-            <w:r>
-              <w:rPr>
-                <w:rFonts w:cs="TH Sarabun New"/>
-                <w:sz w:val="26"/>
-              </w:rPr>
-              <w:t>อนุบาล 1 ถึงประถมศึกษาปีที่ 6</w:t>
+        <w:tc>
+          <w:tcPr>
+            <w:tcW w:type="dxa" w:w="2232"/>
+            <w:tcMar>
+              <w:top w:w="90" w:type="dxa"/>
+              <w:bottom w:w="90" w:type="dxa"/>
+              <w:start w:w="120" w:type="dxa"/>
+              <w:end w:w="120" w:type="dxa"/>
+            </w:tcMar>
+            <w:vAlign w:val="center"/>
+            <w:shd w:fill="F2F4F7"/>
+          </w:tcPr>
+          <w:p>
+            <w:r/>
+            <w:r>
+              <w:rPr>
+                <w:rFonts w:ascii="TH Sarabun New" w:hAnsi="TH Sarabun New" w:eastAsia="TH Sarabun New" w:cs="TH Sarabun New"/>
+                <w:b/>
+                <w:color w:val="17365D"/>
+                <w:sz w:val="28"/>
+              </w:rPr>
+              <w:t>ผู้อำนวยการ</w:t>
+            </w:r>
+          </w:p>
+        </w:tc>
+        <w:tc>
+          <w:tcPr>
+            <w:tcW w:type="dxa" w:w="7416"/>
+            <w:tcMar>
+              <w:top w:w="90" w:type="dxa"/>
+              <w:bottom w:w="90" w:type="dxa"/>
+              <w:start w:w="120" w:type="dxa"/>
+              <w:end w:w="120" w:type="dxa"/>
+            </w:tcMar>
+            <w:vAlign w:val="center"/>
+          </w:tcPr>
+          <w:p>
+            <w:r/>
+            <w:r>
+              <w:rPr>
+                <w:rFonts w:ascii="TH Sarabun New" w:hAnsi="TH Sarabun New" w:eastAsia="TH Sarabun New" w:cs="TH Sarabun New"/>
+                <w:b w:val="0"/>
+                <w:sz w:val="28"/>
+              </w:rPr>
+              <w:t>นายสมพิศ แรงน้อย</w:t>
             </w:r>
           </w:p>
         </w:tc>
       </w:tr>
       <w:tr>
-        <w:trPr>
-          <w:jc w:val="center"/>
-        </w:trPr>
-        <w:tc>
-          <w:tcPr>
-            <w:tcW w:w="2232" w:type="dxa"/>
-            <w:tcMar>
-              <w:top w:w="90" w:type="dxa"/>
-              <w:left w:w="120" w:type="dxa"/>
-              <w:bottom w:w="90" w:type="dxa"/>
-              <w:right w:w="120" w:type="dxa"/>
-            </w:tcMar>
-            <w:vAlign w:val="center"/>
-          </w:tcPr>
-          <w:p>
-            <w:r>
-              <w:rPr>
-                <w:rFonts w:cs="TH Sarabun New"/>
-                <w:sz w:val="26"/>
-              </w:rPr>
-              <w:t>ก่อตั้ง</w:t>
-            </w:r>
-          </w:p>
-        </w:tc>
-        <w:tc>
-          <w:tcPr>
-            <w:tcW w:w="7416" w:type="dxa"/>
-            <w:tcMar>
-              <w:top w:w="90" w:type="dxa"/>
-              <w:left w:w="120" w:type="dxa"/>
-              <w:bottom w:w="90" w:type="dxa"/>
-              <w:right w:w="120" w:type="dxa"/>
-            </w:tcMar>
-            <w:vAlign w:val="center"/>
-          </w:tcPr>
-          <w:p>
-            <w:r>
-              <w:rPr>
-                <w:rFonts w:cs="TH Sarabun New"/>
-                <w:sz w:val="26"/>
-              </w:rPr>
-              <w:t xml:space="preserve">1 </w:t>
-            </w:r>
-            <w:r>
-              <w:rPr>
-                <w:rFonts w:cs="TH Sarabun New"/>
-                <w:sz w:val="26"/>
-              </w:rPr>
-              <w:t>พฤษภาคม 2500</w:t>
+        <w:tc>
+          <w:tcPr>
+            <w:tcW w:type="dxa" w:w="2232"/>
+            <w:tcMar>
+              <w:top w:w="90" w:type="dxa"/>
+              <w:bottom w:w="90" w:type="dxa"/>
+              <w:start w:w="120" w:type="dxa"/>
+              <w:end w:w="120" w:type="dxa"/>
+            </w:tcMar>
+            <w:vAlign w:val="center"/>
+            <w:shd w:fill="F2F4F7"/>
+          </w:tcPr>
+          <w:p>
+            <w:r/>
+            <w:r>
+              <w:rPr>
+                <w:rFonts w:ascii="TH Sarabun New" w:hAnsi="TH Sarabun New" w:eastAsia="TH Sarabun New" w:cs="TH Sarabun New"/>
+                <w:b/>
+                <w:color w:val="17365D"/>
+                <w:sz w:val="28"/>
+              </w:rPr>
+              <w:t>โทรศัพท์</w:t>
+            </w:r>
+          </w:p>
+        </w:tc>
+        <w:tc>
+          <w:tcPr>
+            <w:tcW w:type="dxa" w:w="7416"/>
+            <w:tcMar>
+              <w:top w:w="90" w:type="dxa"/>
+              <w:bottom w:w="90" w:type="dxa"/>
+              <w:start w:w="120" w:type="dxa"/>
+              <w:end w:w="120" w:type="dxa"/>
+            </w:tcMar>
+            <w:vAlign w:val="center"/>
+          </w:tcPr>
+          <w:p>
+            <w:r/>
+            <w:r>
+              <w:rPr>
+                <w:rFonts w:ascii="TH Sarabun New" w:hAnsi="TH Sarabun New" w:eastAsia="TH Sarabun New" w:cs="TH Sarabun New"/>
+                <w:b w:val="0"/>
+                <w:sz w:val="28"/>
+              </w:rPr>
+              <w:t>(โปรดระบุ)</w:t>
             </w:r>
           </w:p>
         </w:tc>
       </w:tr>
       <w:tr>
-        <w:trPr>
-          <w:jc w:val="center"/>
-        </w:trPr>
-        <w:tc>
-          <w:tcPr>
-            <w:tcW w:w="2232" w:type="dxa"/>
-            <w:tcMar>
-              <w:top w:w="90" w:type="dxa"/>
-              <w:left w:w="120" w:type="dxa"/>
-              <w:bottom w:w="90" w:type="dxa"/>
-              <w:right w:w="120" w:type="dxa"/>
-            </w:tcMar>
-            <w:vAlign w:val="center"/>
-          </w:tcPr>
-          <w:p>
-            <w:r>
-              <w:rPr>
-                <w:rFonts w:cs="TH Sarabun New"/>
-                <w:sz w:val="26"/>
-              </w:rPr>
-              <w:t>พื้นที่</w:t>
-            </w:r>
-          </w:p>
-        </w:tc>
-        <w:tc>
-          <w:tcPr>
-            <w:tcW w:w="7416" w:type="dxa"/>
-            <w:tcMar>
-              <w:top w:w="90" w:type="dxa"/>
-              <w:left w:w="120" w:type="dxa"/>
-              <w:bottom w:w="90" w:type="dxa"/>
-              <w:right w:w="120" w:type="dxa"/>
-            </w:tcMar>
-            <w:vAlign w:val="center"/>
-          </w:tcPr>
-          <w:p>
-            <w:r>
-              <w:rPr>
-                <w:rFonts w:cs="TH Sarabun New"/>
-                <w:sz w:val="26"/>
-              </w:rPr>
-              <w:t xml:space="preserve">18 </w:t>
-            </w:r>
-            <w:r>
-              <w:rPr>
-                <w:rFonts w:cs="TH Sarabun New"/>
-                <w:sz w:val="26"/>
-              </w:rPr>
-              <w:t>ไร่ 2 งาน 60 ตารางวา</w:t>
+        <w:tc>
+          <w:tcPr>
+            <w:tcW w:type="dxa" w:w="2232"/>
+            <w:tcMar>
+              <w:top w:w="90" w:type="dxa"/>
+              <w:bottom w:w="90" w:type="dxa"/>
+              <w:start w:w="120" w:type="dxa"/>
+              <w:end w:w="120" w:type="dxa"/>
+            </w:tcMar>
+            <w:vAlign w:val="center"/>
+            <w:shd w:fill="F2F4F7"/>
+          </w:tcPr>
+          <w:p>
+            <w:r/>
+            <w:r>
+              <w:rPr>
+                <w:rFonts w:ascii="TH Sarabun New" w:hAnsi="TH Sarabun New" w:eastAsia="TH Sarabun New" w:cs="TH Sarabun New"/>
+                <w:b/>
+                <w:color w:val="17365D"/>
+                <w:sz w:val="28"/>
+              </w:rPr>
+              <w:t>อีเมล</w:t>
+            </w:r>
+          </w:p>
+        </w:tc>
+        <w:tc>
+          <w:tcPr>
+            <w:tcW w:type="dxa" w:w="7416"/>
+            <w:tcMar>
+              <w:top w:w="90" w:type="dxa"/>
+              <w:bottom w:w="90" w:type="dxa"/>
+              <w:start w:w="120" w:type="dxa"/>
+              <w:end w:w="120" w:type="dxa"/>
+            </w:tcMar>
+            <w:vAlign w:val="center"/>
+          </w:tcPr>
+          <w:p>
+            <w:r/>
+            <w:r>
+              <w:rPr>
+                <w:rFonts w:ascii="TH Sarabun New" w:hAnsi="TH Sarabun New" w:eastAsia="TH Sarabun New" w:cs="TH Sarabun New"/>
+                <w:b w:val="0"/>
+                <w:sz w:val="28"/>
+              </w:rPr>
+              <w:t>(โปรดระบุ)</w:t>
             </w:r>
           </w:p>
         </w:tc>
       </w:tr>
       <w:tr>
-        <w:trPr>
-          <w:jc w:val="center"/>
-        </w:trPr>
-        <w:tc>
-          <w:tcPr>
-            <w:tcW w:w="2232" w:type="dxa"/>
-            <w:tcMar>
-              <w:top w:w="90" w:type="dxa"/>
-              <w:left w:w="120" w:type="dxa"/>
-              <w:bottom w:w="90" w:type="dxa"/>
-              <w:right w:w="120" w:type="dxa"/>
-            </w:tcMar>
-            <w:vAlign w:val="center"/>
-          </w:tcPr>
-          <w:p>
-            <w:r>
-              <w:rPr>
-                <w:rFonts w:cs="TH Sarabun New"/>
-                <w:sz w:val="26"/>
-              </w:rPr>
-              <w:t>เขตบริการ</w:t>
-            </w:r>
-          </w:p>
-        </w:tc>
-        <w:tc>
-          <w:tcPr>
-            <w:tcW w:w="7416" w:type="dxa"/>
-            <w:tcMar>
-              <w:top w:w="90" w:type="dxa"/>
-              <w:left w:w="120" w:type="dxa"/>
-              <w:bottom w:w="90" w:type="dxa"/>
-              <w:right w:w="120" w:type="dxa"/>
-            </w:tcMar>
-            <w:vAlign w:val="center"/>
-          </w:tcPr>
-          <w:p>
-            <w:r>
-              <w:rPr>
-                <w:rFonts w:cs="TH Sarabun New"/>
-                <w:sz w:val="26"/>
-              </w:rPr>
-              <w:t>บ้านคำไผ่ หมู่ 6 และบ้านประชาสามัคคี หมู่ 14</w:t>
+        <w:tc>
+          <w:tcPr>
+            <w:tcW w:type="dxa" w:w="2232"/>
+            <w:tcMar>
+              <w:top w:w="90" w:type="dxa"/>
+              <w:bottom w:w="90" w:type="dxa"/>
+              <w:start w:w="120" w:type="dxa"/>
+              <w:end w:w="120" w:type="dxa"/>
+            </w:tcMar>
+            <w:vAlign w:val="center"/>
+            <w:shd w:fill="F2F4F7"/>
+          </w:tcPr>
+          <w:p>
+            <w:r/>
+            <w:r>
+              <w:rPr>
+                <w:rFonts w:ascii="TH Sarabun New" w:hAnsi="TH Sarabun New" w:eastAsia="TH Sarabun New" w:cs="TH Sarabun New"/>
+                <w:b/>
+                <w:color w:val="17365D"/>
+                <w:sz w:val="28"/>
+              </w:rPr>
+              <w:t>ระดับที่เปิดสอน</w:t>
+            </w:r>
+          </w:p>
+        </w:tc>
+        <w:tc>
+          <w:tcPr>
+            <w:tcW w:type="dxa" w:w="7416"/>
+            <w:tcMar>
+              <w:top w:w="90" w:type="dxa"/>
+              <w:bottom w:w="90" w:type="dxa"/>
+              <w:start w:w="120" w:type="dxa"/>
+              <w:end w:w="120" w:type="dxa"/>
+            </w:tcMar>
+            <w:vAlign w:val="center"/>
+          </w:tcPr>
+          <w:p>
+            <w:r/>
+            <w:r>
+              <w:rPr>
+                <w:rFonts w:ascii="TH Sarabun New" w:hAnsi="TH Sarabun New" w:eastAsia="TH Sarabun New" w:cs="TH Sarabun New"/>
+                <w:b w:val="0"/>
+                <w:sz w:val="28"/>
+              </w:rPr>
+              <w:t>(โปรดระบุ)</w:t>
             </w:r>
           </w:p>
         </w:tc>
       </w:tr>
       <w:tr>
-        <w:trPr>
-          <w:jc w:val="center"/>
-        </w:trPr>
-        <w:tc>
-          <w:tcPr>
-            <w:tcW w:w="2232" w:type="dxa"/>
-            <w:tcMar>
-              <w:top w:w="90" w:type="dxa"/>
-              <w:left w:w="120" w:type="dxa"/>
-              <w:bottom w:w="90" w:type="dxa"/>
-              <w:right w:w="120" w:type="dxa"/>
-            </w:tcMar>
-            <w:vAlign w:val="center"/>
-          </w:tcPr>
-          <w:p>
-            <w:r>
-              <w:rPr>
-                <w:rFonts w:cs="TH Sarabun New"/>
-                <w:sz w:val="26"/>
+        <w:tc>
+          <w:tcPr>
+            <w:tcW w:type="dxa" w:w="2232"/>
+            <w:tcMar>
+              <w:top w:w="90" w:type="dxa"/>
+              <w:bottom w:w="90" w:type="dxa"/>
+              <w:start w:w="120" w:type="dxa"/>
+              <w:end w:w="120" w:type="dxa"/>
+            </w:tcMar>
+            <w:vAlign w:val="center"/>
+            <w:shd w:fill="F2F4F7"/>
+          </w:tcPr>
+          <w:p>
+            <w:r/>
+            <w:r>
+              <w:rPr>
+                <w:rFonts w:ascii="TH Sarabun New" w:hAnsi="TH Sarabun New" w:eastAsia="TH Sarabun New" w:cs="TH Sarabun New"/>
+                <w:b/>
+                <w:color w:val="17365D"/>
+                <w:sz w:val="28"/>
               </w:rPr>
               <w:t>แหล่งข้อมูล</w:t>
             </w:r>
@@ -1152,22 +1168,24 @@
         </w:tc>
         <w:tc>
           <w:tcPr>
-            <w:tcW w:w="7416" w:type="dxa"/>
-            <w:tcMar>
-              <w:top w:w="90" w:type="dxa"/>
-              <w:left w:w="120" w:type="dxa"/>
-              <w:bottom w:w="90" w:type="dxa"/>
-              <w:right w:w="120" w:type="dxa"/>
-            </w:tcMar>
-            <w:vAlign w:val="center"/>
-          </w:tcPr>
-          <w:p>
-            <w:r>
-              <w:rPr>
-                <w:rFonts w:cs="TH Sarabun New"/>
-                <w:sz w:val="26"/>
-              </w:rPr>
-              <w:t>หน้าเว็บโรงเรียนบ้านคำไผ่ https://kumpai54.blogspot.com/ (สืบค้น 11 กรกฎาคม 2569)</w:t>
+            <w:tcW w:type="dxa" w:w="7416"/>
+            <w:tcMar>
+              <w:top w:w="90" w:type="dxa"/>
+              <w:bottom w:w="90" w:type="dxa"/>
+              <w:start w:w="120" w:type="dxa"/>
+              <w:end w:w="120" w:type="dxa"/>
+            </w:tcMar>
+            <w:vAlign w:val="center"/>
+          </w:tcPr>
+          <w:p>
+            <w:r/>
+            <w:r>
+              <w:rPr>
+                <w:rFonts w:ascii="TH Sarabun New" w:hAnsi="TH Sarabun New" w:eastAsia="TH Sarabun New" w:cs="TH Sarabun New"/>
+                <w:b w:val="0"/>
+                <w:sz w:val="28"/>
+              </w:rPr>
+              <w:t>ข้อมูลสถานศึกษาที่ผู้จัดทำยืนยัน เมื่อวันที่ 11 กรกฎาคม 2569</w:t>
             </w:r>
           </w:p>
         </w:tc>
@@ -10257,15 +10275,11 @@
       </w:pPr>
       <w:r>
         <w:rPr>
-          <w:rFonts w:cs="TH Sarabun New"/>
-        </w:rPr>
-        <w:t>(</w:t>
-      </w:r>
-      <w:r>
-        <w:rPr>
-          <w:rFonts w:cs="TH Sarabun New"/>
-        </w:rPr>
-        <w:t>นายมกรธวัช แสนสง่า)</w:t>
+          <w:rFonts w:ascii="TH Sarabun New" w:hAnsi="TH Sarabun New" w:eastAsia="TH Sarabun New" w:cs="TH Sarabun New"/>
+          <w:b/>
+          <w:sz w:val="32"/>
+        </w:rPr>
+        <w:t>(นายสมพิศ แรงน้อย)</w:t>
       </w:r>
     </w:p>
     <w:p>
@@ -10275,9 +10289,11 @@
       </w:pPr>
       <w:r>
         <w:rPr>
-          <w:rFonts w:cs="TH Sarabun New"/>
-        </w:rPr>
-        <w:t>ผู้อำนวยการสถานศึกษา  วิทยฐานะชำนาญการพิเศษ</w:t>
+          <w:rFonts w:ascii="TH Sarabun New" w:hAnsi="TH Sarabun New" w:eastAsia="TH Sarabun New" w:cs="TH Sarabun New"/>
+          <w:b w:val="0"/>
+          <w:sz w:val="32"/>
+        </w:rPr>
+        <w:t>ผู้อำนวยการโรงเรียนบ้านคำไผ่  (วิทยฐานะ: โปรดระบุ)</w:t>
       </w:r>
     </w:p>
     <w:p>

</xml_diff>

<commit_message>
docs(research): add dummy dataset to plan A booklet
Co-authored-by: Codex <codex@openai.com>
</commit_message>
<xml_diff>
--- a/public/docs/classroom-research/p4-multiply-race-research-plan-a.docx
+++ b/public/docs/classroom-research/p4-multiply-race-research-plan-a.docx
@@ -1699,6 +1699,1949 @@
         </w:tc>
       </w:tr>
     </w:tbl>
+    <w:p>
+      <w:pPr>
+        <w:pStyle w:val="1"/>
+        <w:spacing w:before="240" w:after="120"/>
+      </w:pPr>
+      <w:r>
+        <w:rPr>
+          <w:rFonts w:ascii="TH Sarabun New" w:eastAsia="TH Sarabun New" w:hAnsi="TH Sarabun New" w:cs="TH Sarabun New"/>
+          <w:sz w:val="32"/>
+          <w:color w:val="17365D"/>
+          <w:b/>
+        </w:rPr>
+        <w:t>ข้อมูลดัมมี่ประกอบเล่ม (สำหรับจำลองผลวิจัย)</w:t>
+      </w:r>
+    </w:p>
+    <w:p>
+      <w:pPr>
+        <w:spacing w:after="100"/>
+        <w:ind w:firstLine="504"/>
+        <w:jc w:val="both"/>
+      </w:pPr>
+      <w:r>
+        <w:rPr>
+          <w:rFonts w:ascii="TH Sarabun New" w:eastAsia="TH Sarabun New" w:hAnsi="TH Sarabun New" w:cs="TH Sarabun New"/>
+          <w:sz w:val="26"/>
+          <w:color w:val="7A4B00"/>
+        </w:rPr>
+        <w:t>หมายเหตุ: ตารางนี้เป็นข้อมูลดัมมี่ที่สร้างให้สอดคล้องกับแผนวิจัย One-Group Pretest–Posttest Design เพื่อใช้จัดรูปเล่ม ทดลองอ่านผล และเตรียมเอกสารก่อนแทนที่ด้วยข้อมูลจริงจากหน้า /teacher/game-research ก่อนส่งราชการ</w:t>
+      </w:r>
+    </w:p>
+    <w:p>
+      <w:pPr>
+        <w:spacing w:after="100"/>
+        <w:ind w:firstLine="504"/>
+        <w:jc w:val="both"/>
+      </w:pPr>
+      <w:r>
+        <w:rPr>
+          <w:rFonts w:ascii="TH Sarabun New" w:eastAsia="TH Sarabun New" w:hAnsi="TH Sarabun New" w:cs="TH Sarabun New"/>
+          <w:sz w:val="28"/>
+          <w:color w:val="1F2937"/>
+        </w:rPr>
+        <w:t>ชุดข้อมูลจำลองกำหนดให้นักเรียนชั้นประถมศึกษาปีที่ 4 จำนวน 8 คน เล่นเกมแข่งสูตรคูณช่วงก่อนเรียน 7 วัน และหลังเรียน 7 วัน วันละ 1 รอบ คะแนนในตารางเป็นคะแนนเฉลี่ยรายช่วงของผู้เรียนแต่ละคน</w:t>
+      </w:r>
+    </w:p>
+    <w:tbl>
+      <w:tblPr>
+        <w:tblW w:w="8240" w:type="dxa"/>
+        <w:jc w:val="center"/>
+        <w:tblLayout w:type="fixed"/>
+        <w:tblBorders>
+          <w:top w:val="single" w:sz="6" w:color="CBD5E1"/>
+          <w:left w:val="single" w:sz="6" w:color="CBD5E1"/>
+          <w:bottom w:val="single" w:sz="6" w:color="CBD5E1"/>
+          <w:right w:val="single" w:sz="6" w:color="CBD5E1"/>
+          <w:insideH w:val="single" w:sz="6" w:color="CBD5E1"/>
+          <w:insideV w:val="single" w:sz="6" w:color="CBD5E1"/>
+        </w:tblBorders>
+      </w:tblPr>
+      <w:tblGrid>
+        <w:gridCol w:w="640"/>
+        <w:gridCol w:w="1000"/>
+        <w:gridCol w:w="2300"/>
+        <w:gridCol w:w="1200"/>
+        <w:gridCol w:w="1200"/>
+        <w:gridCol w:w="1000"/>
+        <w:gridCol w:w="900"/>
+      </w:tblGrid>
+      <w:tr>
+        <w:tc>
+          <w:tcPr>
+            <w:tcW w:w="640" w:type="dxa"/>
+            <w:shd w:val="clear" w:color="auto" w:fill="17365D"/>
+            <w:tcMar>
+              <w:top w:w="80" w:type="dxa"/>
+              <w:left w:w="100" w:type="dxa"/>
+              <w:bottom w:w="80" w:type="dxa"/>
+              <w:right w:w="100" w:type="dxa"/>
+            </w:tcMar>
+            <w:vAlign w:val="center"/>
+          </w:tcPr>
+          <w:p>
+            <w:pPr>
+              <w:jc w:val="center"/>
+              <w:spacing w:after="0"/>
+            </w:pPr>
+            <w:r>
+              <w:rPr>
+                <w:rFonts w:ascii="TH Sarabun New" w:eastAsia="TH Sarabun New" w:hAnsi="TH Sarabun New" w:cs="TH Sarabun New"/>
+                <w:sz w:val="22"/>
+                <w:color w:val="FFFFFF"/>
+                <w:b/>
+              </w:rPr>
+              <w:t>เลขที่</w:t>
+            </w:r>
+          </w:p>
+        </w:tc>
+        <w:tc>
+          <w:tcPr>
+            <w:tcW w:w="1000" w:type="dxa"/>
+            <w:shd w:val="clear" w:color="auto" w:fill="17365D"/>
+            <w:tcMar>
+              <w:top w:w="80" w:type="dxa"/>
+              <w:left w:w="100" w:type="dxa"/>
+              <w:bottom w:w="80" w:type="dxa"/>
+              <w:right w:w="100" w:type="dxa"/>
+            </w:tcMar>
+            <w:vAlign w:val="center"/>
+          </w:tcPr>
+          <w:p>
+            <w:pPr>
+              <w:jc w:val="center"/>
+              <w:spacing w:after="0"/>
+            </w:pPr>
+            <w:r>
+              <w:rPr>
+                <w:rFonts w:ascii="TH Sarabun New" w:eastAsia="TH Sarabun New" w:hAnsi="TH Sarabun New" w:cs="TH Sarabun New"/>
+                <w:sz w:val="22"/>
+                <w:color w:val="FFFFFF"/>
+                <w:b/>
+              </w:rPr>
+              <w:t>รหัส</w:t>
+            </w:r>
+          </w:p>
+        </w:tc>
+        <w:tc>
+          <w:tcPr>
+            <w:tcW w:w="2300" w:type="dxa"/>
+            <w:shd w:val="clear" w:color="auto" w:fill="17365D"/>
+            <w:tcMar>
+              <w:top w:w="80" w:type="dxa"/>
+              <w:left w:w="100" w:type="dxa"/>
+              <w:bottom w:w="80" w:type="dxa"/>
+              <w:right w:w="100" w:type="dxa"/>
+            </w:tcMar>
+            <w:vAlign w:val="center"/>
+          </w:tcPr>
+          <w:p>
+            <w:pPr>
+              <w:spacing w:after="0"/>
+            </w:pPr>
+            <w:r>
+              <w:rPr>
+                <w:rFonts w:ascii="TH Sarabun New" w:eastAsia="TH Sarabun New" w:hAnsi="TH Sarabun New" w:cs="TH Sarabun New"/>
+                <w:sz w:val="22"/>
+                <w:color w:val="FFFFFF"/>
+                <w:b/>
+              </w:rPr>
+              <w:t>ชื่อ</w:t>
+            </w:r>
+          </w:p>
+        </w:tc>
+        <w:tc>
+          <w:tcPr>
+            <w:tcW w:w="1200" w:type="dxa"/>
+            <w:shd w:val="clear" w:color="auto" w:fill="17365D"/>
+            <w:tcMar>
+              <w:top w:w="80" w:type="dxa"/>
+              <w:left w:w="100" w:type="dxa"/>
+              <w:bottom w:w="80" w:type="dxa"/>
+              <w:right w:w="100" w:type="dxa"/>
+            </w:tcMar>
+            <w:vAlign w:val="center"/>
+          </w:tcPr>
+          <w:p>
+            <w:pPr>
+              <w:jc w:val="right"/>
+              <w:spacing w:after="0"/>
+            </w:pPr>
+            <w:r>
+              <w:rPr>
+                <w:rFonts w:ascii="TH Sarabun New" w:eastAsia="TH Sarabun New" w:hAnsi="TH Sarabun New" w:cs="TH Sarabun New"/>
+                <w:sz w:val="22"/>
+                <w:color w:val="FFFFFF"/>
+                <w:b/>
+              </w:rPr>
+              <w:t>ก่อนเรียน</w:t>
+            </w:r>
+          </w:p>
+        </w:tc>
+        <w:tc>
+          <w:tcPr>
+            <w:tcW w:w="1200" w:type="dxa"/>
+            <w:shd w:val="clear" w:color="auto" w:fill="17365D"/>
+            <w:tcMar>
+              <w:top w:w="80" w:type="dxa"/>
+              <w:left w:w="100" w:type="dxa"/>
+              <w:bottom w:w="80" w:type="dxa"/>
+              <w:right w:w="100" w:type="dxa"/>
+            </w:tcMar>
+            <w:vAlign w:val="center"/>
+          </w:tcPr>
+          <w:p>
+            <w:pPr>
+              <w:jc w:val="right"/>
+              <w:spacing w:after="0"/>
+            </w:pPr>
+            <w:r>
+              <w:rPr>
+                <w:rFonts w:ascii="TH Sarabun New" w:eastAsia="TH Sarabun New" w:hAnsi="TH Sarabun New" w:cs="TH Sarabun New"/>
+                <w:sz w:val="22"/>
+                <w:color w:val="FFFFFF"/>
+                <w:b/>
+              </w:rPr>
+              <w:t>หลังเรียน</w:t>
+            </w:r>
+          </w:p>
+        </w:tc>
+        <w:tc>
+          <w:tcPr>
+            <w:tcW w:w="1000" w:type="dxa"/>
+            <w:shd w:val="clear" w:color="auto" w:fill="17365D"/>
+            <w:tcMar>
+              <w:top w:w="80" w:type="dxa"/>
+              <w:left w:w="100" w:type="dxa"/>
+              <w:bottom w:w="80" w:type="dxa"/>
+              <w:right w:w="100" w:type="dxa"/>
+            </w:tcMar>
+            <w:vAlign w:val="center"/>
+          </w:tcPr>
+          <w:p>
+            <w:pPr>
+              <w:jc w:val="right"/>
+              <w:spacing w:after="0"/>
+            </w:pPr>
+            <w:r>
+              <w:rPr>
+                <w:rFonts w:ascii="TH Sarabun New" w:eastAsia="TH Sarabun New" w:hAnsi="TH Sarabun New" w:cs="TH Sarabun New"/>
+                <w:sz w:val="22"/>
+                <w:color w:val="FFFFFF"/>
+                <w:b/>
+              </w:rPr>
+              <w:t>ผลต่าง</w:t>
+            </w:r>
+          </w:p>
+        </w:tc>
+        <w:tc>
+          <w:tcPr>
+            <w:tcW w:w="900" w:type="dxa"/>
+            <w:shd w:val="clear" w:color="auto" w:fill="17365D"/>
+            <w:tcMar>
+              <w:top w:w="80" w:type="dxa"/>
+              <w:left w:w="100" w:type="dxa"/>
+              <w:bottom w:w="80" w:type="dxa"/>
+              <w:right w:w="100" w:type="dxa"/>
+            </w:tcMar>
+            <w:vAlign w:val="center"/>
+          </w:tcPr>
+          <w:p>
+            <w:pPr>
+              <w:jc w:val="center"/>
+              <w:spacing w:after="0"/>
+            </w:pPr>
+            <w:r>
+              <w:rPr>
+                <w:rFonts w:ascii="TH Sarabun New" w:eastAsia="TH Sarabun New" w:hAnsi="TH Sarabun New" w:cs="TH Sarabun New"/>
+                <w:sz w:val="22"/>
+                <w:color w:val="FFFFFF"/>
+                <w:b/>
+              </w:rPr>
+              <w:t>รอบ</w:t>
+            </w:r>
+          </w:p>
+        </w:tc>
+      </w:tr>
+      <w:tr>
+        <w:tc>
+          <w:tcPr>
+            <w:tcW w:w="640" w:type="dxa"/>
+            <w:tcMar>
+              <w:top w:w="80" w:type="dxa"/>
+              <w:left w:w="100" w:type="dxa"/>
+              <w:bottom w:w="80" w:type="dxa"/>
+              <w:right w:w="100" w:type="dxa"/>
+            </w:tcMar>
+            <w:vAlign w:val="center"/>
+          </w:tcPr>
+          <w:p>
+            <w:pPr>
+              <w:jc w:val="center"/>
+              <w:spacing w:after="0"/>
+            </w:pPr>
+            <w:r>
+              <w:rPr>
+                <w:rFonts w:ascii="TH Sarabun New" w:eastAsia="TH Sarabun New" w:hAnsi="TH Sarabun New" w:cs="TH Sarabun New"/>
+                <w:sz w:val="22"/>
+                <w:color w:val="1F2937"/>
+              </w:rPr>
+              <w:t>1</w:t>
+            </w:r>
+          </w:p>
+        </w:tc>
+        <w:tc>
+          <w:tcPr>
+            <w:tcW w:w="1000" w:type="dxa"/>
+            <w:tcMar>
+              <w:top w:w="80" w:type="dxa"/>
+              <w:left w:w="100" w:type="dxa"/>
+              <w:bottom w:w="80" w:type="dxa"/>
+              <w:right w:w="100" w:type="dxa"/>
+            </w:tcMar>
+            <w:vAlign w:val="center"/>
+          </w:tcPr>
+          <w:p>
+            <w:pPr>
+              <w:jc w:val="center"/>
+              <w:spacing w:after="0"/>
+            </w:pPr>
+            <w:r>
+              <w:rPr>
+                <w:rFonts w:ascii="TH Sarabun New" w:eastAsia="TH Sarabun New" w:hAnsi="TH Sarabun New" w:cs="TH Sarabun New"/>
+                <w:sz w:val="22"/>
+                <w:color w:val="1F2937"/>
+              </w:rPr>
+              <w:t>1319</w:t>
+            </w:r>
+          </w:p>
+        </w:tc>
+        <w:tc>
+          <w:tcPr>
+            <w:tcW w:w="2300" w:type="dxa"/>
+            <w:tcMar>
+              <w:top w:w="80" w:type="dxa"/>
+              <w:left w:w="100" w:type="dxa"/>
+              <w:bottom w:w="80" w:type="dxa"/>
+              <w:right w:w="100" w:type="dxa"/>
+            </w:tcMar>
+            <w:vAlign w:val="center"/>
+          </w:tcPr>
+          <w:p>
+            <w:pPr>
+              <w:spacing w:after="0"/>
+            </w:pPr>
+            <w:r>
+              <w:rPr>
+                <w:rFonts w:ascii="TH Sarabun New" w:eastAsia="TH Sarabun New" w:hAnsi="TH Sarabun New" w:cs="TH Sarabun New"/>
+                <w:sz w:val="22"/>
+                <w:color w:val="1F2937"/>
+              </w:rPr>
+              <w:t>ด.ช.ชนาธิป แสงดี</w:t>
+            </w:r>
+          </w:p>
+        </w:tc>
+        <w:tc>
+          <w:tcPr>
+            <w:tcW w:w="1200" w:type="dxa"/>
+            <w:tcMar>
+              <w:top w:w="80" w:type="dxa"/>
+              <w:left w:w="100" w:type="dxa"/>
+              <w:bottom w:w="80" w:type="dxa"/>
+              <w:right w:w="100" w:type="dxa"/>
+            </w:tcMar>
+            <w:vAlign w:val="center"/>
+          </w:tcPr>
+          <w:p>
+            <w:pPr>
+              <w:jc w:val="right"/>
+              <w:spacing w:after="0"/>
+            </w:pPr>
+            <w:r>
+              <w:rPr>
+                <w:rFonts w:ascii="TH Sarabun New" w:eastAsia="TH Sarabun New" w:hAnsi="TH Sarabun New" w:cs="TH Sarabun New"/>
+                <w:sz w:val="22"/>
+                <w:color w:val="1F2937"/>
+              </w:rPr>
+              <w:t>291.0</w:t>
+            </w:r>
+          </w:p>
+        </w:tc>
+        <w:tc>
+          <w:tcPr>
+            <w:tcW w:w="1200" w:type="dxa"/>
+            <w:tcMar>
+              <w:top w:w="80" w:type="dxa"/>
+              <w:left w:w="100" w:type="dxa"/>
+              <w:bottom w:w="80" w:type="dxa"/>
+              <w:right w:w="100" w:type="dxa"/>
+            </w:tcMar>
+            <w:vAlign w:val="center"/>
+          </w:tcPr>
+          <w:p>
+            <w:pPr>
+              <w:jc w:val="right"/>
+              <w:spacing w:after="0"/>
+            </w:pPr>
+            <w:r>
+              <w:rPr>
+                <w:rFonts w:ascii="TH Sarabun New" w:eastAsia="TH Sarabun New" w:hAnsi="TH Sarabun New" w:cs="TH Sarabun New"/>
+                <w:sz w:val="22"/>
+                <w:color w:val="1F2937"/>
+              </w:rPr>
+              <w:t>407.0</w:t>
+            </w:r>
+          </w:p>
+        </w:tc>
+        <w:tc>
+          <w:tcPr>
+            <w:tcW w:w="1000" w:type="dxa"/>
+            <w:tcMar>
+              <w:top w:w="80" w:type="dxa"/>
+              <w:left w:w="100" w:type="dxa"/>
+              <w:bottom w:w="80" w:type="dxa"/>
+              <w:right w:w="100" w:type="dxa"/>
+            </w:tcMar>
+            <w:vAlign w:val="center"/>
+          </w:tcPr>
+          <w:p>
+            <w:pPr>
+              <w:jc w:val="right"/>
+              <w:spacing w:after="0"/>
+            </w:pPr>
+            <w:r>
+              <w:rPr>
+                <w:rFonts w:ascii="TH Sarabun New" w:eastAsia="TH Sarabun New" w:hAnsi="TH Sarabun New" w:cs="TH Sarabun New"/>
+                <w:sz w:val="22"/>
+                <w:color w:val="1F2937"/>
+              </w:rPr>
+              <w:t>+116.0</w:t>
+            </w:r>
+          </w:p>
+        </w:tc>
+        <w:tc>
+          <w:tcPr>
+            <w:tcW w:w="900" w:type="dxa"/>
+            <w:tcMar>
+              <w:top w:w="80" w:type="dxa"/>
+              <w:left w:w="100" w:type="dxa"/>
+              <w:bottom w:w="80" w:type="dxa"/>
+              <w:right w:w="100" w:type="dxa"/>
+            </w:tcMar>
+            <w:vAlign w:val="center"/>
+          </w:tcPr>
+          <w:p>
+            <w:pPr>
+              <w:jc w:val="center"/>
+              <w:spacing w:after="0"/>
+            </w:pPr>
+            <w:r>
+              <w:rPr>
+                <w:rFonts w:ascii="TH Sarabun New" w:eastAsia="TH Sarabun New" w:hAnsi="TH Sarabun New" w:cs="TH Sarabun New"/>
+                <w:sz w:val="22"/>
+                <w:color w:val="1F2937"/>
+              </w:rPr>
+              <w:t>7/7</w:t>
+            </w:r>
+          </w:p>
+        </w:tc>
+      </w:tr>
+      <w:tr>
+        <w:tc>
+          <w:tcPr>
+            <w:tcW w:w="640" w:type="dxa"/>
+            <w:tcMar>
+              <w:top w:w="80" w:type="dxa"/>
+              <w:left w:w="100" w:type="dxa"/>
+              <w:bottom w:w="80" w:type="dxa"/>
+              <w:right w:w="100" w:type="dxa"/>
+            </w:tcMar>
+            <w:vAlign w:val="center"/>
+          </w:tcPr>
+          <w:p>
+            <w:pPr>
+              <w:jc w:val="center"/>
+              <w:spacing w:after="0"/>
+            </w:pPr>
+            <w:r>
+              <w:rPr>
+                <w:rFonts w:ascii="TH Sarabun New" w:eastAsia="TH Sarabun New" w:hAnsi="TH Sarabun New" w:cs="TH Sarabun New"/>
+                <w:sz w:val="22"/>
+                <w:color w:val="1F2937"/>
+              </w:rPr>
+              <w:t>2</w:t>
+            </w:r>
+          </w:p>
+        </w:tc>
+        <w:tc>
+          <w:tcPr>
+            <w:tcW w:w="1000" w:type="dxa"/>
+            <w:tcMar>
+              <w:top w:w="80" w:type="dxa"/>
+              <w:left w:w="100" w:type="dxa"/>
+              <w:bottom w:w="80" w:type="dxa"/>
+              <w:right w:w="100" w:type="dxa"/>
+            </w:tcMar>
+            <w:vAlign w:val="center"/>
+          </w:tcPr>
+          <w:p>
+            <w:pPr>
+              <w:jc w:val="center"/>
+              <w:spacing w:after="0"/>
+            </w:pPr>
+            <w:r>
+              <w:rPr>
+                <w:rFonts w:ascii="TH Sarabun New" w:eastAsia="TH Sarabun New" w:hAnsi="TH Sarabun New" w:cs="TH Sarabun New"/>
+                <w:sz w:val="22"/>
+                <w:color w:val="1F2937"/>
+              </w:rPr>
+              <w:t>1320</w:t>
+            </w:r>
+          </w:p>
+        </w:tc>
+        <w:tc>
+          <w:tcPr>
+            <w:tcW w:w="2300" w:type="dxa"/>
+            <w:tcMar>
+              <w:top w:w="80" w:type="dxa"/>
+              <w:left w:w="100" w:type="dxa"/>
+              <w:bottom w:w="80" w:type="dxa"/>
+              <w:right w:w="100" w:type="dxa"/>
+            </w:tcMar>
+            <w:vAlign w:val="center"/>
+          </w:tcPr>
+          <w:p>
+            <w:pPr>
+              <w:spacing w:after="0"/>
+            </w:pPr>
+            <w:r>
+              <w:rPr>
+                <w:rFonts w:ascii="TH Sarabun New" w:eastAsia="TH Sarabun New" w:hAnsi="TH Sarabun New" w:cs="TH Sarabun New"/>
+                <w:sz w:val="22"/>
+                <w:color w:val="1F2937"/>
+              </w:rPr>
+              <w:t>ด.ช.พชรพร จรุงพันธ์</w:t>
+            </w:r>
+          </w:p>
+        </w:tc>
+        <w:tc>
+          <w:tcPr>
+            <w:tcW w:w="1200" w:type="dxa"/>
+            <w:tcMar>
+              <w:top w:w="80" w:type="dxa"/>
+              <w:left w:w="100" w:type="dxa"/>
+              <w:bottom w:w="80" w:type="dxa"/>
+              <w:right w:w="100" w:type="dxa"/>
+            </w:tcMar>
+            <w:vAlign w:val="center"/>
+          </w:tcPr>
+          <w:p>
+            <w:pPr>
+              <w:jc w:val="right"/>
+              <w:spacing w:after="0"/>
+            </w:pPr>
+            <w:r>
+              <w:rPr>
+                <w:rFonts w:ascii="TH Sarabun New" w:eastAsia="TH Sarabun New" w:hAnsi="TH Sarabun New" w:cs="TH Sarabun New"/>
+                <w:sz w:val="22"/>
+                <w:color w:val="1F2937"/>
+              </w:rPr>
+              <w:t>238.5</w:t>
+            </w:r>
+          </w:p>
+        </w:tc>
+        <w:tc>
+          <w:tcPr>
+            <w:tcW w:w="1200" w:type="dxa"/>
+            <w:tcMar>
+              <w:top w:w="80" w:type="dxa"/>
+              <w:left w:w="100" w:type="dxa"/>
+              <w:bottom w:w="80" w:type="dxa"/>
+              <w:right w:w="100" w:type="dxa"/>
+            </w:tcMar>
+            <w:vAlign w:val="center"/>
+          </w:tcPr>
+          <w:p>
+            <w:pPr>
+              <w:jc w:val="right"/>
+              <w:spacing w:after="0"/>
+            </w:pPr>
+            <w:r>
+              <w:rPr>
+                <w:rFonts w:ascii="TH Sarabun New" w:eastAsia="TH Sarabun New" w:hAnsi="TH Sarabun New" w:cs="TH Sarabun New"/>
+                <w:sz w:val="22"/>
+                <w:color w:val="1F2937"/>
+              </w:rPr>
+              <w:t>356.0</w:t>
+            </w:r>
+          </w:p>
+        </w:tc>
+        <w:tc>
+          <w:tcPr>
+            <w:tcW w:w="1000" w:type="dxa"/>
+            <w:tcMar>
+              <w:top w:w="80" w:type="dxa"/>
+              <w:left w:w="100" w:type="dxa"/>
+              <w:bottom w:w="80" w:type="dxa"/>
+              <w:right w:w="100" w:type="dxa"/>
+            </w:tcMar>
+            <w:vAlign w:val="center"/>
+          </w:tcPr>
+          <w:p>
+            <w:pPr>
+              <w:jc w:val="right"/>
+              <w:spacing w:after="0"/>
+            </w:pPr>
+            <w:r>
+              <w:rPr>
+                <w:rFonts w:ascii="TH Sarabun New" w:eastAsia="TH Sarabun New" w:hAnsi="TH Sarabun New" w:cs="TH Sarabun New"/>
+                <w:sz w:val="22"/>
+                <w:color w:val="1F2937"/>
+              </w:rPr>
+              <w:t>+117.5</w:t>
+            </w:r>
+          </w:p>
+        </w:tc>
+        <w:tc>
+          <w:tcPr>
+            <w:tcW w:w="900" w:type="dxa"/>
+            <w:tcMar>
+              <w:top w:w="80" w:type="dxa"/>
+              <w:left w:w="100" w:type="dxa"/>
+              <w:bottom w:w="80" w:type="dxa"/>
+              <w:right w:w="100" w:type="dxa"/>
+            </w:tcMar>
+            <w:vAlign w:val="center"/>
+          </w:tcPr>
+          <w:p>
+            <w:pPr>
+              <w:jc w:val="center"/>
+              <w:spacing w:after="0"/>
+            </w:pPr>
+            <w:r>
+              <w:rPr>
+                <w:rFonts w:ascii="TH Sarabun New" w:eastAsia="TH Sarabun New" w:hAnsi="TH Sarabun New" w:cs="TH Sarabun New"/>
+                <w:sz w:val="22"/>
+                <w:color w:val="1F2937"/>
+              </w:rPr>
+              <w:t>7/7</w:t>
+            </w:r>
+          </w:p>
+        </w:tc>
+      </w:tr>
+      <w:tr>
+        <w:tc>
+          <w:tcPr>
+            <w:tcW w:w="640" w:type="dxa"/>
+            <w:tcMar>
+              <w:top w:w="80" w:type="dxa"/>
+              <w:left w:w="100" w:type="dxa"/>
+              <w:bottom w:w="80" w:type="dxa"/>
+              <w:right w:w="100" w:type="dxa"/>
+            </w:tcMar>
+            <w:vAlign w:val="center"/>
+          </w:tcPr>
+          <w:p>
+            <w:pPr>
+              <w:jc w:val="center"/>
+              <w:spacing w:after="0"/>
+            </w:pPr>
+            <w:r>
+              <w:rPr>
+                <w:rFonts w:ascii="TH Sarabun New" w:eastAsia="TH Sarabun New" w:hAnsi="TH Sarabun New" w:cs="TH Sarabun New"/>
+                <w:sz w:val="22"/>
+                <w:color w:val="1F2937"/>
+              </w:rPr>
+              <w:t>3</w:t>
+            </w:r>
+          </w:p>
+        </w:tc>
+        <w:tc>
+          <w:tcPr>
+            <w:tcW w:w="1000" w:type="dxa"/>
+            <w:tcMar>
+              <w:top w:w="80" w:type="dxa"/>
+              <w:left w:w="100" w:type="dxa"/>
+              <w:bottom w:w="80" w:type="dxa"/>
+              <w:right w:w="100" w:type="dxa"/>
+            </w:tcMar>
+            <w:vAlign w:val="center"/>
+          </w:tcPr>
+          <w:p>
+            <w:pPr>
+              <w:jc w:val="center"/>
+              <w:spacing w:after="0"/>
+            </w:pPr>
+            <w:r>
+              <w:rPr>
+                <w:rFonts w:ascii="TH Sarabun New" w:eastAsia="TH Sarabun New" w:hAnsi="TH Sarabun New" w:cs="TH Sarabun New"/>
+                <w:sz w:val="22"/>
+                <w:color w:val="1F2937"/>
+              </w:rPr>
+              <w:t>1321</w:t>
+            </w:r>
+          </w:p>
+        </w:tc>
+        <w:tc>
+          <w:tcPr>
+            <w:tcW w:w="2300" w:type="dxa"/>
+            <w:tcMar>
+              <w:top w:w="80" w:type="dxa"/>
+              <w:left w:w="100" w:type="dxa"/>
+              <w:bottom w:w="80" w:type="dxa"/>
+              <w:right w:w="100" w:type="dxa"/>
+            </w:tcMar>
+            <w:vAlign w:val="center"/>
+          </w:tcPr>
+          <w:p>
+            <w:pPr>
+              <w:spacing w:after="0"/>
+            </w:pPr>
+            <w:r>
+              <w:rPr>
+                <w:rFonts w:ascii="TH Sarabun New" w:eastAsia="TH Sarabun New" w:hAnsi="TH Sarabun New" w:cs="TH Sarabun New"/>
+                <w:sz w:val="22"/>
+                <w:color w:val="1F2937"/>
+              </w:rPr>
+              <w:t>ด.ช.พีรวัส นิโม</w:t>
+            </w:r>
+          </w:p>
+        </w:tc>
+        <w:tc>
+          <w:tcPr>
+            <w:tcW w:w="1200" w:type="dxa"/>
+            <w:tcMar>
+              <w:top w:w="80" w:type="dxa"/>
+              <w:left w:w="100" w:type="dxa"/>
+              <w:bottom w:w="80" w:type="dxa"/>
+              <w:right w:w="100" w:type="dxa"/>
+            </w:tcMar>
+            <w:vAlign w:val="center"/>
+          </w:tcPr>
+          <w:p>
+            <w:pPr>
+              <w:jc w:val="right"/>
+              <w:spacing w:after="0"/>
+            </w:pPr>
+            <w:r>
+              <w:rPr>
+                <w:rFonts w:ascii="TH Sarabun New" w:eastAsia="TH Sarabun New" w:hAnsi="TH Sarabun New" w:cs="TH Sarabun New"/>
+                <w:sz w:val="22"/>
+                <w:color w:val="1F2937"/>
+              </w:rPr>
+              <w:t>431.3</w:t>
+            </w:r>
+          </w:p>
+        </w:tc>
+        <w:tc>
+          <w:tcPr>
+            <w:tcW w:w="1200" w:type="dxa"/>
+            <w:tcMar>
+              <w:top w:w="80" w:type="dxa"/>
+              <w:left w:w="100" w:type="dxa"/>
+              <w:bottom w:w="80" w:type="dxa"/>
+              <w:right w:w="100" w:type="dxa"/>
+            </w:tcMar>
+            <w:vAlign w:val="center"/>
+          </w:tcPr>
+          <w:p>
+            <w:pPr>
+              <w:jc w:val="right"/>
+              <w:spacing w:after="0"/>
+            </w:pPr>
+            <w:r>
+              <w:rPr>
+                <w:rFonts w:ascii="TH Sarabun New" w:eastAsia="TH Sarabun New" w:hAnsi="TH Sarabun New" w:cs="TH Sarabun New"/>
+                <w:sz w:val="22"/>
+                <w:color w:val="1F2937"/>
+              </w:rPr>
+              <w:t>512.0</w:t>
+            </w:r>
+          </w:p>
+        </w:tc>
+        <w:tc>
+          <w:tcPr>
+            <w:tcW w:w="1000" w:type="dxa"/>
+            <w:tcMar>
+              <w:top w:w="80" w:type="dxa"/>
+              <w:left w:w="100" w:type="dxa"/>
+              <w:bottom w:w="80" w:type="dxa"/>
+              <w:right w:w="100" w:type="dxa"/>
+            </w:tcMar>
+            <w:vAlign w:val="center"/>
+          </w:tcPr>
+          <w:p>
+            <w:pPr>
+              <w:jc w:val="right"/>
+              <w:spacing w:after="0"/>
+            </w:pPr>
+            <w:r>
+              <w:rPr>
+                <w:rFonts w:ascii="TH Sarabun New" w:eastAsia="TH Sarabun New" w:hAnsi="TH Sarabun New" w:cs="TH Sarabun New"/>
+                <w:sz w:val="22"/>
+                <w:color w:val="1F2937"/>
+              </w:rPr>
+              <w:t>+80.7</w:t>
+            </w:r>
+          </w:p>
+        </w:tc>
+        <w:tc>
+          <w:tcPr>
+            <w:tcW w:w="900" w:type="dxa"/>
+            <w:tcMar>
+              <w:top w:w="80" w:type="dxa"/>
+              <w:left w:w="100" w:type="dxa"/>
+              <w:bottom w:w="80" w:type="dxa"/>
+              <w:right w:w="100" w:type="dxa"/>
+            </w:tcMar>
+            <w:vAlign w:val="center"/>
+          </w:tcPr>
+          <w:p>
+            <w:pPr>
+              <w:jc w:val="center"/>
+              <w:spacing w:after="0"/>
+            </w:pPr>
+            <w:r>
+              <w:rPr>
+                <w:rFonts w:ascii="TH Sarabun New" w:eastAsia="TH Sarabun New" w:hAnsi="TH Sarabun New" w:cs="TH Sarabun New"/>
+                <w:sz w:val="22"/>
+                <w:color w:val="1F2937"/>
+              </w:rPr>
+              <w:t>7/7</w:t>
+            </w:r>
+          </w:p>
+        </w:tc>
+      </w:tr>
+      <w:tr>
+        <w:tc>
+          <w:tcPr>
+            <w:tcW w:w="640" w:type="dxa"/>
+            <w:tcMar>
+              <w:top w:w="80" w:type="dxa"/>
+              <w:left w:w="100" w:type="dxa"/>
+              <w:bottom w:w="80" w:type="dxa"/>
+              <w:right w:w="100" w:type="dxa"/>
+            </w:tcMar>
+            <w:vAlign w:val="center"/>
+          </w:tcPr>
+          <w:p>
+            <w:pPr>
+              <w:jc w:val="center"/>
+              <w:spacing w:after="0"/>
+            </w:pPr>
+            <w:r>
+              <w:rPr>
+                <w:rFonts w:ascii="TH Sarabun New" w:eastAsia="TH Sarabun New" w:hAnsi="TH Sarabun New" w:cs="TH Sarabun New"/>
+                <w:sz w:val="22"/>
+                <w:color w:val="1F2937"/>
+              </w:rPr>
+              <w:t>4</w:t>
+            </w:r>
+          </w:p>
+        </w:tc>
+        <w:tc>
+          <w:tcPr>
+            <w:tcW w:w="1000" w:type="dxa"/>
+            <w:tcMar>
+              <w:top w:w="80" w:type="dxa"/>
+              <w:left w:w="100" w:type="dxa"/>
+              <w:bottom w:w="80" w:type="dxa"/>
+              <w:right w:w="100" w:type="dxa"/>
+            </w:tcMar>
+            <w:vAlign w:val="center"/>
+          </w:tcPr>
+          <w:p>
+            <w:pPr>
+              <w:jc w:val="center"/>
+              <w:spacing w:after="0"/>
+            </w:pPr>
+            <w:r>
+              <w:rPr>
+                <w:rFonts w:ascii="TH Sarabun New" w:eastAsia="TH Sarabun New" w:hAnsi="TH Sarabun New" w:cs="TH Sarabun New"/>
+                <w:sz w:val="22"/>
+                <w:color w:val="1F2937"/>
+              </w:rPr>
+              <w:t>1322</w:t>
+            </w:r>
+          </w:p>
+        </w:tc>
+        <w:tc>
+          <w:tcPr>
+            <w:tcW w:w="2300" w:type="dxa"/>
+            <w:tcMar>
+              <w:top w:w="80" w:type="dxa"/>
+              <w:left w:w="100" w:type="dxa"/>
+              <w:bottom w:w="80" w:type="dxa"/>
+              <w:right w:w="100" w:type="dxa"/>
+            </w:tcMar>
+            <w:vAlign w:val="center"/>
+          </w:tcPr>
+          <w:p>
+            <w:pPr>
+              <w:spacing w:after="0"/>
+            </w:pPr>
+            <w:r>
+              <w:rPr>
+                <w:rFonts w:ascii="TH Sarabun New" w:eastAsia="TH Sarabun New" w:hAnsi="TH Sarabun New" w:cs="TH Sarabun New"/>
+                <w:sz w:val="22"/>
+                <w:color w:val="1F2937"/>
+              </w:rPr>
+              <w:t>ด.ช.อดิศร ว่องไว</w:t>
+            </w:r>
+          </w:p>
+        </w:tc>
+        <w:tc>
+          <w:tcPr>
+            <w:tcW w:w="1200" w:type="dxa"/>
+            <w:tcMar>
+              <w:top w:w="80" w:type="dxa"/>
+              <w:left w:w="100" w:type="dxa"/>
+              <w:bottom w:w="80" w:type="dxa"/>
+              <w:right w:w="100" w:type="dxa"/>
+            </w:tcMar>
+            <w:vAlign w:val="center"/>
+          </w:tcPr>
+          <w:p>
+            <w:pPr>
+              <w:jc w:val="right"/>
+              <w:spacing w:after="0"/>
+            </w:pPr>
+            <w:r>
+              <w:rPr>
+                <w:rFonts w:ascii="TH Sarabun New" w:eastAsia="TH Sarabun New" w:hAnsi="TH Sarabun New" w:cs="TH Sarabun New"/>
+                <w:sz w:val="22"/>
+                <w:color w:val="1F2937"/>
+              </w:rPr>
+              <w:t>298.5</w:t>
+            </w:r>
+          </w:p>
+        </w:tc>
+        <w:tc>
+          <w:tcPr>
+            <w:tcW w:w="1200" w:type="dxa"/>
+            <w:tcMar>
+              <w:top w:w="80" w:type="dxa"/>
+              <w:left w:w="100" w:type="dxa"/>
+              <w:bottom w:w="80" w:type="dxa"/>
+              <w:right w:w="100" w:type="dxa"/>
+            </w:tcMar>
+            <w:vAlign w:val="center"/>
+          </w:tcPr>
+          <w:p>
+            <w:pPr>
+              <w:jc w:val="right"/>
+              <w:spacing w:after="0"/>
+            </w:pPr>
+            <w:r>
+              <w:rPr>
+                <w:rFonts w:ascii="TH Sarabun New" w:eastAsia="TH Sarabun New" w:hAnsi="TH Sarabun New" w:cs="TH Sarabun New"/>
+                <w:sz w:val="22"/>
+                <w:color w:val="1F2937"/>
+              </w:rPr>
+              <w:t>421.5</w:t>
+            </w:r>
+          </w:p>
+        </w:tc>
+        <w:tc>
+          <w:tcPr>
+            <w:tcW w:w="1000" w:type="dxa"/>
+            <w:tcMar>
+              <w:top w:w="80" w:type="dxa"/>
+              <w:left w:w="100" w:type="dxa"/>
+              <w:bottom w:w="80" w:type="dxa"/>
+              <w:right w:w="100" w:type="dxa"/>
+            </w:tcMar>
+            <w:vAlign w:val="center"/>
+          </w:tcPr>
+          <w:p>
+            <w:pPr>
+              <w:jc w:val="right"/>
+              <w:spacing w:after="0"/>
+            </w:pPr>
+            <w:r>
+              <w:rPr>
+                <w:rFonts w:ascii="TH Sarabun New" w:eastAsia="TH Sarabun New" w:hAnsi="TH Sarabun New" w:cs="TH Sarabun New"/>
+                <w:sz w:val="22"/>
+                <w:color w:val="1F2937"/>
+              </w:rPr>
+              <w:t>+123.0</w:t>
+            </w:r>
+          </w:p>
+        </w:tc>
+        <w:tc>
+          <w:tcPr>
+            <w:tcW w:w="900" w:type="dxa"/>
+            <w:tcMar>
+              <w:top w:w="80" w:type="dxa"/>
+              <w:left w:w="100" w:type="dxa"/>
+              <w:bottom w:w="80" w:type="dxa"/>
+              <w:right w:w="100" w:type="dxa"/>
+            </w:tcMar>
+            <w:vAlign w:val="center"/>
+          </w:tcPr>
+          <w:p>
+            <w:pPr>
+              <w:jc w:val="center"/>
+              <w:spacing w:after="0"/>
+            </w:pPr>
+            <w:r>
+              <w:rPr>
+                <w:rFonts w:ascii="TH Sarabun New" w:eastAsia="TH Sarabun New" w:hAnsi="TH Sarabun New" w:cs="TH Sarabun New"/>
+                <w:sz w:val="22"/>
+                <w:color w:val="1F2937"/>
+              </w:rPr>
+              <w:t>7/7</w:t>
+            </w:r>
+          </w:p>
+        </w:tc>
+      </w:tr>
+      <w:tr>
+        <w:tc>
+          <w:tcPr>
+            <w:tcW w:w="640" w:type="dxa"/>
+            <w:tcMar>
+              <w:top w:w="80" w:type="dxa"/>
+              <w:left w:w="100" w:type="dxa"/>
+              <w:bottom w:w="80" w:type="dxa"/>
+              <w:right w:w="100" w:type="dxa"/>
+            </w:tcMar>
+            <w:vAlign w:val="center"/>
+          </w:tcPr>
+          <w:p>
+            <w:pPr>
+              <w:jc w:val="center"/>
+              <w:spacing w:after="0"/>
+            </w:pPr>
+            <w:r>
+              <w:rPr>
+                <w:rFonts w:ascii="TH Sarabun New" w:eastAsia="TH Sarabun New" w:hAnsi="TH Sarabun New" w:cs="TH Sarabun New"/>
+                <w:sz w:val="22"/>
+                <w:color w:val="1F2937"/>
+              </w:rPr>
+              <w:t>5</w:t>
+            </w:r>
+          </w:p>
+        </w:tc>
+        <w:tc>
+          <w:tcPr>
+            <w:tcW w:w="1000" w:type="dxa"/>
+            <w:tcMar>
+              <w:top w:w="80" w:type="dxa"/>
+              <w:left w:w="100" w:type="dxa"/>
+              <w:bottom w:w="80" w:type="dxa"/>
+              <w:right w:w="100" w:type="dxa"/>
+            </w:tcMar>
+            <w:vAlign w:val="center"/>
+          </w:tcPr>
+          <w:p>
+            <w:pPr>
+              <w:jc w:val="center"/>
+              <w:spacing w:after="0"/>
+            </w:pPr>
+            <w:r>
+              <w:rPr>
+                <w:rFonts w:ascii="TH Sarabun New" w:eastAsia="TH Sarabun New" w:hAnsi="TH Sarabun New" w:cs="TH Sarabun New"/>
+                <w:sz w:val="22"/>
+                <w:color w:val="1F2937"/>
+              </w:rPr>
+              <w:t>1323</w:t>
+            </w:r>
+          </w:p>
+        </w:tc>
+        <w:tc>
+          <w:tcPr>
+            <w:tcW w:w="2300" w:type="dxa"/>
+            <w:tcMar>
+              <w:top w:w="80" w:type="dxa"/>
+              <w:left w:w="100" w:type="dxa"/>
+              <w:bottom w:w="80" w:type="dxa"/>
+              <w:right w:w="100" w:type="dxa"/>
+            </w:tcMar>
+            <w:vAlign w:val="center"/>
+          </w:tcPr>
+          <w:p>
+            <w:pPr>
+              <w:spacing w:after="0"/>
+            </w:pPr>
+            <w:r>
+              <w:rPr>
+                <w:rFonts w:ascii="TH Sarabun New" w:eastAsia="TH Sarabun New" w:hAnsi="TH Sarabun New" w:cs="TH Sarabun New"/>
+                <w:sz w:val="22"/>
+                <w:color w:val="1F2937"/>
+              </w:rPr>
+              <w:t>ด.ญ.สรารัตน์ มฤกุล</w:t>
+            </w:r>
+          </w:p>
+        </w:tc>
+        <w:tc>
+          <w:tcPr>
+            <w:tcW w:w="1200" w:type="dxa"/>
+            <w:tcMar>
+              <w:top w:w="80" w:type="dxa"/>
+              <w:left w:w="100" w:type="dxa"/>
+              <w:bottom w:w="80" w:type="dxa"/>
+              <w:right w:w="100" w:type="dxa"/>
+            </w:tcMar>
+            <w:vAlign w:val="center"/>
+          </w:tcPr>
+          <w:p>
+            <w:pPr>
+              <w:jc w:val="right"/>
+              <w:spacing w:after="0"/>
+            </w:pPr>
+            <w:r>
+              <w:rPr>
+                <w:rFonts w:ascii="TH Sarabun New" w:eastAsia="TH Sarabun New" w:hAnsi="TH Sarabun New" w:cs="TH Sarabun New"/>
+                <w:sz w:val="22"/>
+                <w:color w:val="1F2937"/>
+              </w:rPr>
+              <w:t>150.0</w:t>
+            </w:r>
+          </w:p>
+        </w:tc>
+        <w:tc>
+          <w:tcPr>
+            <w:tcW w:w="1200" w:type="dxa"/>
+            <w:tcMar>
+              <w:top w:w="80" w:type="dxa"/>
+              <w:left w:w="100" w:type="dxa"/>
+              <w:bottom w:w="80" w:type="dxa"/>
+              <w:right w:w="100" w:type="dxa"/>
+            </w:tcMar>
+            <w:vAlign w:val="center"/>
+          </w:tcPr>
+          <w:p>
+            <w:pPr>
+              <w:jc w:val="right"/>
+              <w:spacing w:after="0"/>
+            </w:pPr>
+            <w:r>
+              <w:rPr>
+                <w:rFonts w:ascii="TH Sarabun New" w:eastAsia="TH Sarabun New" w:hAnsi="TH Sarabun New" w:cs="TH Sarabun New"/>
+                <w:sz w:val="22"/>
+                <w:color w:val="1F2937"/>
+              </w:rPr>
+              <w:t>288.0</w:t>
+            </w:r>
+          </w:p>
+        </w:tc>
+        <w:tc>
+          <w:tcPr>
+            <w:tcW w:w="1000" w:type="dxa"/>
+            <w:tcMar>
+              <w:top w:w="80" w:type="dxa"/>
+              <w:left w:w="100" w:type="dxa"/>
+              <w:bottom w:w="80" w:type="dxa"/>
+              <w:right w:w="100" w:type="dxa"/>
+            </w:tcMar>
+            <w:vAlign w:val="center"/>
+          </w:tcPr>
+          <w:p>
+            <w:pPr>
+              <w:jc w:val="right"/>
+              <w:spacing w:after="0"/>
+            </w:pPr>
+            <w:r>
+              <w:rPr>
+                <w:rFonts w:ascii="TH Sarabun New" w:eastAsia="TH Sarabun New" w:hAnsi="TH Sarabun New" w:cs="TH Sarabun New"/>
+                <w:sz w:val="22"/>
+                <w:color w:val="1F2937"/>
+              </w:rPr>
+              <w:t>+138.0</w:t>
+            </w:r>
+          </w:p>
+        </w:tc>
+        <w:tc>
+          <w:tcPr>
+            <w:tcW w:w="900" w:type="dxa"/>
+            <w:tcMar>
+              <w:top w:w="80" w:type="dxa"/>
+              <w:left w:w="100" w:type="dxa"/>
+              <w:bottom w:w="80" w:type="dxa"/>
+              <w:right w:w="100" w:type="dxa"/>
+            </w:tcMar>
+            <w:vAlign w:val="center"/>
+          </w:tcPr>
+          <w:p>
+            <w:pPr>
+              <w:jc w:val="center"/>
+              <w:spacing w:after="0"/>
+            </w:pPr>
+            <w:r>
+              <w:rPr>
+                <w:rFonts w:ascii="TH Sarabun New" w:eastAsia="TH Sarabun New" w:hAnsi="TH Sarabun New" w:cs="TH Sarabun New"/>
+                <w:sz w:val="22"/>
+                <w:color w:val="1F2937"/>
+              </w:rPr>
+              <w:t>7/7</w:t>
+            </w:r>
+          </w:p>
+        </w:tc>
+      </w:tr>
+      <w:tr>
+        <w:tc>
+          <w:tcPr>
+            <w:tcW w:w="640" w:type="dxa"/>
+            <w:tcMar>
+              <w:top w:w="80" w:type="dxa"/>
+              <w:left w:w="100" w:type="dxa"/>
+              <w:bottom w:w="80" w:type="dxa"/>
+              <w:right w:w="100" w:type="dxa"/>
+            </w:tcMar>
+            <w:vAlign w:val="center"/>
+          </w:tcPr>
+          <w:p>
+            <w:pPr>
+              <w:jc w:val="center"/>
+              <w:spacing w:after="0"/>
+            </w:pPr>
+            <w:r>
+              <w:rPr>
+                <w:rFonts w:ascii="TH Sarabun New" w:eastAsia="TH Sarabun New" w:hAnsi="TH Sarabun New" w:cs="TH Sarabun New"/>
+                <w:sz w:val="22"/>
+                <w:color w:val="1F2937"/>
+              </w:rPr>
+              <w:t>6</w:t>
+            </w:r>
+          </w:p>
+        </w:tc>
+        <w:tc>
+          <w:tcPr>
+            <w:tcW w:w="1000" w:type="dxa"/>
+            <w:tcMar>
+              <w:top w:w="80" w:type="dxa"/>
+              <w:left w:w="100" w:type="dxa"/>
+              <w:bottom w:w="80" w:type="dxa"/>
+              <w:right w:w="100" w:type="dxa"/>
+            </w:tcMar>
+            <w:vAlign w:val="center"/>
+          </w:tcPr>
+          <w:p>
+            <w:pPr>
+              <w:jc w:val="center"/>
+              <w:spacing w:after="0"/>
+            </w:pPr>
+            <w:r>
+              <w:rPr>
+                <w:rFonts w:ascii="TH Sarabun New" w:eastAsia="TH Sarabun New" w:hAnsi="TH Sarabun New" w:cs="TH Sarabun New"/>
+                <w:sz w:val="22"/>
+                <w:color w:val="1F2937"/>
+              </w:rPr>
+              <w:t>1324</w:t>
+            </w:r>
+          </w:p>
+        </w:tc>
+        <w:tc>
+          <w:tcPr>
+            <w:tcW w:w="2300" w:type="dxa"/>
+            <w:tcMar>
+              <w:top w:w="80" w:type="dxa"/>
+              <w:left w:w="100" w:type="dxa"/>
+              <w:bottom w:w="80" w:type="dxa"/>
+              <w:right w:w="100" w:type="dxa"/>
+            </w:tcMar>
+            <w:vAlign w:val="center"/>
+          </w:tcPr>
+          <w:p>
+            <w:pPr>
+              <w:spacing w:after="0"/>
+            </w:pPr>
+            <w:r>
+              <w:rPr>
+                <w:rFonts w:ascii="TH Sarabun New" w:eastAsia="TH Sarabun New" w:hAnsi="TH Sarabun New" w:cs="TH Sarabun New"/>
+                <w:sz w:val="22"/>
+                <w:color w:val="1F2937"/>
+              </w:rPr>
+              <w:t>ด.ญ.อัญมณี เบิกบานดี</w:t>
+            </w:r>
+          </w:p>
+        </w:tc>
+        <w:tc>
+          <w:tcPr>
+            <w:tcW w:w="1200" w:type="dxa"/>
+            <w:tcMar>
+              <w:top w:w="80" w:type="dxa"/>
+              <w:left w:w="100" w:type="dxa"/>
+              <w:bottom w:w="80" w:type="dxa"/>
+              <w:right w:w="100" w:type="dxa"/>
+            </w:tcMar>
+            <w:vAlign w:val="center"/>
+          </w:tcPr>
+          <w:p>
+            <w:pPr>
+              <w:jc w:val="right"/>
+              <w:spacing w:after="0"/>
+            </w:pPr>
+            <w:r>
+              <w:rPr>
+                <w:rFonts w:ascii="TH Sarabun New" w:eastAsia="TH Sarabun New" w:hAnsi="TH Sarabun New" w:cs="TH Sarabun New"/>
+                <w:sz w:val="22"/>
+                <w:color w:val="1F2937"/>
+              </w:rPr>
+              <w:t>268.7</w:t>
+            </w:r>
+          </w:p>
+        </w:tc>
+        <w:tc>
+          <w:tcPr>
+            <w:tcW w:w="1200" w:type="dxa"/>
+            <w:tcMar>
+              <w:top w:w="80" w:type="dxa"/>
+              <w:left w:w="100" w:type="dxa"/>
+              <w:bottom w:w="80" w:type="dxa"/>
+              <w:right w:w="100" w:type="dxa"/>
+            </w:tcMar>
+            <w:vAlign w:val="center"/>
+          </w:tcPr>
+          <w:p>
+            <w:pPr>
+              <w:jc w:val="right"/>
+              <w:spacing w:after="0"/>
+            </w:pPr>
+            <w:r>
+              <w:rPr>
+                <w:rFonts w:ascii="TH Sarabun New" w:eastAsia="TH Sarabun New" w:hAnsi="TH Sarabun New" w:cs="TH Sarabun New"/>
+                <w:sz w:val="22"/>
+                <w:color w:val="1F2937"/>
+              </w:rPr>
+              <w:t>390.0</w:t>
+            </w:r>
+          </w:p>
+        </w:tc>
+        <w:tc>
+          <w:tcPr>
+            <w:tcW w:w="1000" w:type="dxa"/>
+            <w:tcMar>
+              <w:top w:w="80" w:type="dxa"/>
+              <w:left w:w="100" w:type="dxa"/>
+              <w:bottom w:w="80" w:type="dxa"/>
+              <w:right w:w="100" w:type="dxa"/>
+            </w:tcMar>
+            <w:vAlign w:val="center"/>
+          </w:tcPr>
+          <w:p>
+            <w:pPr>
+              <w:jc w:val="right"/>
+              <w:spacing w:after="0"/>
+            </w:pPr>
+            <w:r>
+              <w:rPr>
+                <w:rFonts w:ascii="TH Sarabun New" w:eastAsia="TH Sarabun New" w:hAnsi="TH Sarabun New" w:cs="TH Sarabun New"/>
+                <w:sz w:val="22"/>
+                <w:color w:val="1F2937"/>
+              </w:rPr>
+              <w:t>+121.3</w:t>
+            </w:r>
+          </w:p>
+        </w:tc>
+        <w:tc>
+          <w:tcPr>
+            <w:tcW w:w="900" w:type="dxa"/>
+            <w:tcMar>
+              <w:top w:w="80" w:type="dxa"/>
+              <w:left w:w="100" w:type="dxa"/>
+              <w:bottom w:w="80" w:type="dxa"/>
+              <w:right w:w="100" w:type="dxa"/>
+            </w:tcMar>
+            <w:vAlign w:val="center"/>
+          </w:tcPr>
+          <w:p>
+            <w:pPr>
+              <w:jc w:val="center"/>
+              <w:spacing w:after="0"/>
+            </w:pPr>
+            <w:r>
+              <w:rPr>
+                <w:rFonts w:ascii="TH Sarabun New" w:eastAsia="TH Sarabun New" w:hAnsi="TH Sarabun New" w:cs="TH Sarabun New"/>
+                <w:sz w:val="22"/>
+                <w:color w:val="1F2937"/>
+              </w:rPr>
+              <w:t>7/7</w:t>
+            </w:r>
+          </w:p>
+        </w:tc>
+      </w:tr>
+      <w:tr>
+        <w:tc>
+          <w:tcPr>
+            <w:tcW w:w="640" w:type="dxa"/>
+            <w:tcMar>
+              <w:top w:w="80" w:type="dxa"/>
+              <w:left w:w="100" w:type="dxa"/>
+              <w:bottom w:w="80" w:type="dxa"/>
+              <w:right w:w="100" w:type="dxa"/>
+            </w:tcMar>
+            <w:vAlign w:val="center"/>
+          </w:tcPr>
+          <w:p>
+            <w:pPr>
+              <w:jc w:val="center"/>
+              <w:spacing w:after="0"/>
+            </w:pPr>
+            <w:r>
+              <w:rPr>
+                <w:rFonts w:ascii="TH Sarabun New" w:eastAsia="TH Sarabun New" w:hAnsi="TH Sarabun New" w:cs="TH Sarabun New"/>
+                <w:sz w:val="22"/>
+                <w:color w:val="1F2937"/>
+              </w:rPr>
+              <w:t>7</w:t>
+            </w:r>
+          </w:p>
+        </w:tc>
+        <w:tc>
+          <w:tcPr>
+            <w:tcW w:w="1000" w:type="dxa"/>
+            <w:tcMar>
+              <w:top w:w="80" w:type="dxa"/>
+              <w:left w:w="100" w:type="dxa"/>
+              <w:bottom w:w="80" w:type="dxa"/>
+              <w:right w:w="100" w:type="dxa"/>
+            </w:tcMar>
+            <w:vAlign w:val="center"/>
+          </w:tcPr>
+          <w:p>
+            <w:pPr>
+              <w:jc w:val="center"/>
+              <w:spacing w:after="0"/>
+            </w:pPr>
+            <w:r>
+              <w:rPr>
+                <w:rFonts w:ascii="TH Sarabun New" w:eastAsia="TH Sarabun New" w:hAnsi="TH Sarabun New" w:cs="TH Sarabun New"/>
+                <w:sz w:val="22"/>
+                <w:color w:val="1F2937"/>
+              </w:rPr>
+              <w:t>1326</w:t>
+            </w:r>
+          </w:p>
+        </w:tc>
+        <w:tc>
+          <w:tcPr>
+            <w:tcW w:w="2300" w:type="dxa"/>
+            <w:tcMar>
+              <w:top w:w="80" w:type="dxa"/>
+              <w:left w:w="100" w:type="dxa"/>
+              <w:bottom w:w="80" w:type="dxa"/>
+              <w:right w:w="100" w:type="dxa"/>
+            </w:tcMar>
+            <w:vAlign w:val="center"/>
+          </w:tcPr>
+          <w:p>
+            <w:pPr>
+              <w:spacing w:after="0"/>
+            </w:pPr>
+            <w:r>
+              <w:rPr>
+                <w:rFonts w:ascii="TH Sarabun New" w:eastAsia="TH Sarabun New" w:hAnsi="TH Sarabun New" w:cs="TH Sarabun New"/>
+                <w:sz w:val="22"/>
+                <w:color w:val="1F2937"/>
+              </w:rPr>
+              <w:t>ด.ญ.สุพิชฌาย์ ศรีนาดี</w:t>
+            </w:r>
+          </w:p>
+        </w:tc>
+        <w:tc>
+          <w:tcPr>
+            <w:tcW w:w="1200" w:type="dxa"/>
+            <w:tcMar>
+              <w:top w:w="80" w:type="dxa"/>
+              <w:left w:w="100" w:type="dxa"/>
+              <w:bottom w:w="80" w:type="dxa"/>
+              <w:right w:w="100" w:type="dxa"/>
+            </w:tcMar>
+            <w:vAlign w:val="center"/>
+          </w:tcPr>
+          <w:p>
+            <w:pPr>
+              <w:jc w:val="right"/>
+              <w:spacing w:after="0"/>
+            </w:pPr>
+            <w:r>
+              <w:rPr>
+                <w:rFonts w:ascii="TH Sarabun New" w:eastAsia="TH Sarabun New" w:hAnsi="TH Sarabun New" w:cs="TH Sarabun New"/>
+                <w:sz w:val="22"/>
+                <w:color w:val="1F2937"/>
+              </w:rPr>
+              <w:t>330.3</w:t>
+            </w:r>
+          </w:p>
+        </w:tc>
+        <w:tc>
+          <w:tcPr>
+            <w:tcW w:w="1200" w:type="dxa"/>
+            <w:tcMar>
+              <w:top w:w="80" w:type="dxa"/>
+              <w:left w:w="100" w:type="dxa"/>
+              <w:bottom w:w="80" w:type="dxa"/>
+              <w:right w:w="100" w:type="dxa"/>
+            </w:tcMar>
+            <w:vAlign w:val="center"/>
+          </w:tcPr>
+          <w:p>
+            <w:pPr>
+              <w:jc w:val="right"/>
+              <w:spacing w:after="0"/>
+            </w:pPr>
+            <w:r>
+              <w:rPr>
+                <w:rFonts w:ascii="TH Sarabun New" w:eastAsia="TH Sarabun New" w:hAnsi="TH Sarabun New" w:cs="TH Sarabun New"/>
+                <w:sz w:val="22"/>
+                <w:color w:val="1F2937"/>
+              </w:rPr>
+              <w:t>458.5</w:t>
+            </w:r>
+          </w:p>
+        </w:tc>
+        <w:tc>
+          <w:tcPr>
+            <w:tcW w:w="1000" w:type="dxa"/>
+            <w:tcMar>
+              <w:top w:w="80" w:type="dxa"/>
+              <w:left w:w="100" w:type="dxa"/>
+              <w:bottom w:w="80" w:type="dxa"/>
+              <w:right w:w="100" w:type="dxa"/>
+            </w:tcMar>
+            <w:vAlign w:val="center"/>
+          </w:tcPr>
+          <w:p>
+            <w:pPr>
+              <w:jc w:val="right"/>
+              <w:spacing w:after="0"/>
+            </w:pPr>
+            <w:r>
+              <w:rPr>
+                <w:rFonts w:ascii="TH Sarabun New" w:eastAsia="TH Sarabun New" w:hAnsi="TH Sarabun New" w:cs="TH Sarabun New"/>
+                <w:sz w:val="22"/>
+                <w:color w:val="1F2937"/>
+              </w:rPr>
+              <w:t>+128.2</w:t>
+            </w:r>
+          </w:p>
+        </w:tc>
+        <w:tc>
+          <w:tcPr>
+            <w:tcW w:w="900" w:type="dxa"/>
+            <w:tcMar>
+              <w:top w:w="80" w:type="dxa"/>
+              <w:left w:w="100" w:type="dxa"/>
+              <w:bottom w:w="80" w:type="dxa"/>
+              <w:right w:w="100" w:type="dxa"/>
+            </w:tcMar>
+            <w:vAlign w:val="center"/>
+          </w:tcPr>
+          <w:p>
+            <w:pPr>
+              <w:jc w:val="center"/>
+              <w:spacing w:after="0"/>
+            </w:pPr>
+            <w:r>
+              <w:rPr>
+                <w:rFonts w:ascii="TH Sarabun New" w:eastAsia="TH Sarabun New" w:hAnsi="TH Sarabun New" w:cs="TH Sarabun New"/>
+                <w:sz w:val="22"/>
+                <w:color w:val="1F2937"/>
+              </w:rPr>
+              <w:t>7/7</w:t>
+            </w:r>
+          </w:p>
+        </w:tc>
+      </w:tr>
+      <w:tr>
+        <w:tc>
+          <w:tcPr>
+            <w:tcW w:w="640" w:type="dxa"/>
+            <w:tcMar>
+              <w:top w:w="80" w:type="dxa"/>
+              <w:left w:w="100" w:type="dxa"/>
+              <w:bottom w:w="80" w:type="dxa"/>
+              <w:right w:w="100" w:type="dxa"/>
+            </w:tcMar>
+            <w:vAlign w:val="center"/>
+          </w:tcPr>
+          <w:p>
+            <w:pPr>
+              <w:jc w:val="center"/>
+              <w:spacing w:after="0"/>
+            </w:pPr>
+            <w:r>
+              <w:rPr>
+                <w:rFonts w:ascii="TH Sarabun New" w:eastAsia="TH Sarabun New" w:hAnsi="TH Sarabun New" w:cs="TH Sarabun New"/>
+                <w:sz w:val="22"/>
+                <w:color w:val="1F2937"/>
+              </w:rPr>
+              <w:t>8</w:t>
+            </w:r>
+          </w:p>
+        </w:tc>
+        <w:tc>
+          <w:tcPr>
+            <w:tcW w:w="1000" w:type="dxa"/>
+            <w:tcMar>
+              <w:top w:w="80" w:type="dxa"/>
+              <w:left w:w="100" w:type="dxa"/>
+              <w:bottom w:w="80" w:type="dxa"/>
+              <w:right w:w="100" w:type="dxa"/>
+            </w:tcMar>
+            <w:vAlign w:val="center"/>
+          </w:tcPr>
+          <w:p>
+            <w:pPr>
+              <w:jc w:val="center"/>
+              <w:spacing w:after="0"/>
+            </w:pPr>
+            <w:r>
+              <w:rPr>
+                <w:rFonts w:ascii="TH Sarabun New" w:eastAsia="TH Sarabun New" w:hAnsi="TH Sarabun New" w:cs="TH Sarabun New"/>
+                <w:sz w:val="22"/>
+                <w:color w:val="1F2937"/>
+              </w:rPr>
+              <w:t>1327</w:t>
+            </w:r>
+          </w:p>
+        </w:tc>
+        <w:tc>
+          <w:tcPr>
+            <w:tcW w:w="2300" w:type="dxa"/>
+            <w:tcMar>
+              <w:top w:w="80" w:type="dxa"/>
+              <w:left w:w="100" w:type="dxa"/>
+              <w:bottom w:w="80" w:type="dxa"/>
+              <w:right w:w="100" w:type="dxa"/>
+            </w:tcMar>
+            <w:vAlign w:val="center"/>
+          </w:tcPr>
+          <w:p>
+            <w:pPr>
+              <w:spacing w:after="0"/>
+            </w:pPr>
+            <w:r>
+              <w:rPr>
+                <w:rFonts w:ascii="TH Sarabun New" w:eastAsia="TH Sarabun New" w:hAnsi="TH Sarabun New" w:cs="TH Sarabun New"/>
+                <w:sz w:val="22"/>
+                <w:color w:val="1F2937"/>
+              </w:rPr>
+              <w:t>ด.ช.มนต์มนัส คณิโรจน์</w:t>
+            </w:r>
+          </w:p>
+        </w:tc>
+        <w:tc>
+          <w:tcPr>
+            <w:tcW w:w="1200" w:type="dxa"/>
+            <w:tcMar>
+              <w:top w:w="80" w:type="dxa"/>
+              <w:left w:w="100" w:type="dxa"/>
+              <w:bottom w:w="80" w:type="dxa"/>
+              <w:right w:w="100" w:type="dxa"/>
+            </w:tcMar>
+            <w:vAlign w:val="center"/>
+          </w:tcPr>
+          <w:p>
+            <w:pPr>
+              <w:jc w:val="right"/>
+              <w:spacing w:after="0"/>
+            </w:pPr>
+            <w:r>
+              <w:rPr>
+                <w:rFonts w:ascii="TH Sarabun New" w:eastAsia="TH Sarabun New" w:hAnsi="TH Sarabun New" w:cs="TH Sarabun New"/>
+                <w:sz w:val="22"/>
+                <w:color w:val="1F2937"/>
+              </w:rPr>
+              <w:t>221.0</w:t>
+            </w:r>
+          </w:p>
+        </w:tc>
+        <w:tc>
+          <w:tcPr>
+            <w:tcW w:w="1200" w:type="dxa"/>
+            <w:tcMar>
+              <w:top w:w="80" w:type="dxa"/>
+              <w:left w:w="100" w:type="dxa"/>
+              <w:bottom w:w="80" w:type="dxa"/>
+              <w:right w:w="100" w:type="dxa"/>
+            </w:tcMar>
+            <w:vAlign w:val="center"/>
+          </w:tcPr>
+          <w:p>
+            <w:pPr>
+              <w:jc w:val="right"/>
+              <w:spacing w:after="0"/>
+            </w:pPr>
+            <w:r>
+              <w:rPr>
+                <w:rFonts w:ascii="TH Sarabun New" w:eastAsia="TH Sarabun New" w:hAnsi="TH Sarabun New" w:cs="TH Sarabun New"/>
+                <w:sz w:val="22"/>
+                <w:color w:val="1F2937"/>
+              </w:rPr>
+              <w:t>335.0</w:t>
+            </w:r>
+          </w:p>
+        </w:tc>
+        <w:tc>
+          <w:tcPr>
+            <w:tcW w:w="1000" w:type="dxa"/>
+            <w:tcMar>
+              <w:top w:w="80" w:type="dxa"/>
+              <w:left w:w="100" w:type="dxa"/>
+              <w:bottom w:w="80" w:type="dxa"/>
+              <w:right w:w="100" w:type="dxa"/>
+            </w:tcMar>
+            <w:vAlign w:val="center"/>
+          </w:tcPr>
+          <w:p>
+            <w:pPr>
+              <w:jc w:val="right"/>
+              <w:spacing w:after="0"/>
+            </w:pPr>
+            <w:r>
+              <w:rPr>
+                <w:rFonts w:ascii="TH Sarabun New" w:eastAsia="TH Sarabun New" w:hAnsi="TH Sarabun New" w:cs="TH Sarabun New"/>
+                <w:sz w:val="22"/>
+                <w:color w:val="1F2937"/>
+              </w:rPr>
+              <w:t>+114.0</w:t>
+            </w:r>
+          </w:p>
+        </w:tc>
+        <w:tc>
+          <w:tcPr>
+            <w:tcW w:w="900" w:type="dxa"/>
+            <w:tcMar>
+              <w:top w:w="80" w:type="dxa"/>
+              <w:left w:w="100" w:type="dxa"/>
+              <w:bottom w:w="80" w:type="dxa"/>
+              <w:right w:w="100" w:type="dxa"/>
+            </w:tcMar>
+            <w:vAlign w:val="center"/>
+          </w:tcPr>
+          <w:p>
+            <w:pPr>
+              <w:jc w:val="center"/>
+              <w:spacing w:after="0"/>
+            </w:pPr>
+            <w:r>
+              <w:rPr>
+                <w:rFonts w:ascii="TH Sarabun New" w:eastAsia="TH Sarabun New" w:hAnsi="TH Sarabun New" w:cs="TH Sarabun New"/>
+                <w:sz w:val="22"/>
+                <w:color w:val="1F2937"/>
+              </w:rPr>
+              <w:t>7/7</w:t>
+            </w:r>
+          </w:p>
+        </w:tc>
+      </w:tr>
+      <w:tr>
+        <w:tc>
+          <w:tcPr>
+            <w:tcW w:w="640" w:type="dxa"/>
+            <w:tcMar>
+              <w:top w:w="80" w:type="dxa"/>
+              <w:left w:w="100" w:type="dxa"/>
+              <w:bottom w:w="80" w:type="dxa"/>
+              <w:right w:w="100" w:type="dxa"/>
+            </w:tcMar>
+            <w:vAlign w:val="center"/>
+          </w:tcPr>
+          <w:p>
+            <w:pPr>
+              <w:jc w:val="center"/>
+              <w:spacing w:after="0"/>
+            </w:pPr>
+            <w:r>
+              <w:rPr>
+                <w:rFonts w:ascii="TH Sarabun New" w:eastAsia="TH Sarabun New" w:hAnsi="TH Sarabun New" w:cs="TH Sarabun New"/>
+                <w:sz w:val="22"/>
+                <w:color w:val="1F2937"/>
+              </w:rPr>
+              <w:t>รวม/เฉลี่ย</w:t>
+            </w:r>
+          </w:p>
+        </w:tc>
+        <w:tc>
+          <w:tcPr>
+            <w:tcW w:w="1000" w:type="dxa"/>
+            <w:tcMar>
+              <w:top w:w="80" w:type="dxa"/>
+              <w:left w:w="100" w:type="dxa"/>
+              <w:bottom w:w="80" w:type="dxa"/>
+              <w:right w:w="100" w:type="dxa"/>
+            </w:tcMar>
+            <w:vAlign w:val="center"/>
+          </w:tcPr>
+          <w:p>
+            <w:pPr>
+              <w:jc w:val="center"/>
+              <w:spacing w:after="0"/>
+            </w:pPr>
+            <w:r>
+              <w:rPr>
+                <w:rFonts w:ascii="TH Sarabun New" w:eastAsia="TH Sarabun New" w:hAnsi="TH Sarabun New" w:cs="TH Sarabun New"/>
+                <w:sz w:val="22"/>
+                <w:color w:val="1F2937"/>
+              </w:rPr>
+              <w:t/>
+            </w:r>
+          </w:p>
+        </w:tc>
+        <w:tc>
+          <w:tcPr>
+            <w:tcW w:w="2300" w:type="dxa"/>
+            <w:tcMar>
+              <w:top w:w="80" w:type="dxa"/>
+              <w:left w:w="100" w:type="dxa"/>
+              <w:bottom w:w="80" w:type="dxa"/>
+              <w:right w:w="100" w:type="dxa"/>
+            </w:tcMar>
+            <w:vAlign w:val="center"/>
+          </w:tcPr>
+          <w:p>
+            <w:pPr>
+              <w:spacing w:after="0"/>
+            </w:pPr>
+            <w:r>
+              <w:rPr>
+                <w:rFonts w:ascii="TH Sarabun New" w:eastAsia="TH Sarabun New" w:hAnsi="TH Sarabun New" w:cs="TH Sarabun New"/>
+                <w:sz w:val="22"/>
+                <w:color w:val="1F2937"/>
+              </w:rPr>
+              <w:t>นักเรียน 8 คน</w:t>
+            </w:r>
+          </w:p>
+        </w:tc>
+        <w:tc>
+          <w:tcPr>
+            <w:tcW w:w="1200" w:type="dxa"/>
+            <w:tcMar>
+              <w:top w:w="80" w:type="dxa"/>
+              <w:left w:w="100" w:type="dxa"/>
+              <w:bottom w:w="80" w:type="dxa"/>
+              <w:right w:w="100" w:type="dxa"/>
+            </w:tcMar>
+            <w:vAlign w:val="center"/>
+          </w:tcPr>
+          <w:p>
+            <w:pPr>
+              <w:jc w:val="right"/>
+              <w:spacing w:after="0"/>
+            </w:pPr>
+            <w:r>
+              <w:rPr>
+                <w:rFonts w:ascii="TH Sarabun New" w:eastAsia="TH Sarabun New" w:hAnsi="TH Sarabun New" w:cs="TH Sarabun New"/>
+                <w:sz w:val="22"/>
+                <w:color w:val="1F2937"/>
+              </w:rPr>
+              <w:t>278.7</w:t>
+            </w:r>
+          </w:p>
+        </w:tc>
+        <w:tc>
+          <w:tcPr>
+            <w:tcW w:w="1200" w:type="dxa"/>
+            <w:tcMar>
+              <w:top w:w="80" w:type="dxa"/>
+              <w:left w:w="100" w:type="dxa"/>
+              <w:bottom w:w="80" w:type="dxa"/>
+              <w:right w:w="100" w:type="dxa"/>
+            </w:tcMar>
+            <w:vAlign w:val="center"/>
+          </w:tcPr>
+          <w:p>
+            <w:pPr>
+              <w:jc w:val="right"/>
+              <w:spacing w:after="0"/>
+            </w:pPr>
+            <w:r>
+              <w:rPr>
+                <w:rFonts w:ascii="TH Sarabun New" w:eastAsia="TH Sarabun New" w:hAnsi="TH Sarabun New" w:cs="TH Sarabun New"/>
+                <w:sz w:val="22"/>
+                <w:color w:val="1F2937"/>
+              </w:rPr>
+              <w:t>396.0</w:t>
+            </w:r>
+          </w:p>
+        </w:tc>
+        <w:tc>
+          <w:tcPr>
+            <w:tcW w:w="1000" w:type="dxa"/>
+            <w:tcMar>
+              <w:top w:w="80" w:type="dxa"/>
+              <w:left w:w="100" w:type="dxa"/>
+              <w:bottom w:w="80" w:type="dxa"/>
+              <w:right w:w="100" w:type="dxa"/>
+            </w:tcMar>
+            <w:vAlign w:val="center"/>
+          </w:tcPr>
+          <w:p>
+            <w:pPr>
+              <w:jc w:val="right"/>
+              <w:spacing w:after="0"/>
+            </w:pPr>
+            <w:r>
+              <w:rPr>
+                <w:rFonts w:ascii="TH Sarabun New" w:eastAsia="TH Sarabun New" w:hAnsi="TH Sarabun New" w:cs="TH Sarabun New"/>
+                <w:sz w:val="22"/>
+                <w:color w:val="1F2937"/>
+              </w:rPr>
+              <w:t>+117.3</w:t>
+            </w:r>
+          </w:p>
+        </w:tc>
+        <w:tc>
+          <w:tcPr>
+            <w:tcW w:w="900" w:type="dxa"/>
+            <w:tcMar>
+              <w:top w:w="80" w:type="dxa"/>
+              <w:left w:w="100" w:type="dxa"/>
+              <w:bottom w:w="80" w:type="dxa"/>
+              <w:right w:w="100" w:type="dxa"/>
+            </w:tcMar>
+            <w:vAlign w:val="center"/>
+          </w:tcPr>
+          <w:p>
+            <w:pPr>
+              <w:jc w:val="center"/>
+              <w:spacing w:after="0"/>
+            </w:pPr>
+            <w:r>
+              <w:rPr>
+                <w:rFonts w:ascii="TH Sarabun New" w:eastAsia="TH Sarabun New" w:hAnsi="TH Sarabun New" w:cs="TH Sarabun New"/>
+                <w:sz w:val="22"/>
+                <w:color w:val="1F2937"/>
+              </w:rPr>
+              <w:t>14 วัน</w:t>
+            </w:r>
+          </w:p>
+        </w:tc>
+      </w:tr>
+    </w:tbl>
+    <w:p>
+      <w:pPr>
+        <w:spacing w:after="100"/>
+        <w:ind w:firstLine="504"/>
+        <w:jc w:val="both"/>
+      </w:pPr>
+      <w:r>
+        <w:rPr>
+          <w:rFonts w:ascii="TH Sarabun New" w:eastAsia="TH Sarabun New" w:hAnsi="TH Sarabun New" w:cs="TH Sarabun New"/>
+          <w:sz w:val="28"/>
+          <w:color w:val="1F2937"/>
+        </w:rPr>
+        <w:t>สรุปผลจากข้อมูลดัมมี่: คะแนนเฉลี่ยก่อนเรียนเท่ากับ 278.7 คะแนน คะแนนเฉลี่ยหลังเรียนเท่ากับ 396.0 คะแนน ผลต่างเฉลี่ย +117.3 คะแนน และนักเรียน 8 จาก 8 คน หรือร้อยละ 100 มีคะแนนหลังเรียนสูงขึ้น ซึ่งสอดคล้องกับสมมติฐานว่าเกมแข่งสูตรคูณช่วยเพิ่มความคล่องในการคำนวณสูตรคูณ</w:t>
+      </w:r>
+    </w:p>
+    <w:p>
+      <w:pPr>
+        <w:spacing w:after="100"/>
+        <w:ind w:firstLine="504"/>
+        <w:jc w:val="both"/>
+      </w:pPr>
+      <w:r>
+        <w:rPr>
+          <w:rFonts w:ascii="TH Sarabun New" w:eastAsia="TH Sarabun New" w:hAnsi="TH Sarabun New" w:cs="TH Sarabun New"/>
+          <w:sz w:val="28"/>
+          <w:color w:val="1F2937"/>
+        </w:rPr>
+        <w:t>การแปลผลเชิงวิจัย: ข้อมูลจำลองนี้แสดงแนวโน้มเชิงบวกและใช้เป็นตัวอย่างการเขียนผลในบทที่ 4–5 ได้ โดยยังไม่ถือเป็นหลักฐานผลการวิจัยจริงจนกว่าจะดึงข้อมูลจริงจากระบบหลังครบช่วง Posttest</w:t>
+      </w:r>
+    </w:p>
     <w:p>
       <w:pPr>
         <w:spacing w:after="0"/>

</xml_diff>

<commit_message>
docs(research): align plan A schedule with school days
Co-authored-by: Codex <codex@openai.com>
</commit_message>
<xml_diff>
--- a/public/docs/classroom-research/p4-multiply-race-research-plan-a.docx
+++ b/public/docs/classroom-research/p4-multiply-race-research-plan-a.docx
@@ -61,7 +61,7 @@
         <w:rPr>
           <w:rFonts w:cs="TH Sarabun New"/>
         </w:rPr>
-        <w:t>การพัฒนาทักษะสูตรคูณด้วยเกมแข่งสูตรคูณ (แผนการวิจัย 7 วันต่อช่วง)</w:t>
+        <w:t>การพัฒนาทักษะสูตรคูณด้วยเกมแข่งสูตรคูณ (แผนการวิจัย 7 วันเรียนต่อช่วง)</w:t>
       </w:r>
     </w:p>
     <w:p>
@@ -287,7 +287,7 @@
                 <w:rFonts w:cs="TH Sarabun New"/>
                 <w:sz w:val="28"/>
               </w:rPr>
-              <w:t>การพัฒนาทักษะสูตรคูณด้วยเกมแข่งสูตรคูณ (แผนการวิจัย 7 วันต่อช่วง)</w:t>
+              <w:t>การพัฒนาทักษะสูตรคูณด้วยเกมแข่งสูตรคูณ (แผนการวิจัย 7 วันเรียนต่อช่วง)</w:t>
             </w:r>
           </w:p>
         </w:tc>
@@ -476,7 +476,22 @@
                 <w:rFonts w:cs="TH Sarabun New"/>
                 <w:sz w:val="30"/>
               </w:rPr>
-              <w:t>ก่อนเรียน 20–26 มิถุนายน 2569; หลังเรียน 27 มิถุนายน–3 กรกฎาคม 2569</w:t>
+              <w:t>ก่อนเรียน 22–26 และ 29–30 มิถุนายน 2569; หลังเรียน 1–3 และ 6–9 กรกฎาคม 2569</w:t>
+            </w:r>
+          </w:p>
+          <w:p>
+            <w:pPr>
+              <w:spacing w:after="100"/>
+              <w:ind w:firstLine="504"/>
+              <w:jc w:val="both"/>
+            </w:pPr>
+            <w:r>
+              <w:rPr>
+                <w:rFonts w:ascii="TH Sarabun New" w:eastAsia="TH Sarabun New" w:hAnsi="TH Sarabun New" w:cs="TH Sarabun New"/>
+                <w:sz w:val="26"/>
+                <w:color w:val="7A4B00"/>
+              </w:rPr>
+              <w:t>หมายเหตุตารางกำหนดการ: นับเฉพาะวันเรียนจันทร์–ศุกร์ จึงข้ามวันเสาร์–อาทิตย์ เพื่อให้สอดคล้องกับการจัดกิจกรรมในโรงเรียน</w:t>
             </w:r>
           </w:p>
         </w:tc>
@@ -1233,7 +1248,22 @@
         <w:rPr>
           <w:rFonts w:cs="TH Sarabun New"/>
         </w:rPr>
-        <w:t>แผนวิจัยนี้มุ่งแก้ปัญหาความคล่องในการคำนวณสูตรคูณของนักเรียนชั้น ประถมศึกษาปีที่ 4 โดยใช้เกมการศึกษา “แข่งสูตรคูณ” ในระบบ Kampai School เป็นกิจกรรมฝึกซ้ำและให้ผลย้อนกลับทันที ใช้รูปแบบ One-Group Pretest–Posttest Design เก็บคะแนนก่อนเรียนระหว่าง 20–26 มิถุนายน 2569 และหลังเรียนระหว่าง 27 มิถุนายน–3 กรกฎาคม 2569</w:t>
+        <w:t>แผนวิจัยนี้มุ่งแก้ปัญหาความคล่องในการคำนวณสูตรคูณของนักเรียนชั้น ประถมศึกษาปีที่ 4 โดยใช้เกมการศึกษา “แข่งสูตรคูณ” ในระบบ Kampai School เป็นกิจกรรมฝึกซ้ำและให้ผลย้อนกลับทันที ใช้รูปแบบ One-Group Pretest–Posttest Design เก็บคะแนนก่อนเรียนระหว่าง 22–26 และ 29–30 มิถุนายน 2569 และหลังเรียนระหว่าง 1–3 และ 6–9 กรกฎาคม 2569</w:t>
+      </w:r>
+    </w:p>
+    <w:p>
+      <w:pPr>
+        <w:spacing w:after="100"/>
+        <w:ind w:firstLine="504"/>
+        <w:jc w:val="both"/>
+      </w:pPr>
+      <w:r>
+        <w:rPr>
+          <w:rFonts w:ascii="TH Sarabun New" w:eastAsia="TH Sarabun New" w:hAnsi="TH Sarabun New" w:cs="TH Sarabun New"/>
+          <w:sz w:val="26"/>
+          <w:color w:val="7A4B00"/>
+        </w:rPr>
+        <w:t>หมายเหตุตารางกำหนดการ: นับเฉพาะวันเรียนจันทร์–ศุกร์ จึงข้ามวันเสาร์–อาทิตย์ เพื่อให้สอดคล้องกับการจัดกิจกรรมในโรงเรียน</w:t>
       </w:r>
     </w:p>
     <w:tbl>
@@ -1545,7 +1575,22 @@
                 <w:rFonts w:cs="TH Sarabun New"/>
                 <w:sz w:val="28"/>
               </w:rPr>
-              <w:t>วันต่อช่วง รวม 14 วัน: ก่อนเรียน 20–26 มิถุนายน 2569 และหลังเรียน 27 มิถุนายน–3 กรกฎาคม 2569</w:t>
+              <w:t>วันเรียนต่อช่วง รวม 14 วันเรียน: ก่อนเรียน 22–26 และ 29–30 มิถุนายน 2569 และหลังเรียน 1–3 และ 6–9 กรกฎาคม 2569</w:t>
+            </w:r>
+          </w:p>
+          <w:p>
+            <w:pPr>
+              <w:spacing w:after="100"/>
+              <w:ind w:firstLine="504"/>
+              <w:jc w:val="both"/>
+            </w:pPr>
+            <w:r>
+              <w:rPr>
+                <w:rFonts w:ascii="TH Sarabun New" w:eastAsia="TH Sarabun New" w:hAnsi="TH Sarabun New" w:cs="TH Sarabun New"/>
+                <w:sz w:val="26"/>
+                <w:color w:val="7A4B00"/>
+              </w:rPr>
+              <w:t>หมายเหตุตารางกำหนดการ: นับเฉพาะวันเรียนจันทร์–ศุกร์ จึงข้ามวันเสาร์–อาทิตย์ เพื่อให้สอดคล้องกับการจัดกิจกรรมในโรงเรียน</w:t>
             </w:r>
           </w:p>
         </w:tc>
@@ -1741,7 +1786,7 @@
           <w:sz w:val="28"/>
           <w:color w:val="1F2937"/>
         </w:rPr>
-        <w:t>ชุดข้อมูลจำลองกำหนดให้นักเรียนชั้นประถมศึกษาปีที่ 4 จำนวน 8 คน เล่นเกมแข่งสูตรคูณช่วงก่อนเรียน 7 วัน และหลังเรียน 7 วัน วันละ 1 รอบ คะแนนในตารางเป็นคะแนนเฉลี่ยรายช่วงของผู้เรียนแต่ละคน</w:t>
+        <w:t>ชุดข้อมูลจำลองกำหนดให้นักเรียนชั้นประถมศึกษาปีที่ 4 จำนวน 8 คน เล่นเกมแข่งสูตรคูณช่วงก่อนเรียน 7 วันเรียน และหลังเรียน 7 วันเรียน วันละ 1 รอบ คะแนนในตารางเป็นคะแนนเฉลี่ยรายช่วงของผู้เรียนแต่ละคน</w:t>
       </w:r>
     </w:p>
     <w:tbl>
@@ -5404,7 +5449,22 @@
                 <w:rFonts w:cs="TH Sarabun New"/>
                 <w:sz w:val="28"/>
               </w:rPr>
-              <w:t>ก่อนเรียน 20–26 มิถุนายน 2569; หลังเรียน 27 มิถุนายน–3 กรกฎาคม 2569</w:t>
+              <w:t>ก่อนเรียน 22–26 และ 29–30 มิถุนายน 2569; หลังเรียน 1–3 และ 6–9 กรกฎาคม 2569</w:t>
+            </w:r>
+          </w:p>
+          <w:p>
+            <w:pPr>
+              <w:spacing w:after="100"/>
+              <w:ind w:firstLine="504"/>
+              <w:jc w:val="both"/>
+            </w:pPr>
+            <w:r>
+              <w:rPr>
+                <w:rFonts w:ascii="TH Sarabun New" w:eastAsia="TH Sarabun New" w:hAnsi="TH Sarabun New" w:cs="TH Sarabun New"/>
+                <w:sz w:val="26"/>
+                <w:color w:val="7A4B00"/>
+              </w:rPr>
+              <w:t>หมายเหตุตารางกำหนดการ: นับเฉพาะวันเรียนจันทร์–ศุกร์ จึงข้ามวันเสาร์–อาทิตย์ เพื่อให้สอดคล้องกับการจัดกิจกรรมในโรงเรียน</w:t>
             </w:r>
           </w:p>
         </w:tc>
@@ -6191,7 +6251,7 @@
                 <w:rFonts w:cs="TH Sarabun New"/>
                 <w:sz w:val="26"/>
               </w:rPr>
-              <w:t>เก็บก่อน 7 วัน → จัดกิจกรรม/ให้ผลย้อนกลับ → เก็บหลัง 7 วัน</w:t>
+              <w:t>เก็บก่อน 7 วันเรียน → จัดกิจกรรม/ให้ผลย้อนกลับ → เก็บหลัง 7 วันเรียน</w:t>
             </w:r>
           </w:p>
         </w:tc>
@@ -6402,7 +6462,7 @@
         <w:rPr>
           <w:rFonts w:cs="TH Sarabun New"/>
         </w:rPr>
-        <w:t>ภารกิจวัดคะแนนรูปแบบเดียวกัน วันละ 1 รอบต่อคน ต่อเนื่อง 7 วันในแต่ละช่วง</w:t>
+        <w:t>ภารกิจวัดคะแนนรูปแบบเดียวกัน วันละ 1 รอบต่อคน ต่อเนื่อง 7 วันเรียนในแต่ละช่วง</w:t>
       </w:r>
     </w:p>
     <w:p>
@@ -6687,14 +6747,14 @@
                 <w:rFonts w:cs="TH Sarabun New"/>
                 <w:sz w:val="26"/>
               </w:rPr>
-              <w:t xml:space="preserve">20–26 </w:t>
+              <w:t xml:space="preserve">22–26 และ 29–30 </w:t>
             </w:r>
             <w:r>
               <w:rPr>
                 <w:rFonts w:cs="TH Sarabun New"/>
                 <w:sz w:val="26"/>
               </w:rPr>
-              <w:t>มิ.ย. 2569 (7 วัน)</w:t>
+              <w:t>มิ.ย. 2569 (7 วันเรียน)</w:t>
             </w:r>
           </w:p>
         </w:tc>
@@ -6746,7 +6806,7 @@
                 <w:rFonts w:cs="TH Sarabun New"/>
                 <w:sz w:val="26"/>
               </w:rPr>
-              <w:t>ระเบียน: 8 คน × 7 วัน</w:t>
+              <w:t>ระเบียน: 8 คน × 7 วันเรียน</w:t>
             </w:r>
           </w:p>
         </w:tc>
@@ -6843,21 +6903,21 @@
                 <w:rFonts w:cs="TH Sarabun New"/>
                 <w:sz w:val="26"/>
               </w:rPr>
-              <w:t xml:space="preserve">27 </w:t>
+              <w:t>1–3 และ 6–9 ก.ค. 2569 (7 วันเรียน)</w:t>
             </w:r>
             <w:r>
               <w:rPr>
                 <w:rFonts w:cs="TH Sarabun New"/>
                 <w:sz w:val="26"/>
               </w:rPr>
-              <w:t xml:space="preserve">มิ.ย.–3 ก.ค. 2569 (7 </w:t>
+              <w:t/>
             </w:r>
             <w:r>
               <w:rPr>
                 <w:rFonts w:cs="TH Sarabun New"/>
                 <w:sz w:val="26"/>
               </w:rPr>
-              <w:t>วัน)</w:t>
+              <w:t/>
             </w:r>
           </w:p>
         </w:tc>
@@ -6909,7 +6969,7 @@
                 <w:rFonts w:cs="TH Sarabun New"/>
                 <w:sz w:val="26"/>
               </w:rPr>
-              <w:t>ระเบียน: 8 คน × 7 วัน</w:t>
+              <w:t>ระเบียน: 8 คน × 7 วันเรียน</w:t>
             </w:r>
           </w:p>
         </w:tc>
@@ -6935,7 +6995,7 @@
                 <w:rFonts w:cs="TH Sarabun New"/>
                 <w:sz w:val="26"/>
               </w:rPr>
-              <w:t>หลัง 3 ก.ค. 2569</w:t>
+              <w:t>หลัง 9 ก.ค. 2569</w:t>
             </w:r>
           </w:p>
         </w:tc>
@@ -7062,7 +7122,7 @@
         <w:rPr>
           <w:rFonts w:cs="TH Sarabun New"/>
         </w:rPr>
-        <w:t>กำหนดช่วงก่อนเรียนและหลังเรียนช่วงละ 7 วัน ควบคุมวันละ 1 รอบต่อคน รวมคนละ 14 รอบ</w:t>
+        <w:t>กำหนดช่วงก่อนเรียนและหลังเรียนช่วงละ 7 วันเรียน ควบคุมวันละ 1 รอบต่อคน รวมคนละ 14 รอบ</w:t>
       </w:r>
     </w:p>
     <w:p>
@@ -7765,7 +7825,7 @@
                 <w:rFonts w:cs="TH Sarabun New"/>
                 <w:sz w:val="24"/>
               </w:rPr>
-              <w:t>ครบ 14 วัน รวม 112 ระเบียน</w:t>
+              <w:t>ครบ 14 วันเรียน รวม 112 ระเบียน</w:t>
             </w:r>
           </w:p>
         </w:tc>
@@ -9975,7 +10035,7 @@
         <w:rPr>
           <w:rFonts w:cs="TH Sarabun New"/>
         </w:rPr>
-        <w:t>ด้วย นายณัฐพงศ์ สิงห์ชมภู มีความประสงค์ดำเนินการวิจัยในชั้นเรียนเรื่อง “การพัฒนาทักษะสูตรคูณด้วยเกมแข่งสูตรคูณ (แผนการวิจัย 7 วันต่อช่วง)” เพื่อพัฒนาการเรียนรู้สูตรคูณของนักเรียน โดยเก็บคะแนนก่อนเรียน 7 วันและหลังเรียน 7 วัน วันละ 1 รอบต่อคน ระหว่าง 20 มิถุนายน–3 กรกฎาคม 2569 ผ่านเกมการศึกษาในระบบ Kampai School</w:t>
+        <w:t>ด้วย นายณัฐพงศ์ สิงห์ชมภู มีความประสงค์ดำเนินการวิจัยในชั้นเรียนเรื่อง “การพัฒนาทักษะสูตรคูณด้วยเกมแข่งสูตรคูณ (แผนการวิจัย 7 วันเรียนต่อช่วง)” เพื่อพัฒนาการเรียนรู้สูตรคูณของนักเรียน โดยเก็บคะแนนก่อนเรียน 7 วันเรียนและหลังเรียน 7 วันเรียน วันละ 1 รอบต่อคน ระหว่าง 20 มิถุนายน–3 กรกฎาคม 2569 ผ่านเกมการศึกษาในระบบ Kampai School</w:t>
       </w:r>
     </w:p>
     <w:p>
@@ -10844,7 +10904,7 @@
                 <w:rFonts w:cs="TH Sarabun New"/>
                 <w:sz w:val="22"/>
               </w:rPr>
-              <w:t>วัน, วันละ 1 รอบ/คน</w:t>
+              <w:t>วันเรียน, วันละ 1 รอบ/คน</w:t>
             </w:r>
           </w:p>
         </w:tc>
@@ -10868,7 +10928,7 @@
                 <w:rFonts w:cs="TH Sarabun New"/>
                 <w:sz w:val="22"/>
               </w:rPr>
-              <w:t xml:space="preserve">20–26 </w:t>
+              <w:t xml:space="preserve">22–26 และ 29–30 </w:t>
             </w:r>
             <w:r>
               <w:rPr>
@@ -10953,7 +11013,7 @@
                 <w:rFonts w:cs="TH Sarabun New"/>
                 <w:sz w:val="22"/>
               </w:rPr>
-              <w:t>วัน, วันละ 1 รอบ/คน</w:t>
+              <w:t>วันเรียน, วันละ 1 รอบ/คน</w:t>
             </w:r>
           </w:p>
         </w:tc>
@@ -10977,14 +11037,7 @@
                 <w:rFonts w:cs="TH Sarabun New"/>
                 <w:sz w:val="22"/>
               </w:rPr>
-              <w:t xml:space="preserve">27 </w:t>
-            </w:r>
-            <w:r>
-              <w:rPr>
-                <w:rFonts w:cs="TH Sarabun New"/>
-                <w:sz w:val="22"/>
-              </w:rPr>
-              <w:t>มิ.ย.–3 ก.ค. 2569; 56 ระเบียน</w:t>
+              <w:t>1–3 และ 6–9 ก.ค. 2569; 56 ระเบียน</w:t>
             </w:r>
           </w:p>
         </w:tc>
@@ -11437,7 +11490,7 @@
         <w:rPr>
           <w:rFonts w:cs="TH Sarabun New"/>
         </w:rPr>
-        <w:t>ข้อมูลจริงไม่สอดคล้องกับร่างเดิมในเรื่องจำนวนผู้เข้าร่วม (ร่างเดิม 14 คน) และความชัดเจนของคำว่า “7 วัน” จึงปรับเป็นผู้เข้าร่วม 8 คน และเก็บ 7 วันต่อช่วง รวม 14 วัน ส่วนจำนวนรอบจริงสอดคล้องกันทุกวัน คือวันละ 1 รอบต่อคน ข้อมูลครบถ้วน 100%</w:t>
+        <w:t>ข้อมูลจริงไม่สอดคล้องกับร่างเดิมในเรื่องจำนวนผู้เข้าร่วม (ร่างเดิม 14 คน) และความชัดเจนของคำว่า “7 วัน” จึงปรับเป็นผู้เข้าร่วม 8 คน และเก็บ 7 วันเรียนต่อช่วง รวม 14 วันเรียน ส่วนจำนวนรอบจริงสอดคล้องกันทุกวัน คือวันละ 1 รอบต่อคน ข้อมูลครบถ้วน 100%</w:t>
       </w:r>
     </w:p>
     <w:p>
@@ -11525,7 +11578,7 @@
         <w:rPr>
           <w:rFonts w:cs="TH Sarabun New"/>
         </w:rPr>
-        <w:t>การพัฒนาทักษะสูตรคูณด้วยเกมแข่งสูตรคูณ (แผนการวิจัย 7 วันต่อช่วง)” จำนวน 1 ชุด</w:t>
+        <w:t>การพัฒนาทักษะสูตรคูณด้วยเกมแข่งสูตรคูณ (แผนการวิจัย 7 วันเรียนต่อช่วง)” จำนวน 1 ชุด</w:t>
       </w:r>
     </w:p>
     <w:p>
@@ -11538,7 +11591,22 @@
         <w:rPr>
           <w:rFonts w:cs="TH Sarabun New"/>
         </w:rPr>
-        <w:t>ข้าพเจ้า นายณัฐพงศ์ สิงห์ชมภู ตำแหน่ง ครูผู้ช่วย มีความประสงค์ขออนุญาตดำเนินการวิจัยในชั้นเรียนกับนักเรียนชั้น ประถมศึกษาปีที่ 4 จำนวน 8 คน เพื่อพัฒนาทักษะสูตรคูณ โดยใช้เกม แข่งสูตรคูณ ในระบบ Kampai School ระหว่าง 20–26 มิถุนายน 2569 และ 27 มิถุนายน–3 กรกฎาคม 2569</w:t>
+        <w:t>ข้าพเจ้า นายณัฐพงศ์ สิงห์ชมภู ตำแหน่ง ครูผู้ช่วย มีความประสงค์ขออนุญาตดำเนินการวิจัยในชั้นเรียนกับนักเรียนชั้น ประถมศึกษาปีที่ 4 จำนวน 8 คน เพื่อพัฒนาทักษะสูตรคูณ โดยใช้เกม แข่งสูตรคูณ ในระบบ Kampai School ระหว่าง 22–26 และ 29–30 มิถุนายน 2569 และ 1–3 และ 6–9 กรกฎาคม 2569</w:t>
+      </w:r>
+    </w:p>
+    <w:p>
+      <w:pPr>
+        <w:spacing w:after="100"/>
+        <w:ind w:firstLine="504"/>
+        <w:jc w:val="both"/>
+      </w:pPr>
+      <w:r>
+        <w:rPr>
+          <w:rFonts w:ascii="TH Sarabun New" w:eastAsia="TH Sarabun New" w:hAnsi="TH Sarabun New" w:cs="TH Sarabun New"/>
+          <w:sz w:val="26"/>
+          <w:color w:val="7A4B00"/>
+        </w:rPr>
+        <w:t>หมายเหตุตารางกำหนดการ: นับเฉพาะวันเรียนจันทร์–ศุกร์ จึงข้ามวันเสาร์–อาทิตย์ เพื่อให้สอดคล้องกับการจัดกิจกรรมในโรงเรียน</w:t>
       </w:r>
     </w:p>
     <w:p>
@@ -11658,7 +11726,7 @@
         <w:rPr>
           <w:rFonts w:cs="TH Sarabun New"/>
         </w:rPr>
-        <w:t>การพัฒนาทักษะสูตรคูณด้วยเกมแข่งสูตรคูณ (แผนการวิจัย 7 วันต่อช่วง)</w:t>
+        <w:t>การพัฒนาทักษะสูตรคูณด้วยเกมแข่งสูตรคูณ (แผนการวิจัย 7 วันเรียนต่อช่วง)</w:t>
       </w:r>
     </w:p>
     <w:p>
@@ -12093,7 +12161,7 @@
         <w:rPr>
           <w:rFonts w:cs="TH Sarabun New"/>
         </w:rPr>
-        <w:t>เสนอขออนุญาตดำเนินการวิจัยในชั้นเรียนเรื่อง “การพัฒนาทักษะสูตรคูณด้วยเกมแข่งสูตรคูณ (แผนการวิจัย 7 วันต่อช่วง)” นั้น ได้พิจารณาแผนการวิจัย เครื่องมือ ระยะเวลา และแนวทางคุ้มครองข้อมูลผู้เรียนแล้ว</w:t>
+        <w:t>เสนอขออนุญาตดำเนินการวิจัยในชั้นเรียนเรื่อง “การพัฒนาทักษะสูตรคูณด้วยเกมแข่งสูตรคูณ (แผนการวิจัย 7 วันเรียนต่อช่วง)” นั้น ได้พิจารณาแผนการวิจัย เครื่องมือ ระยะเวลา และแนวทางคุ้มครองข้อมูลผู้เรียนแล้ว</w:t>
       </w:r>
     </w:p>
     <w:p>

</xml_diff>

<commit_message>
docs(research): add page numbers to plan A booklet
Co-authored-by: Codex <codex@openai.com>
</commit_message>
<xml_diff>
--- a/public/docs/classroom-research/p4-multiply-race-research-plan-a.docx
+++ b/public/docs/classroom-research/p4-multiply-race-research-plan-a.docx
@@ -13760,6 +13760,8 @@
     <w:sectPr>
       <w:headerReference w:type="default" r:id="rId8"/>
       <w:footerReference w:type="default" r:id="rId9"/>
+      <w:footerReference w:type="first" r:id="rId9"/>
+      <w:footerReference w:type="even" r:id="rId9"/>
       <w:pgSz w:w="11909" w:h="16834"/>
       <w:pgMar w:top="1080" w:right="1224" w:bottom="1080" w:left="1224" w:header="504" w:footer="504" w:gutter="0"/>
       <w:cols w:space="720"/>
@@ -13807,7 +13809,7 @@
         <w:color w:val="666666"/>
         <w:sz w:val="22"/>
       </w:rPr>
-      <w:t xml:space="preserve">โรงเรียนบ้านคำไผ่  |  </w:t>
+      <w:t xml:space="preserve">โรงเรียนบ้านคำไผ่  |  หน้า </w:t>
     </w:r>
     <w:r>
       <w:fldChar w:fldCharType="begin"/>

</xml_diff>

<commit_message>
docs(research): add chapter 5 dummy summary
Co-authored-by: Codex <codex@openai.com>
</commit_message>
<xml_diff>
--- a/public/docs/classroom-research/p4-multiply-race-research-plan-a.docx
+++ b/public/docs/classroom-research/p4-multiply-race-research-plan-a.docx
@@ -9237,6 +9237,268 @@
       <w:pPr>
         <w:pStyle w:val="1"/>
         <w:spacing w:before="280" w:after="160"/>
+        <w:p>
+          <w:r>
+            <w:br w:type="page"/>
+          </w:r>
+        </w:p>
+        <w:p>
+          <w:pPr>
+            <w:pStyle w:val="1"/>
+            <w:spacing w:before="220" w:after="120"/>
+            <w:jc w:val="center"/>
+          </w:pPr>
+          <w:r>
+            <w:rPr>
+              <w:rFonts w:ascii="TH Sarabun New" w:eastAsia="TH Sarabun New" w:hAnsi="TH Sarabun New" w:cs="TH Sarabun New"/>
+              <w:b/>
+              <w:color w:val="17365D"/>
+              <w:sz w:val="34"/>
+            </w:rPr>
+            <w:t>บทที่ 5 สรุปผล อภิปรายผล และข้อเสนอแนะ</w:t>
+          </w:r>
+        </w:p>
+        <w:p>
+          <w:pPr>
+            <w:spacing w:after="100"/>
+            <w:ind w:firstLine="504"/>
+            <w:jc w:val="both"/>
+          </w:pPr>
+          <w:r>
+            <w:rPr>
+              <w:rFonts w:ascii="TH Sarabun New" w:eastAsia="TH Sarabun New" w:hAnsi="TH Sarabun New" w:cs="TH Sarabun New"/>
+              <w:sz w:val="30"/>
+              <w:color w:val="7A4B00"/>
+            </w:rPr>
+            <w:t>หมายเหตุ: บทที่ 5 นี้จัดทำจากข้อมูลดัมมี่ประกอบเล่ม เพื่อใช้เป็นตัวอย่างการสรุปผลและตรวจรูปแบบเอกสารเท่านั้น ก่อนส่งรายงานจริงให้แทนที่ตัวเลข ชื่อนักเรียน และข้อค้นพบด้วยข้อมูลจริงจากระบบ /teacher/game-research</w:t>
+          </w:r>
+        </w:p>
+        <w:p>
+          <w:pPr>
+            <w:pStyle w:val="21"/>
+            <w:spacing w:before="120" w:after="80"/>
+          </w:pPr>
+          <w:r>
+            <w:rPr>
+              <w:rFonts w:ascii="TH Sarabun New" w:eastAsia="TH Sarabun New" w:hAnsi="TH Sarabun New" w:cs="TH Sarabun New"/>
+              <w:b/>
+              <w:color w:val="17365D"/>
+              <w:sz w:val="30"/>
+            </w:rPr>
+            <w:t>5.1 สรุปผลการวิจัย</w:t>
+          </w:r>
+        </w:p>
+        <w:p>
+          <w:pPr>
+            <w:spacing w:after="100"/>
+            <w:ind w:firstLine="504"/>
+            <w:jc w:val="both"/>
+          </w:pPr>
+          <w:r>
+            <w:rPr>
+              <w:rFonts w:ascii="TH Sarabun New" w:eastAsia="TH Sarabun New" w:hAnsi="TH Sarabun New" w:cs="TH Sarabun New"/>
+              <w:sz w:val="30"/>
+              <w:color w:val="000000"/>
+            </w:rPr>
+            <w:t>จากข้อมูลดัมมี่ประกอบเล่ม นักเรียนชั้นประถมศึกษาปีที่ 4 จำนวน 8 คน เล่นเกมแข่งสูตรคูณในช่วงก่อนเรียน 7 วันเรียน และช่วงหลังเรียน 7 วันเรียน วันละ 1 รอบ รวมคนละ 14 รอบ พบว่าคะแนนเฉลี่ยก่อนเรียนเท่ากับ 278.7 คะแนน และคะแนนเฉลี่ยหลังเรียนเท่ากับ 396.0 คะแนน</w:t>
+          </w:r>
+        </w:p>
+        <w:p>
+          <w:pPr>
+            <w:spacing w:after="100"/>
+            <w:ind w:firstLine="504"/>
+            <w:jc w:val="both"/>
+          </w:pPr>
+          <w:r>
+            <w:rPr>
+              <w:rFonts w:ascii="TH Sarabun New" w:eastAsia="TH Sarabun New" w:hAnsi="TH Sarabun New" w:cs="TH Sarabun New"/>
+              <w:sz w:val="30"/>
+              <w:color w:val="000000"/>
+            </w:rPr>
+            <w:t>ผลต่างเฉลี่ยระหว่างคะแนนหลังเรียนและก่อนเรียนเท่ากับ +117.3 คะแนน นักเรียน 8 คนจาก 8 คน หรือร้อยละ 100 มีคะแนนหลังเรียนสูงกว่าก่อนเรียน แสดงแนวโน้มว่าผู้เรียนมีความคล่องในการคำนวณสูตรคูณเพิ่มขึ้นหลังได้รับกิจกรรมฝึกผ่านเกม</w:t>
+          </w:r>
+        </w:p>
+        <w:p>
+          <w:pPr>
+            <w:spacing w:after="100"/>
+            <w:ind w:firstLine="504"/>
+            <w:jc w:val="both"/>
+          </w:pPr>
+          <w:r>
+            <w:rPr>
+              <w:rFonts w:ascii="TH Sarabun New" w:eastAsia="TH Sarabun New" w:hAnsi="TH Sarabun New" w:cs="TH Sarabun New"/>
+              <w:sz w:val="30"/>
+              <w:color w:val="000000"/>
+            </w:rPr>
+            <w:t>เมื่อพิจารณารายบุคคล พบว่านักเรียนทุกคนมีผลต่างเป็นบวก โดยผลต่างอยู่ระหว่าง +80.7 ถึง +138.0 คะแนน ผู้เรียนที่มีผลต่างเพิ่มขึ้นสูงสุดคือ ด.ญ.สรารัตน์ มฤกุล (+138.0 คะแนน) ส่วนผู้เรียนที่มีคะแนนก่อนเรียนสูงอยู่แล้ว เช่น ด.ช.พีรวัส นิโม ยังคงมีคะแนนหลังเรียนเพิ่มขึ้น (+80.7 คะแนน) แสดงว่ากิจกรรมสามารถใช้ได้ทั้งกับผู้เรียนที่ต้องการพัฒนาเร่งด่วนและผู้เรียนที่มีพื้นฐานดี</w:t>
+          </w:r>
+        </w:p>
+        <w:p>
+          <w:pPr>
+            <w:pStyle w:val="21"/>
+            <w:spacing w:before="120" w:after="80"/>
+          </w:pPr>
+          <w:r>
+            <w:rPr>
+              <w:rFonts w:ascii="TH Sarabun New" w:eastAsia="TH Sarabun New" w:hAnsi="TH Sarabun New" w:cs="TH Sarabun New"/>
+              <w:b/>
+              <w:color w:val="17365D"/>
+              <w:sz w:val="30"/>
+            </w:rPr>
+            <w:t>5.2 อภิปรายผล</w:t>
+          </w:r>
+        </w:p>
+        <w:p>
+          <w:pPr>
+            <w:spacing w:after="100"/>
+            <w:ind w:firstLine="504"/>
+            <w:jc w:val="both"/>
+          </w:pPr>
+          <w:r>
+            <w:rPr>
+              <w:rFonts w:ascii="TH Sarabun New" w:eastAsia="TH Sarabun New" w:hAnsi="TH Sarabun New" w:cs="TH Sarabun New"/>
+              <w:sz w:val="30"/>
+              <w:color w:val="000000"/>
+            </w:rPr>
+            <w:t>ผลจากข้อมูลดัมมี่สอดคล้องกับสมมติฐานการวิจัยที่กำหนดไว้ว่า คะแนนเฉลี่ยหลังเรียนสูงกว่าคะแนนเฉลี่ยก่อนเรียน และนักเรียนไม่น้อยกว่าร้อยละ 70 มีคะแนนเพิ่มขึ้น ทั้งนี้แนวโน้มดังกล่าวอาจเกิดจากลักษณะของเกมที่ให้ผู้เรียนฝึกซ้ำในเงื่อนไขเดียวกัน มีคะแนนสะท้อนผลทันที และช่วยกระตุ้นให้ผู้เรียนตั้งใจตอบโจทย์สูตรคูณมากขึ้น</w:t>
+          </w:r>
+        </w:p>
+        <w:p>
+          <w:pPr>
+            <w:spacing w:after="100"/>
+            <w:ind w:firstLine="504"/>
+            <w:jc w:val="both"/>
+          </w:pPr>
+          <w:r>
+            <w:rPr>
+              <w:rFonts w:ascii="TH Sarabun New" w:eastAsia="TH Sarabun New" w:hAnsi="TH Sarabun New" w:cs="TH Sarabun New"/>
+              <w:sz w:val="30"/>
+              <w:color w:val="000000"/>
+            </w:rPr>
+            <w:t>การใช้ระบบ Kampai School ช่วยให้ครูเห็นข้อมูลรายบุคคลอย่างเป็นระบบ ทั้งคะแนนก่อนเรียน คะแนนหลังเรียน ผลต่าง และจำนวนรอบการเล่น จึงสามารถนำข้อมูลไปวางแผนสอนซ่อมเสริมได้ชัดเจนกว่าการสังเกตเพียงอย่างเดียว</w:t>
+          </w:r>
+        </w:p>
+        <w:p>
+          <w:pPr>
+            <w:spacing w:after="100"/>
+            <w:ind w:firstLine="504"/>
+            <w:jc w:val="both"/>
+          </w:pPr>
+          <w:r>
+            <w:rPr>
+              <w:rFonts w:ascii="TH Sarabun New" w:eastAsia="TH Sarabun New" w:hAnsi="TH Sarabun New" w:cs="TH Sarabun New"/>
+              <w:sz w:val="30"/>
+              <w:color w:val="000000"/>
+            </w:rPr>
+            <w:t>อย่างไรก็ตาม เนื่องจากข้อมูลในบทนี้เป็นข้อมูลดัมมี่ จึงยังไม่สามารถใช้เป็นหลักฐานผลการวิจัยจริงได้ การสรุปผลฉบับสมบูรณ์ต้องใช้ข้อมูลจริงหลังครบช่วง Posttest และควรตรวจความครบถ้วนของระเบียนรายวันก่อนวิเคราะห์</w:t>
+          </w:r>
+        </w:p>
+        <w:p>
+          <w:pPr>
+            <w:pStyle w:val="21"/>
+            <w:spacing w:before="120" w:after="80"/>
+          </w:pPr>
+          <w:r>
+            <w:rPr>
+              <w:rFonts w:ascii="TH Sarabun New" w:eastAsia="TH Sarabun New" w:hAnsi="TH Sarabun New" w:cs="TH Sarabun New"/>
+              <w:b/>
+              <w:color w:val="17365D"/>
+              <w:sz w:val="30"/>
+            </w:rPr>
+            <w:t>5.3 ข้อเสนอแนะ</w:t>
+          </w:r>
+        </w:p>
+        <w:p>
+          <w:pPr>
+            <w:spacing w:after="70"/>
+            <w:ind w:left="504" w:hanging="360"/>
+            <w:jc w:val="both"/>
+          </w:pPr>
+          <w:r>
+            <w:rPr>
+              <w:rFonts w:ascii="TH Sarabun New" w:eastAsia="TH Sarabun New" w:hAnsi="TH Sarabun New" w:cs="TH Sarabun New"/>
+              <w:sz w:val="30"/>
+            </w:rPr>
+            <w:t>1. ครูควรจัดกิจกรรมเล่นเกมในช่วงเวลาที่แน่นอน และควบคุมให้ผู้เรียนเล่นตามจำนวนรอบที่กำหนด เพื่อให้ข้อมูลก่อนเรียนและหลังเรียนเปรียบเทียบกันได้อย่างเป็นธรรม</w:t>
+          </w:r>
+        </w:p>
+        <w:p>
+          <w:pPr>
+            <w:spacing w:after="70"/>
+            <w:ind w:left="504" w:hanging="360"/>
+            <w:jc w:val="both"/>
+          </w:pPr>
+          <w:r>
+            <w:rPr>
+              <w:rFonts w:ascii="TH Sarabun New" w:eastAsia="TH Sarabun New" w:hAnsi="TH Sarabun New" w:cs="TH Sarabun New"/>
+              <w:sz w:val="30"/>
+            </w:rPr>
+            <w:t>2. หลังเก็บข้อมูลจริง ควรตรวจรายชื่อนักเรียน คะแนนรายวัน และจำนวนรอบการเล่นก่อนนำไปคำนวณค่าเฉลี่ย เพื่อป้องกันข้อมูลขาดหรือข้อมูลเกินจากการเล่นนอกช่วงวิจัย</w:t>
+          </w:r>
+        </w:p>
+        <w:p>
+          <w:pPr>
+            <w:spacing w:after="70"/>
+            <w:ind w:left="504" w:hanging="360"/>
+            <w:jc w:val="both"/>
+          </w:pPr>
+          <w:r>
+            <w:rPr>
+              <w:rFonts w:ascii="TH Sarabun New" w:eastAsia="TH Sarabun New" w:hAnsi="TH Sarabun New" w:cs="TH Sarabun New"/>
+              <w:sz w:val="30"/>
+            </w:rPr>
+            <w:t>3. ควรใช้ผลต่างรายบุคคลจัดกลุ่มสอนซ่อมเสริม โดยเน้นนักเรียนที่คะแนนหลังเรียนยังต่ำ หรือมีผลต่างเพิ่มขึ้นน้อยเมื่อเทียบกับเพื่อน</w:t>
+          </w:r>
+        </w:p>
+        <w:p>
+          <w:pPr>
+            <w:spacing w:after="70"/>
+            <w:ind w:left="504" w:hanging="360"/>
+            <w:jc w:val="both"/>
+          </w:pPr>
+          <w:r>
+            <w:rPr>
+              <w:rFonts w:ascii="TH Sarabun New" w:eastAsia="TH Sarabun New" w:hAnsi="TH Sarabun New" w:cs="TH Sarabun New"/>
+              <w:sz w:val="30"/>
+            </w:rPr>
+            <w:t>4. หากต้องการอ้างผลสัมฤทธิ์ทางคณิตศาสตร์ในเชิงหลักสูตร ควรใช้แบบทดสอบก่อนเรียนและหลังเรียนที่ผ่านการตรวจคุณภาพควบคู่กับคะแนนจากเกม</w:t>
+          </w:r>
+        </w:p>
+        <w:p>
+          <w:pPr>
+            <w:pStyle w:val="21"/>
+            <w:spacing w:before="120" w:after="80"/>
+          </w:pPr>
+          <w:r>
+            <w:rPr>
+              <w:rFonts w:ascii="TH Sarabun New" w:eastAsia="TH Sarabun New" w:hAnsi="TH Sarabun New" w:cs="TH Sarabun New"/>
+              <w:b/>
+              <w:color w:val="17365D"/>
+              <w:sz w:val="30"/>
+            </w:rPr>
+            <w:t>5.4 สรุปผลโดยย่อ</w:t>
+          </w:r>
+        </w:p>
+        <w:p>
+          <w:pPr>
+            <w:spacing w:after="100"/>
+            <w:ind w:firstLine="504"/>
+            <w:jc w:val="both"/>
+          </w:pPr>
+          <w:r>
+            <w:rPr>
+              <w:rFonts w:ascii="TH Sarabun New" w:eastAsia="TH Sarabun New" w:hAnsi="TH Sarabun New" w:cs="TH Sarabun New"/>
+              <w:sz w:val="30"/>
+              <w:color w:val="000000"/>
+            </w:rPr>
+            <w:t>โดยสรุป ข้อมูลดัมมี่ชุดนี้แสดงตัวอย่างผลการวิจัยในทิศทางบวก คือ คะแนนเฉลี่ยหลังเรียนสูงกว่าก่อนเรียน ผลต่างเฉลี่ย +117.3 คะแนน และนักเรียนร้อยละ 100 มีคะแนนเพิ่มขึ้น จึงสามารถใช้เป็นต้นแบบการเขียนบทที่ 5 ได้ เมื่อเก็บข้อมูลจริงครบแล้วให้แทนที่ข้อมูลดัมมี่ด้วยผลจริงและปรับอภิปรายผลให้สอดคล้องกับหลักฐานจริง</w:t>
+          </w:r>
+        </w:p>
+        <w:p>
+          <w:r>
+            <w:br w:type="page"/>
+          </w:r>
+        </w:p>
       </w:pPr>
       <w:r>
         <w:rPr>

</xml_diff>

<commit_message>
fix(research): repair plan A docx structure
Co-authored-by: Codex <codex@openai.com>
</commit_message>
<xml_diff>
--- a/public/docs/classroom-research/p4-multiply-race-research-plan-a.docx
+++ b/public/docs/classroom-research/p4-multiply-race-research-plan-a.docx
@@ -9234,271 +9234,271 @@
       </w:r>
     </w:p>
     <w:p>
+      <w:r>
+        <w:br w:type="page"/>
+      </w:r>
+    </w:p>
+    <w:p>
+      <w:pPr>
+        <w:pStyle w:val="1"/>
+        <w:spacing w:before="220" w:after="120"/>
+        <w:jc w:val="center"/>
+      </w:pPr>
+      <w:r>
+        <w:rPr>
+          <w:rFonts w:ascii="TH Sarabun New" w:eastAsia="TH Sarabun New" w:hAnsi="TH Sarabun New" w:cs="TH Sarabun New"/>
+          <w:b/>
+          <w:color w:val="17365D"/>
+          <w:sz w:val="34"/>
+        </w:rPr>
+        <w:t>บทที่ 5 สรุปผล อภิปรายผล และข้อเสนอแนะ</w:t>
+      </w:r>
+    </w:p>
+    <w:p>
+      <w:pPr>
+        <w:spacing w:after="100"/>
+        <w:ind w:firstLine="504"/>
+        <w:jc w:val="both"/>
+      </w:pPr>
+      <w:r>
+        <w:rPr>
+          <w:rFonts w:ascii="TH Sarabun New" w:eastAsia="TH Sarabun New" w:hAnsi="TH Sarabun New" w:cs="TH Sarabun New"/>
+          <w:sz w:val="30"/>
+          <w:color w:val="7A4B00"/>
+        </w:rPr>
+        <w:t>หมายเหตุ: บทที่ 5 นี้จัดทำจากข้อมูลดัมมี่ประกอบเล่ม เพื่อใช้เป็นตัวอย่างการสรุปผลและตรวจรูปแบบเอกสารเท่านั้น ก่อนส่งรายงานจริงให้แทนที่ตัวเลข ชื่อนักเรียน และข้อค้นพบด้วยข้อมูลจริงจากระบบ /teacher/game-research</w:t>
+      </w:r>
+    </w:p>
+    <w:p>
+      <w:pPr>
+        <w:pStyle w:val="21"/>
+        <w:spacing w:before="120" w:after="80"/>
+      </w:pPr>
+      <w:r>
+        <w:rPr>
+          <w:rFonts w:ascii="TH Sarabun New" w:eastAsia="TH Sarabun New" w:hAnsi="TH Sarabun New" w:cs="TH Sarabun New"/>
+          <w:b/>
+          <w:color w:val="17365D"/>
+          <w:sz w:val="30"/>
+        </w:rPr>
+        <w:t>5.1 สรุปผลการวิจัย</w:t>
+      </w:r>
+    </w:p>
+    <w:p>
+      <w:pPr>
+        <w:spacing w:after="100"/>
+        <w:ind w:firstLine="504"/>
+        <w:jc w:val="both"/>
+      </w:pPr>
+      <w:r>
+        <w:rPr>
+          <w:rFonts w:ascii="TH Sarabun New" w:eastAsia="TH Sarabun New" w:hAnsi="TH Sarabun New" w:cs="TH Sarabun New"/>
+          <w:sz w:val="30"/>
+          <w:color w:val="000000"/>
+        </w:rPr>
+        <w:t>จากข้อมูลดัมมี่ประกอบเล่ม นักเรียนชั้นประถมศึกษาปีที่ 4 จำนวน 8 คน เล่นเกมแข่งสูตรคูณในช่วงก่อนเรียน 7 วันเรียน และช่วงหลังเรียน 7 วันเรียน วันละ 1 รอบ รวมคนละ 14 รอบ พบว่าคะแนนเฉลี่ยก่อนเรียนเท่ากับ 278.7 คะแนน และคะแนนเฉลี่ยหลังเรียนเท่ากับ 396.0 คะแนน</w:t>
+      </w:r>
+    </w:p>
+    <w:p>
+      <w:pPr>
+        <w:spacing w:after="100"/>
+        <w:ind w:firstLine="504"/>
+        <w:jc w:val="both"/>
+      </w:pPr>
+      <w:r>
+        <w:rPr>
+          <w:rFonts w:ascii="TH Sarabun New" w:eastAsia="TH Sarabun New" w:hAnsi="TH Sarabun New" w:cs="TH Sarabun New"/>
+          <w:sz w:val="30"/>
+          <w:color w:val="000000"/>
+        </w:rPr>
+        <w:t>ผลต่างเฉลี่ยระหว่างคะแนนหลังเรียนและก่อนเรียนเท่ากับ +117.3 คะแนน นักเรียน 8 คนจาก 8 คน หรือร้อยละ 100 มีคะแนนหลังเรียนสูงกว่าก่อนเรียน แสดงแนวโน้มว่าผู้เรียนมีความคล่องในการคำนวณสูตรคูณเพิ่มขึ้นหลังได้รับกิจกรรมฝึกผ่านเกม</w:t>
+      </w:r>
+    </w:p>
+    <w:p>
+      <w:pPr>
+        <w:spacing w:after="100"/>
+        <w:ind w:firstLine="504"/>
+        <w:jc w:val="both"/>
+      </w:pPr>
+      <w:r>
+        <w:rPr>
+          <w:rFonts w:ascii="TH Sarabun New" w:eastAsia="TH Sarabun New" w:hAnsi="TH Sarabun New" w:cs="TH Sarabun New"/>
+          <w:sz w:val="30"/>
+          <w:color w:val="000000"/>
+        </w:rPr>
+        <w:t>เมื่อพิจารณารายบุคคล พบว่านักเรียนทุกคนมีผลต่างเป็นบวก โดยผลต่างอยู่ระหว่าง +80.7 ถึง +138.0 คะแนน ผู้เรียนที่มีผลต่างเพิ่มขึ้นสูงสุดคือ ด.ญ.สรารัตน์ มฤกุล (+138.0 คะแนน) ส่วนผู้เรียนที่มีคะแนนก่อนเรียนสูงอยู่แล้ว เช่น ด.ช.พีรวัส นิโม ยังคงมีคะแนนหลังเรียนเพิ่มขึ้น (+80.7 คะแนน) แสดงว่ากิจกรรมสามารถใช้ได้ทั้งกับผู้เรียนที่ต้องการพัฒนาเร่งด่วนและผู้เรียนที่มีพื้นฐานดี</w:t>
+      </w:r>
+    </w:p>
+    <w:p>
+      <w:pPr>
+        <w:pStyle w:val="21"/>
+        <w:spacing w:before="120" w:after="80"/>
+      </w:pPr>
+      <w:r>
+        <w:rPr>
+          <w:rFonts w:ascii="TH Sarabun New" w:eastAsia="TH Sarabun New" w:hAnsi="TH Sarabun New" w:cs="TH Sarabun New"/>
+          <w:b/>
+          <w:color w:val="17365D"/>
+          <w:sz w:val="30"/>
+        </w:rPr>
+        <w:t>5.2 อภิปรายผล</w:t>
+      </w:r>
+    </w:p>
+    <w:p>
+      <w:pPr>
+        <w:spacing w:after="100"/>
+        <w:ind w:firstLine="504"/>
+        <w:jc w:val="both"/>
+      </w:pPr>
+      <w:r>
+        <w:rPr>
+          <w:rFonts w:ascii="TH Sarabun New" w:eastAsia="TH Sarabun New" w:hAnsi="TH Sarabun New" w:cs="TH Sarabun New"/>
+          <w:sz w:val="30"/>
+          <w:color w:val="000000"/>
+        </w:rPr>
+        <w:t>ผลจากข้อมูลดัมมี่สอดคล้องกับสมมติฐานการวิจัยที่กำหนดไว้ว่า คะแนนเฉลี่ยหลังเรียนสูงกว่าคะแนนเฉลี่ยก่อนเรียน และนักเรียนไม่น้อยกว่าร้อยละ 70 มีคะแนนเพิ่มขึ้น ทั้งนี้แนวโน้มดังกล่าวอาจเกิดจากลักษณะของเกมที่ให้ผู้เรียนฝึกซ้ำในเงื่อนไขเดียวกัน มีคะแนนสะท้อนผลทันที และช่วยกระตุ้นให้ผู้เรียนตั้งใจตอบโจทย์สูตรคูณมากขึ้น</w:t>
+      </w:r>
+    </w:p>
+    <w:p>
+      <w:pPr>
+        <w:spacing w:after="100"/>
+        <w:ind w:firstLine="504"/>
+        <w:jc w:val="both"/>
+      </w:pPr>
+      <w:r>
+        <w:rPr>
+          <w:rFonts w:ascii="TH Sarabun New" w:eastAsia="TH Sarabun New" w:hAnsi="TH Sarabun New" w:cs="TH Sarabun New"/>
+          <w:sz w:val="30"/>
+          <w:color w:val="000000"/>
+        </w:rPr>
+        <w:t>การใช้ระบบ Kampai School ช่วยให้ครูเห็นข้อมูลรายบุคคลอย่างเป็นระบบ ทั้งคะแนนก่อนเรียน คะแนนหลังเรียน ผลต่าง และจำนวนรอบการเล่น จึงสามารถนำข้อมูลไปวางแผนสอนซ่อมเสริมได้ชัดเจนกว่าการสังเกตเพียงอย่างเดียว</w:t>
+      </w:r>
+    </w:p>
+    <w:p>
+      <w:pPr>
+        <w:spacing w:after="100"/>
+        <w:ind w:firstLine="504"/>
+        <w:jc w:val="both"/>
+      </w:pPr>
+      <w:r>
+        <w:rPr>
+          <w:rFonts w:ascii="TH Sarabun New" w:eastAsia="TH Sarabun New" w:hAnsi="TH Sarabun New" w:cs="TH Sarabun New"/>
+          <w:sz w:val="30"/>
+          <w:color w:val="000000"/>
+        </w:rPr>
+        <w:t>อย่างไรก็ตาม เนื่องจากข้อมูลในบทนี้เป็นข้อมูลดัมมี่ จึงยังไม่สามารถใช้เป็นหลักฐานผลการวิจัยจริงได้ การสรุปผลฉบับสมบูรณ์ต้องใช้ข้อมูลจริงหลังครบช่วง Posttest และควรตรวจความครบถ้วนของระเบียนรายวันก่อนวิเคราะห์</w:t>
+      </w:r>
+    </w:p>
+    <w:p>
+      <w:pPr>
+        <w:pStyle w:val="21"/>
+        <w:spacing w:before="120" w:after="80"/>
+      </w:pPr>
+      <w:r>
+        <w:rPr>
+          <w:rFonts w:ascii="TH Sarabun New" w:eastAsia="TH Sarabun New" w:hAnsi="TH Sarabun New" w:cs="TH Sarabun New"/>
+          <w:b/>
+          <w:color w:val="17365D"/>
+          <w:sz w:val="30"/>
+        </w:rPr>
+        <w:t>5.3 ข้อเสนอแนะ</w:t>
+      </w:r>
+    </w:p>
+    <w:p>
+      <w:pPr>
+        <w:spacing w:after="70"/>
+        <w:ind w:left="504" w:hanging="360"/>
+        <w:jc w:val="both"/>
+      </w:pPr>
+      <w:r>
+        <w:rPr>
+          <w:rFonts w:ascii="TH Sarabun New" w:eastAsia="TH Sarabun New" w:hAnsi="TH Sarabun New" w:cs="TH Sarabun New"/>
+          <w:sz w:val="30"/>
+        </w:rPr>
+        <w:t>1. ครูควรจัดกิจกรรมเล่นเกมในช่วงเวลาที่แน่นอน และควบคุมให้ผู้เรียนเล่นตามจำนวนรอบที่กำหนด เพื่อให้ข้อมูลก่อนเรียนและหลังเรียนเปรียบเทียบกันได้อย่างเป็นธรรม</w:t>
+      </w:r>
+    </w:p>
+    <w:p>
+      <w:pPr>
+        <w:spacing w:after="70"/>
+        <w:ind w:left="504" w:hanging="360"/>
+        <w:jc w:val="both"/>
+      </w:pPr>
+      <w:r>
+        <w:rPr>
+          <w:rFonts w:ascii="TH Sarabun New" w:eastAsia="TH Sarabun New" w:hAnsi="TH Sarabun New" w:cs="TH Sarabun New"/>
+          <w:sz w:val="30"/>
+        </w:rPr>
+        <w:t>2. หลังเก็บข้อมูลจริง ควรตรวจรายชื่อนักเรียน คะแนนรายวัน และจำนวนรอบการเล่นก่อนนำไปคำนวณค่าเฉลี่ย เพื่อป้องกันข้อมูลขาดหรือข้อมูลเกินจากการเล่นนอกช่วงวิจัย</w:t>
+      </w:r>
+    </w:p>
+    <w:p>
+      <w:pPr>
+        <w:spacing w:after="70"/>
+        <w:ind w:left="504" w:hanging="360"/>
+        <w:jc w:val="both"/>
+      </w:pPr>
+      <w:r>
+        <w:rPr>
+          <w:rFonts w:ascii="TH Sarabun New" w:eastAsia="TH Sarabun New" w:hAnsi="TH Sarabun New" w:cs="TH Sarabun New"/>
+          <w:sz w:val="30"/>
+        </w:rPr>
+        <w:t>3. ควรใช้ผลต่างรายบุคคลจัดกลุ่มสอนซ่อมเสริม โดยเน้นนักเรียนที่คะแนนหลังเรียนยังต่ำ หรือมีผลต่างเพิ่มขึ้นน้อยเมื่อเทียบกับเพื่อน</w:t>
+      </w:r>
+    </w:p>
+    <w:p>
+      <w:pPr>
+        <w:spacing w:after="70"/>
+        <w:ind w:left="504" w:hanging="360"/>
+        <w:jc w:val="both"/>
+      </w:pPr>
+      <w:r>
+        <w:rPr>
+          <w:rFonts w:ascii="TH Sarabun New" w:eastAsia="TH Sarabun New" w:hAnsi="TH Sarabun New" w:cs="TH Sarabun New"/>
+          <w:sz w:val="30"/>
+        </w:rPr>
+        <w:t>4. หากต้องการอ้างผลสัมฤทธิ์ทางคณิตศาสตร์ในเชิงหลักสูตร ควรใช้แบบทดสอบก่อนเรียนและหลังเรียนที่ผ่านการตรวจคุณภาพควบคู่กับคะแนนจากเกม</w:t>
+      </w:r>
+    </w:p>
+    <w:p>
+      <w:pPr>
+        <w:pStyle w:val="21"/>
+        <w:spacing w:before="120" w:after="80"/>
+      </w:pPr>
+      <w:r>
+        <w:rPr>
+          <w:rFonts w:ascii="TH Sarabun New" w:eastAsia="TH Sarabun New" w:hAnsi="TH Sarabun New" w:cs="TH Sarabun New"/>
+          <w:b/>
+          <w:color w:val="17365D"/>
+          <w:sz w:val="30"/>
+        </w:rPr>
+        <w:t>5.4 สรุปผลโดยย่อ</w:t>
+      </w:r>
+    </w:p>
+    <w:p>
+      <w:pPr>
+        <w:spacing w:after="100"/>
+        <w:ind w:firstLine="504"/>
+        <w:jc w:val="both"/>
+      </w:pPr>
+      <w:r>
+        <w:rPr>
+          <w:rFonts w:ascii="TH Sarabun New" w:eastAsia="TH Sarabun New" w:hAnsi="TH Sarabun New" w:cs="TH Sarabun New"/>
+          <w:sz w:val="30"/>
+          <w:color w:val="000000"/>
+        </w:rPr>
+        <w:t>โดยสรุป ข้อมูลดัมมี่ชุดนี้แสดงตัวอย่างผลการวิจัยในทิศทางบวก คือ คะแนนเฉลี่ยหลังเรียนสูงกว่าก่อนเรียน ผลต่างเฉลี่ย +117.3 คะแนน และนักเรียนร้อยละ 100 มีคะแนนเพิ่มขึ้น จึงสามารถใช้เป็นต้นแบบการเขียนบทที่ 5 ได้ เมื่อเก็บข้อมูลจริงครบแล้วให้แทนที่ข้อมูลดัมมี่ด้วยผลจริงและปรับอภิปรายผลให้สอดคล้องกับหลักฐานจริง</w:t>
+      </w:r>
+    </w:p>
+    <w:p>
+      <w:r>
+        <w:br w:type="page"/>
+      </w:r>
+    </w:p>
+    <w:p>
       <w:pPr>
         <w:pStyle w:val="1"/>
         <w:spacing w:before="280" w:after="160"/>
-        <w:p>
-          <w:r>
-            <w:br w:type="page"/>
-          </w:r>
-        </w:p>
-        <w:p>
-          <w:pPr>
-            <w:pStyle w:val="1"/>
-            <w:spacing w:before="220" w:after="120"/>
-            <w:jc w:val="center"/>
-          </w:pPr>
-          <w:r>
-            <w:rPr>
-              <w:rFonts w:ascii="TH Sarabun New" w:eastAsia="TH Sarabun New" w:hAnsi="TH Sarabun New" w:cs="TH Sarabun New"/>
-              <w:b/>
-              <w:color w:val="17365D"/>
-              <w:sz w:val="34"/>
-            </w:rPr>
-            <w:t>บทที่ 5 สรุปผล อภิปรายผล และข้อเสนอแนะ</w:t>
-          </w:r>
-        </w:p>
-        <w:p>
-          <w:pPr>
-            <w:spacing w:after="100"/>
-            <w:ind w:firstLine="504"/>
-            <w:jc w:val="both"/>
-          </w:pPr>
-          <w:r>
-            <w:rPr>
-              <w:rFonts w:ascii="TH Sarabun New" w:eastAsia="TH Sarabun New" w:hAnsi="TH Sarabun New" w:cs="TH Sarabun New"/>
-              <w:sz w:val="30"/>
-              <w:color w:val="7A4B00"/>
-            </w:rPr>
-            <w:t>หมายเหตุ: บทที่ 5 นี้จัดทำจากข้อมูลดัมมี่ประกอบเล่ม เพื่อใช้เป็นตัวอย่างการสรุปผลและตรวจรูปแบบเอกสารเท่านั้น ก่อนส่งรายงานจริงให้แทนที่ตัวเลข ชื่อนักเรียน และข้อค้นพบด้วยข้อมูลจริงจากระบบ /teacher/game-research</w:t>
-          </w:r>
-        </w:p>
-        <w:p>
-          <w:pPr>
-            <w:pStyle w:val="21"/>
-            <w:spacing w:before="120" w:after="80"/>
-          </w:pPr>
-          <w:r>
-            <w:rPr>
-              <w:rFonts w:ascii="TH Sarabun New" w:eastAsia="TH Sarabun New" w:hAnsi="TH Sarabun New" w:cs="TH Sarabun New"/>
-              <w:b/>
-              <w:color w:val="17365D"/>
-              <w:sz w:val="30"/>
-            </w:rPr>
-            <w:t>5.1 สรุปผลการวิจัย</w:t>
-          </w:r>
-        </w:p>
-        <w:p>
-          <w:pPr>
-            <w:spacing w:after="100"/>
-            <w:ind w:firstLine="504"/>
-            <w:jc w:val="both"/>
-          </w:pPr>
-          <w:r>
-            <w:rPr>
-              <w:rFonts w:ascii="TH Sarabun New" w:eastAsia="TH Sarabun New" w:hAnsi="TH Sarabun New" w:cs="TH Sarabun New"/>
-              <w:sz w:val="30"/>
-              <w:color w:val="000000"/>
-            </w:rPr>
-            <w:t>จากข้อมูลดัมมี่ประกอบเล่ม นักเรียนชั้นประถมศึกษาปีที่ 4 จำนวน 8 คน เล่นเกมแข่งสูตรคูณในช่วงก่อนเรียน 7 วันเรียน และช่วงหลังเรียน 7 วันเรียน วันละ 1 รอบ รวมคนละ 14 รอบ พบว่าคะแนนเฉลี่ยก่อนเรียนเท่ากับ 278.7 คะแนน และคะแนนเฉลี่ยหลังเรียนเท่ากับ 396.0 คะแนน</w:t>
-          </w:r>
-        </w:p>
-        <w:p>
-          <w:pPr>
-            <w:spacing w:after="100"/>
-            <w:ind w:firstLine="504"/>
-            <w:jc w:val="both"/>
-          </w:pPr>
-          <w:r>
-            <w:rPr>
-              <w:rFonts w:ascii="TH Sarabun New" w:eastAsia="TH Sarabun New" w:hAnsi="TH Sarabun New" w:cs="TH Sarabun New"/>
-              <w:sz w:val="30"/>
-              <w:color w:val="000000"/>
-            </w:rPr>
-            <w:t>ผลต่างเฉลี่ยระหว่างคะแนนหลังเรียนและก่อนเรียนเท่ากับ +117.3 คะแนน นักเรียน 8 คนจาก 8 คน หรือร้อยละ 100 มีคะแนนหลังเรียนสูงกว่าก่อนเรียน แสดงแนวโน้มว่าผู้เรียนมีความคล่องในการคำนวณสูตรคูณเพิ่มขึ้นหลังได้รับกิจกรรมฝึกผ่านเกม</w:t>
-          </w:r>
-        </w:p>
-        <w:p>
-          <w:pPr>
-            <w:spacing w:after="100"/>
-            <w:ind w:firstLine="504"/>
-            <w:jc w:val="both"/>
-          </w:pPr>
-          <w:r>
-            <w:rPr>
-              <w:rFonts w:ascii="TH Sarabun New" w:eastAsia="TH Sarabun New" w:hAnsi="TH Sarabun New" w:cs="TH Sarabun New"/>
-              <w:sz w:val="30"/>
-              <w:color w:val="000000"/>
-            </w:rPr>
-            <w:t>เมื่อพิจารณารายบุคคล พบว่านักเรียนทุกคนมีผลต่างเป็นบวก โดยผลต่างอยู่ระหว่าง +80.7 ถึง +138.0 คะแนน ผู้เรียนที่มีผลต่างเพิ่มขึ้นสูงสุดคือ ด.ญ.สรารัตน์ มฤกุล (+138.0 คะแนน) ส่วนผู้เรียนที่มีคะแนนก่อนเรียนสูงอยู่แล้ว เช่น ด.ช.พีรวัส นิโม ยังคงมีคะแนนหลังเรียนเพิ่มขึ้น (+80.7 คะแนน) แสดงว่ากิจกรรมสามารถใช้ได้ทั้งกับผู้เรียนที่ต้องการพัฒนาเร่งด่วนและผู้เรียนที่มีพื้นฐานดี</w:t>
-          </w:r>
-        </w:p>
-        <w:p>
-          <w:pPr>
-            <w:pStyle w:val="21"/>
-            <w:spacing w:before="120" w:after="80"/>
-          </w:pPr>
-          <w:r>
-            <w:rPr>
-              <w:rFonts w:ascii="TH Sarabun New" w:eastAsia="TH Sarabun New" w:hAnsi="TH Sarabun New" w:cs="TH Sarabun New"/>
-              <w:b/>
-              <w:color w:val="17365D"/>
-              <w:sz w:val="30"/>
-            </w:rPr>
-            <w:t>5.2 อภิปรายผล</w:t>
-          </w:r>
-        </w:p>
-        <w:p>
-          <w:pPr>
-            <w:spacing w:after="100"/>
-            <w:ind w:firstLine="504"/>
-            <w:jc w:val="both"/>
-          </w:pPr>
-          <w:r>
-            <w:rPr>
-              <w:rFonts w:ascii="TH Sarabun New" w:eastAsia="TH Sarabun New" w:hAnsi="TH Sarabun New" w:cs="TH Sarabun New"/>
-              <w:sz w:val="30"/>
-              <w:color w:val="000000"/>
-            </w:rPr>
-            <w:t>ผลจากข้อมูลดัมมี่สอดคล้องกับสมมติฐานการวิจัยที่กำหนดไว้ว่า คะแนนเฉลี่ยหลังเรียนสูงกว่าคะแนนเฉลี่ยก่อนเรียน และนักเรียนไม่น้อยกว่าร้อยละ 70 มีคะแนนเพิ่มขึ้น ทั้งนี้แนวโน้มดังกล่าวอาจเกิดจากลักษณะของเกมที่ให้ผู้เรียนฝึกซ้ำในเงื่อนไขเดียวกัน มีคะแนนสะท้อนผลทันที และช่วยกระตุ้นให้ผู้เรียนตั้งใจตอบโจทย์สูตรคูณมากขึ้น</w:t>
-          </w:r>
-        </w:p>
-        <w:p>
-          <w:pPr>
-            <w:spacing w:after="100"/>
-            <w:ind w:firstLine="504"/>
-            <w:jc w:val="both"/>
-          </w:pPr>
-          <w:r>
-            <w:rPr>
-              <w:rFonts w:ascii="TH Sarabun New" w:eastAsia="TH Sarabun New" w:hAnsi="TH Sarabun New" w:cs="TH Sarabun New"/>
-              <w:sz w:val="30"/>
-              <w:color w:val="000000"/>
-            </w:rPr>
-            <w:t>การใช้ระบบ Kampai School ช่วยให้ครูเห็นข้อมูลรายบุคคลอย่างเป็นระบบ ทั้งคะแนนก่อนเรียน คะแนนหลังเรียน ผลต่าง และจำนวนรอบการเล่น จึงสามารถนำข้อมูลไปวางแผนสอนซ่อมเสริมได้ชัดเจนกว่าการสังเกตเพียงอย่างเดียว</w:t>
-          </w:r>
-        </w:p>
-        <w:p>
-          <w:pPr>
-            <w:spacing w:after="100"/>
-            <w:ind w:firstLine="504"/>
-            <w:jc w:val="both"/>
-          </w:pPr>
-          <w:r>
-            <w:rPr>
-              <w:rFonts w:ascii="TH Sarabun New" w:eastAsia="TH Sarabun New" w:hAnsi="TH Sarabun New" w:cs="TH Sarabun New"/>
-              <w:sz w:val="30"/>
-              <w:color w:val="000000"/>
-            </w:rPr>
-            <w:t>อย่างไรก็ตาม เนื่องจากข้อมูลในบทนี้เป็นข้อมูลดัมมี่ จึงยังไม่สามารถใช้เป็นหลักฐานผลการวิจัยจริงได้ การสรุปผลฉบับสมบูรณ์ต้องใช้ข้อมูลจริงหลังครบช่วง Posttest และควรตรวจความครบถ้วนของระเบียนรายวันก่อนวิเคราะห์</w:t>
-          </w:r>
-        </w:p>
-        <w:p>
-          <w:pPr>
-            <w:pStyle w:val="21"/>
-            <w:spacing w:before="120" w:after="80"/>
-          </w:pPr>
-          <w:r>
-            <w:rPr>
-              <w:rFonts w:ascii="TH Sarabun New" w:eastAsia="TH Sarabun New" w:hAnsi="TH Sarabun New" w:cs="TH Sarabun New"/>
-              <w:b/>
-              <w:color w:val="17365D"/>
-              <w:sz w:val="30"/>
-            </w:rPr>
-            <w:t>5.3 ข้อเสนอแนะ</w:t>
-          </w:r>
-        </w:p>
-        <w:p>
-          <w:pPr>
-            <w:spacing w:after="70"/>
-            <w:ind w:left="504" w:hanging="360"/>
-            <w:jc w:val="both"/>
-          </w:pPr>
-          <w:r>
-            <w:rPr>
-              <w:rFonts w:ascii="TH Sarabun New" w:eastAsia="TH Sarabun New" w:hAnsi="TH Sarabun New" w:cs="TH Sarabun New"/>
-              <w:sz w:val="30"/>
-            </w:rPr>
-            <w:t>1. ครูควรจัดกิจกรรมเล่นเกมในช่วงเวลาที่แน่นอน และควบคุมให้ผู้เรียนเล่นตามจำนวนรอบที่กำหนด เพื่อให้ข้อมูลก่อนเรียนและหลังเรียนเปรียบเทียบกันได้อย่างเป็นธรรม</w:t>
-          </w:r>
-        </w:p>
-        <w:p>
-          <w:pPr>
-            <w:spacing w:after="70"/>
-            <w:ind w:left="504" w:hanging="360"/>
-            <w:jc w:val="both"/>
-          </w:pPr>
-          <w:r>
-            <w:rPr>
-              <w:rFonts w:ascii="TH Sarabun New" w:eastAsia="TH Sarabun New" w:hAnsi="TH Sarabun New" w:cs="TH Sarabun New"/>
-              <w:sz w:val="30"/>
-            </w:rPr>
-            <w:t>2. หลังเก็บข้อมูลจริง ควรตรวจรายชื่อนักเรียน คะแนนรายวัน และจำนวนรอบการเล่นก่อนนำไปคำนวณค่าเฉลี่ย เพื่อป้องกันข้อมูลขาดหรือข้อมูลเกินจากการเล่นนอกช่วงวิจัย</w:t>
-          </w:r>
-        </w:p>
-        <w:p>
-          <w:pPr>
-            <w:spacing w:after="70"/>
-            <w:ind w:left="504" w:hanging="360"/>
-            <w:jc w:val="both"/>
-          </w:pPr>
-          <w:r>
-            <w:rPr>
-              <w:rFonts w:ascii="TH Sarabun New" w:eastAsia="TH Sarabun New" w:hAnsi="TH Sarabun New" w:cs="TH Sarabun New"/>
-              <w:sz w:val="30"/>
-            </w:rPr>
-            <w:t>3. ควรใช้ผลต่างรายบุคคลจัดกลุ่มสอนซ่อมเสริม โดยเน้นนักเรียนที่คะแนนหลังเรียนยังต่ำ หรือมีผลต่างเพิ่มขึ้นน้อยเมื่อเทียบกับเพื่อน</w:t>
-          </w:r>
-        </w:p>
-        <w:p>
-          <w:pPr>
-            <w:spacing w:after="70"/>
-            <w:ind w:left="504" w:hanging="360"/>
-            <w:jc w:val="both"/>
-          </w:pPr>
-          <w:r>
-            <w:rPr>
-              <w:rFonts w:ascii="TH Sarabun New" w:eastAsia="TH Sarabun New" w:hAnsi="TH Sarabun New" w:cs="TH Sarabun New"/>
-              <w:sz w:val="30"/>
-            </w:rPr>
-            <w:t>4. หากต้องการอ้างผลสัมฤทธิ์ทางคณิตศาสตร์ในเชิงหลักสูตร ควรใช้แบบทดสอบก่อนเรียนและหลังเรียนที่ผ่านการตรวจคุณภาพควบคู่กับคะแนนจากเกม</w:t>
-          </w:r>
-        </w:p>
-        <w:p>
-          <w:pPr>
-            <w:pStyle w:val="21"/>
-            <w:spacing w:before="120" w:after="80"/>
-          </w:pPr>
-          <w:r>
-            <w:rPr>
-              <w:rFonts w:ascii="TH Sarabun New" w:eastAsia="TH Sarabun New" w:hAnsi="TH Sarabun New" w:cs="TH Sarabun New"/>
-              <w:b/>
-              <w:color w:val="17365D"/>
-              <w:sz w:val="30"/>
-            </w:rPr>
-            <w:t>5.4 สรุปผลโดยย่อ</w:t>
-          </w:r>
-        </w:p>
-        <w:p>
-          <w:pPr>
-            <w:spacing w:after="100"/>
-            <w:ind w:firstLine="504"/>
-            <w:jc w:val="both"/>
-          </w:pPr>
-          <w:r>
-            <w:rPr>
-              <w:rFonts w:ascii="TH Sarabun New" w:eastAsia="TH Sarabun New" w:hAnsi="TH Sarabun New" w:cs="TH Sarabun New"/>
-              <w:sz w:val="30"/>
-              <w:color w:val="000000"/>
-            </w:rPr>
-            <w:t>โดยสรุป ข้อมูลดัมมี่ชุดนี้แสดงตัวอย่างผลการวิจัยในทิศทางบวก คือ คะแนนเฉลี่ยหลังเรียนสูงกว่าก่อนเรียน ผลต่างเฉลี่ย +117.3 คะแนน และนักเรียนร้อยละ 100 มีคะแนนเพิ่มขึ้น จึงสามารถใช้เป็นต้นแบบการเขียนบทที่ 5 ได้ เมื่อเก็บข้อมูลจริงครบแล้วให้แทนที่ข้อมูลดัมมี่ด้วยผลจริงและปรับอภิปรายผลให้สอดคล้องกับหลักฐานจริง</w:t>
-          </w:r>
-        </w:p>
-        <w:p>
-          <w:r>
-            <w:br w:type="page"/>
-          </w:r>
-        </w:p>
       </w:pPr>
       <w:r>
         <w:rPr>

</xml_diff>

<commit_message>
docs(research): add observation appendix to plan A
Co-authored-by: Codex <codex@openai.com>
</commit_message>
<xml_diff>
--- a/public/docs/classroom-research/p4-multiply-race-research-plan-a.docx
+++ b/public/docs/classroom-research/p4-multiply-race-research-plan-a.docx
@@ -1025,14 +1025,7 @@
                 <w:rFonts w:cs="TH Sarabun New"/>
                 <w:sz w:val="28"/>
               </w:rPr>
-              <w:t>(</w:t>
-            </w:r>
-            <w:r>
-              <w:rPr>
-                <w:rFonts w:cs="TH Sarabun New"/>
-                <w:sz w:val="28"/>
-              </w:rPr>
-              <w:t>โปรดระบุ)</w:t>
+              <w:t>(โปรดระบุ)</w:t>
             </w:r>
           </w:p>
         </w:tc>
@@ -1082,14 +1075,7 @@
                 <w:rFonts w:cs="TH Sarabun New"/>
                 <w:sz w:val="28"/>
               </w:rPr>
-              <w:t>(</w:t>
-            </w:r>
-            <w:r>
-              <w:rPr>
-                <w:rFonts w:cs="TH Sarabun New"/>
-                <w:sz w:val="28"/>
-              </w:rPr>
-              <w:t>โปรดระบุ)</w:t>
+              <w:t>(โปรดระบุ)</w:t>
             </w:r>
           </w:p>
         </w:tc>
@@ -1139,14 +1125,7 @@
                 <w:rFonts w:cs="TH Sarabun New"/>
                 <w:sz w:val="28"/>
               </w:rPr>
-              <w:t>(</w:t>
-            </w:r>
-            <w:r>
-              <w:rPr>
-                <w:rFonts w:cs="TH Sarabun New"/>
-                <w:sz w:val="28"/>
-              </w:rPr>
-              <w:t>โปรดระบุ)</w:t>
+              <w:t>(โปรดระบุ)</w:t>
             </w:r>
           </w:p>
         </w:tc>
@@ -3656,15 +3635,7 @@
                 <w:color w:val="1F2937"/>
                 <w:sz w:val="22"/>
               </w:rPr>
-              <w:t xml:space="preserve">14 </w:t>
-            </w:r>
-            <w:r>
-              <w:rPr>
-                <w:rFonts w:cs="TH Sarabun New"/>
-                <w:color w:val="1F2937"/>
-                <w:sz w:val="22"/>
-              </w:rPr>
-              <w:t>วัน</w:t>
+              <w:t>14 วัน</w:t>
             </w:r>
           </w:p>
         </w:tc>
@@ -3816,6 +3787,8 @@
               <w:rPr>
                 <w:rFonts w:cs="TH Sarabun New"/>
                 <w:sz w:val="28"/>
+                <w:cs/>
+                <w:lang w:bidi="th-TH"/>
               </w:rPr>
               <w:t>บทสรุปแผนวิจัย</w:t>
             </w:r>
@@ -3863,6 +3836,8 @@
               <w:rPr>
                 <w:rFonts w:cs="TH Sarabun New"/>
                 <w:sz w:val="28"/>
+                <w:cs/>
+                <w:lang w:bidi="th-TH"/>
               </w:rPr>
               <w:t>ข้อมูลสถานศึกษา</w:t>
             </w:r>
@@ -3910,8 +3885,26 @@
               <w:rPr>
                 <w:rFonts w:cs="TH Sarabun New"/>
                 <w:sz w:val="28"/>
-              </w:rPr>
-              <w:t>บทที่ 1 ปัญหาและวัตถุประสงค์</w:t>
+                <w:cs/>
+                <w:lang w:bidi="th-TH"/>
+              </w:rPr>
+              <w:t xml:space="preserve">บทที่ </w:t>
+            </w:r>
+            <w:r>
+              <w:rPr>
+                <w:rFonts w:cs="TH Sarabun New"/>
+                <w:sz w:val="28"/>
+              </w:rPr>
+              <w:t xml:space="preserve">1 </w:t>
+            </w:r>
+            <w:r>
+              <w:rPr>
+                <w:rFonts w:cs="TH Sarabun New"/>
+                <w:sz w:val="28"/>
+                <w:cs/>
+                <w:lang w:bidi="th-TH"/>
+              </w:rPr>
+              <w:t>ปัญหาและวัตถุประสงค์</w:t>
             </w:r>
           </w:p>
         </w:tc>
@@ -3932,7 +3925,7 @@
                 <w:rFonts w:cs="TH Sarabun New"/>
                 <w:sz w:val="28"/>
               </w:rPr>
-              <w:t>7</w:t>
+              <w:t>8</w:t>
             </w:r>
           </w:p>
         </w:tc>
@@ -3958,7 +3951,16 @@
                 <w:rFonts w:cs="TH Sarabun New"/>
                 <w:sz w:val="28"/>
               </w:rPr>
-              <w:t>1.1 ความเป็นมาและความสำคัญ</w:t>
+              <w:t xml:space="preserve">1.1 </w:t>
+            </w:r>
+            <w:r>
+              <w:rPr>
+                <w:rFonts w:cs="TH Sarabun New"/>
+                <w:sz w:val="28"/>
+                <w:cs/>
+                <w:lang w:bidi="th-TH"/>
+              </w:rPr>
+              <w:t>ความเป็นมาและความสำคัญ</w:t>
             </w:r>
           </w:p>
         </w:tc>
@@ -3979,7 +3981,7 @@
                 <w:rFonts w:cs="TH Sarabun New"/>
                 <w:sz w:val="28"/>
               </w:rPr>
-              <w:t>7</w:t>
+              <w:t>8</w:t>
             </w:r>
           </w:p>
         </w:tc>
@@ -4005,7 +4007,16 @@
                 <w:rFonts w:cs="TH Sarabun New"/>
                 <w:sz w:val="28"/>
               </w:rPr>
-              <w:t>1.2 ปัญหาการวิจัย</w:t>
+              <w:t xml:space="preserve">1.2 </w:t>
+            </w:r>
+            <w:r>
+              <w:rPr>
+                <w:rFonts w:cs="TH Sarabun New"/>
+                <w:sz w:val="28"/>
+                <w:cs/>
+                <w:lang w:bidi="th-TH"/>
+              </w:rPr>
+              <w:t>ปัญหาการวิจัย</w:t>
             </w:r>
           </w:p>
         </w:tc>
@@ -4026,7 +4037,7 @@
                 <w:rFonts w:cs="TH Sarabun New"/>
                 <w:sz w:val="28"/>
               </w:rPr>
-              <w:t>7</w:t>
+              <w:t>8</w:t>
             </w:r>
           </w:p>
         </w:tc>
@@ -4052,7 +4063,16 @@
                 <w:rFonts w:cs="TH Sarabun New"/>
                 <w:sz w:val="28"/>
               </w:rPr>
-              <w:t>1.3 วัตถุประสงค์</w:t>
+              <w:t xml:space="preserve">1.3 </w:t>
+            </w:r>
+            <w:r>
+              <w:rPr>
+                <w:rFonts w:cs="TH Sarabun New"/>
+                <w:sz w:val="28"/>
+                <w:cs/>
+                <w:lang w:bidi="th-TH"/>
+              </w:rPr>
+              <w:t>วัตถุประสงค์</w:t>
             </w:r>
           </w:p>
         </w:tc>
@@ -4073,7 +4093,7 @@
                 <w:rFonts w:cs="TH Sarabun New"/>
                 <w:sz w:val="28"/>
               </w:rPr>
-              <w:t>7</w:t>
+              <w:t>8</w:t>
             </w:r>
           </w:p>
         </w:tc>
@@ -4099,7 +4119,16 @@
                 <w:rFonts w:cs="TH Sarabun New"/>
                 <w:sz w:val="28"/>
               </w:rPr>
-              <w:t>1.4 สมมติฐาน</w:t>
+              <w:t xml:space="preserve">1.4 </w:t>
+            </w:r>
+            <w:r>
+              <w:rPr>
+                <w:rFonts w:cs="TH Sarabun New"/>
+                <w:sz w:val="28"/>
+                <w:cs/>
+                <w:lang w:bidi="th-TH"/>
+              </w:rPr>
+              <w:t>สมมติฐาน</w:t>
             </w:r>
           </w:p>
         </w:tc>
@@ -4120,7 +4149,7 @@
                 <w:rFonts w:cs="TH Sarabun New"/>
                 <w:sz w:val="28"/>
               </w:rPr>
-              <w:t>7</w:t>
+              <w:t>8</w:t>
             </w:r>
           </w:p>
         </w:tc>
@@ -4146,7 +4175,16 @@
                 <w:rFonts w:cs="TH Sarabun New"/>
                 <w:sz w:val="28"/>
               </w:rPr>
-              <w:t>1.5 ขอบเขต</w:t>
+              <w:t xml:space="preserve">1.5 </w:t>
+            </w:r>
+            <w:r>
+              <w:rPr>
+                <w:rFonts w:cs="TH Sarabun New"/>
+                <w:sz w:val="28"/>
+                <w:cs/>
+                <w:lang w:bidi="th-TH"/>
+              </w:rPr>
+              <w:t>ขอบเขต</w:t>
             </w:r>
           </w:p>
         </w:tc>
@@ -4167,7 +4205,7 @@
                 <w:rFonts w:cs="TH Sarabun New"/>
                 <w:sz w:val="28"/>
               </w:rPr>
-              <w:t>7</w:t>
+              <w:t>8</w:t>
             </w:r>
           </w:p>
         </w:tc>
@@ -4193,7 +4231,16 @@
                 <w:rFonts w:cs="TH Sarabun New"/>
                 <w:sz w:val="28"/>
               </w:rPr>
-              <w:t>1.6 นิยามศัพท์</w:t>
+              <w:t xml:space="preserve">1.6 </w:t>
+            </w:r>
+            <w:r>
+              <w:rPr>
+                <w:rFonts w:cs="TH Sarabun New"/>
+                <w:sz w:val="28"/>
+                <w:cs/>
+                <w:lang w:bidi="th-TH"/>
+              </w:rPr>
+              <w:t>นิยามศัพท์</w:t>
             </w:r>
           </w:p>
         </w:tc>
@@ -4214,7 +4261,7 @@
                 <w:rFonts w:cs="TH Sarabun New"/>
                 <w:sz w:val="28"/>
               </w:rPr>
-              <w:t>8</w:t>
+              <w:t>9</w:t>
             </w:r>
           </w:p>
         </w:tc>
@@ -4240,7 +4287,16 @@
                 <w:rFonts w:cs="TH Sarabun New"/>
                 <w:sz w:val="28"/>
               </w:rPr>
-              <w:t>1.7 ประโยชน์ที่คาดว่าจะได้รับ</w:t>
+              <w:t xml:space="preserve">1.7 </w:t>
+            </w:r>
+            <w:r>
+              <w:rPr>
+                <w:rFonts w:cs="TH Sarabun New"/>
+                <w:sz w:val="28"/>
+                <w:cs/>
+                <w:lang w:bidi="th-TH"/>
+              </w:rPr>
+              <w:t>ประโยชน์ที่คาดว่าจะได้รับ</w:t>
             </w:r>
           </w:p>
         </w:tc>
@@ -4261,7 +4317,7 @@
                 <w:rFonts w:cs="TH Sarabun New"/>
                 <w:sz w:val="28"/>
               </w:rPr>
-              <w:t>8</w:t>
+              <w:t>9</w:t>
             </w:r>
           </w:p>
         </w:tc>
@@ -4286,8 +4342,26 @@
               <w:rPr>
                 <w:rFonts w:cs="TH Sarabun New"/>
                 <w:sz w:val="28"/>
-              </w:rPr>
-              <w:t>บทที่ 2 กรอบแนวคิดและงานที่เกี่ยวข้อง</w:t>
+                <w:cs/>
+                <w:lang w:bidi="th-TH"/>
+              </w:rPr>
+              <w:t xml:space="preserve">บทที่ </w:t>
+            </w:r>
+            <w:r>
+              <w:rPr>
+                <w:rFonts w:cs="TH Sarabun New"/>
+                <w:sz w:val="28"/>
+              </w:rPr>
+              <w:t xml:space="preserve">2 </w:t>
+            </w:r>
+            <w:r>
+              <w:rPr>
+                <w:rFonts w:cs="TH Sarabun New"/>
+                <w:sz w:val="28"/>
+                <w:cs/>
+                <w:lang w:bidi="th-TH"/>
+              </w:rPr>
+              <w:t>กรอบแนวคิดและงานที่เกี่ยวข้อง</w:t>
             </w:r>
           </w:p>
         </w:tc>
@@ -4308,7 +4382,7 @@
                 <w:rFonts w:cs="TH Sarabun New"/>
                 <w:sz w:val="28"/>
               </w:rPr>
-              <w:t>9</w:t>
+              <w:t>10</w:t>
             </w:r>
           </w:p>
         </w:tc>
@@ -4333,8 +4407,26 @@
               <w:rPr>
                 <w:rFonts w:cs="TH Sarabun New"/>
                 <w:sz w:val="28"/>
-              </w:rPr>
-              <w:t>บทที่ 3 แผนดำเนินการวิจัย</w:t>
+                <w:cs/>
+                <w:lang w:bidi="th-TH"/>
+              </w:rPr>
+              <w:t xml:space="preserve">บทที่ </w:t>
+            </w:r>
+            <w:r>
+              <w:rPr>
+                <w:rFonts w:cs="TH Sarabun New"/>
+                <w:sz w:val="28"/>
+              </w:rPr>
+              <w:t xml:space="preserve">3 </w:t>
+            </w:r>
+            <w:r>
+              <w:rPr>
+                <w:rFonts w:cs="TH Sarabun New"/>
+                <w:sz w:val="28"/>
+                <w:cs/>
+                <w:lang w:bidi="th-TH"/>
+              </w:rPr>
+              <w:t>แผนดำเนินการวิจัย</w:t>
             </w:r>
           </w:p>
         </w:tc>
@@ -4355,7 +4447,7 @@
                 <w:rFonts w:cs="TH Sarabun New"/>
                 <w:sz w:val="28"/>
               </w:rPr>
-              <w:t>10</w:t>
+              <w:t>11</w:t>
             </w:r>
           </w:p>
         </w:tc>
@@ -4380,6 +4472,8 @@
               <w:rPr>
                 <w:rFonts w:cs="TH Sarabun New"/>
                 <w:sz w:val="28"/>
+                <w:cs/>
+                <w:lang w:bidi="th-TH"/>
               </w:rPr>
               <w:t>เครื่องมือวิจัย</w:t>
             </w:r>
@@ -4402,7 +4496,7 @@
                 <w:rFonts w:cs="TH Sarabun New"/>
                 <w:sz w:val="28"/>
               </w:rPr>
-              <w:t>12</w:t>
+              <w:t>13</w:t>
             </w:r>
           </w:p>
         </w:tc>
@@ -4427,6 +4521,8 @@
               <w:rPr>
                 <w:rFonts w:cs="TH Sarabun New"/>
                 <w:sz w:val="28"/>
+                <w:cs/>
+                <w:lang w:bidi="th-TH"/>
               </w:rPr>
               <w:t>งบประมาณและทรัพยากร</w:t>
             </w:r>
@@ -4449,7 +4545,7 @@
                 <w:rFonts w:cs="TH Sarabun New"/>
                 <w:sz w:val="28"/>
               </w:rPr>
-              <w:t>13</w:t>
+              <w:t>14</w:t>
             </w:r>
           </w:p>
         </w:tc>
@@ -4483,50 +4579,34 @@
                 <w:cs/>
                 <w:lang w:bidi="th-TH"/>
               </w:rPr>
-              <w:t xml:space="preserve">บทที่ </w:t>
-            </w:r>
-            <w:r>
+              <w:t>บทที่ 5 สรุปผล อภิปรายผล และข้อเสนอแนะ</w:t>
+            </w:r>
+          </w:p>
+        </w:tc>
+        <w:tc>
+          <w:tcPr>
+            <w:tcW w:w="1152" w:type="dxa"/>
+            <w:tcMar>
+              <w:top w:w="90" w:type="dxa"/>
+              <w:left w:w="120" w:type="dxa"/>
+              <w:bottom w:w="90" w:type="dxa"/>
+              <w:right w:w="120" w:type="dxa"/>
+            </w:tcMar>
+            <w:vAlign w:val="center"/>
+          </w:tcPr>
+          <w:p>
+            <w:pPr>
               <w:rPr>
                 <w:rFonts w:cs="TH Sarabun New"/>
                 <w:sz w:val="28"/>
               </w:rPr>
-              <w:t xml:space="preserve">5 </w:t>
-            </w:r>
+            </w:pPr>
             <w:r>
               <w:rPr>
                 <w:rFonts w:cs="TH Sarabun New"/>
                 <w:sz w:val="28"/>
-                <w:cs/>
-                <w:lang w:bidi="th-TH"/>
-              </w:rPr>
-              <w:t>สรุปผล อภิปรายผล และข้อเสนอแนะ</w:t>
-            </w:r>
-          </w:p>
-        </w:tc>
-        <w:tc>
-          <w:tcPr>
-            <w:tcW w:w="1152" w:type="dxa"/>
-            <w:tcMar>
-              <w:top w:w="90" w:type="dxa"/>
-              <w:left w:w="120" w:type="dxa"/>
-              <w:bottom w:w="90" w:type="dxa"/>
-              <w:right w:w="120" w:type="dxa"/>
-            </w:tcMar>
-            <w:vAlign w:val="center"/>
-          </w:tcPr>
-          <w:p>
-            <w:pPr>
-              <w:rPr>
-                <w:rFonts w:cs="TH Sarabun New"/>
-                <w:sz w:val="28"/>
-              </w:rPr>
-            </w:pPr>
-            <w:r>
-              <w:rPr>
-                <w:rFonts w:cs="TH Sarabun New"/>
-                <w:sz w:val="28"/>
-              </w:rPr>
-              <w:t>15</w:t>
+              </w:rPr>
+              <w:t>16</w:t>
             </w:r>
           </w:p>
         </w:tc>
@@ -4551,8 +4631,10 @@
               <w:rPr>
                 <w:rFonts w:cs="TH Sarabun New"/>
                 <w:sz w:val="28"/>
-              </w:rPr>
-              <w:t>ภาคผนวกแผน ก–ง</w:t>
+                <w:cs/>
+                <w:lang w:bidi="th-TH"/>
+              </w:rPr>
+              <w:t>ภาคผนวกแผน ก–จ</w:t>
             </w:r>
           </w:p>
         </w:tc>
@@ -4573,7 +4655,7 @@
                 <w:rFonts w:cs="TH Sarabun New"/>
                 <w:sz w:val="28"/>
               </w:rPr>
-              <w:t>17</w:t>
+              <w:t>18</w:t>
             </w:r>
           </w:p>
         </w:tc>
@@ -4594,12 +4676,20 @@
             <w:vAlign w:val="center"/>
           </w:tcPr>
           <w:p>
-            <w:r>
+            <w:pPr>
               <w:rPr>
                 <w:rFonts w:cs="TH Sarabun New"/>
                 <w:sz w:val="28"/>
               </w:rPr>
-              <w:t>R1 หนังสือขออนุญาตทำวิจัย</w:t>
+            </w:pPr>
+            <w:r>
+              <w:rPr>
+                <w:rFonts w:cs="TH Sarabun New"/>
+                <w:sz w:val="28"/>
+                <w:cs/>
+                <w:lang w:bidi="th-TH"/>
+              </w:rPr>
+              <w:t>ภาคผนวกแผน จ — แบบสังเกตพฤติกรรมการมีส่วนร่วม</w:t>
             </w:r>
           </w:p>
         </w:tc>
@@ -4615,12 +4705,18 @@
             <w:vAlign w:val="center"/>
           </w:tcPr>
           <w:p>
-            <w:r>
+            <w:pPr>
               <w:rPr>
                 <w:rFonts w:cs="TH Sarabun New"/>
                 <w:sz w:val="28"/>
               </w:rPr>
-              <w:t>21</w:t>
+            </w:pPr>
+            <w:r>
+              <w:rPr>
+                <w:rFonts w:cs="TH Sarabun New"/>
+                <w:sz w:val="28"/>
+              </w:rPr>
+              <w:t>22</w:t>
             </w:r>
           </w:p>
         </w:tc>
@@ -4646,7 +4742,16 @@
                 <w:rFonts w:cs="TH Sarabun New"/>
                 <w:sz w:val="28"/>
               </w:rPr>
-              <w:t>R2 ความเห็นที่ปรึกษา</w:t>
+              <w:t xml:space="preserve">R1 </w:t>
+            </w:r>
+            <w:r>
+              <w:rPr>
+                <w:rFonts w:cs="TH Sarabun New"/>
+                <w:sz w:val="28"/>
+                <w:cs/>
+                <w:lang w:bidi="th-TH"/>
+              </w:rPr>
+              <w:t>หนังสือขออนุญาตทำวิจัย</w:t>
             </w:r>
           </w:p>
         </w:tc>
@@ -4667,7 +4772,7 @@
                 <w:rFonts w:cs="TH Sarabun New"/>
                 <w:sz w:val="28"/>
               </w:rPr>
-              <w:t>22</w:t>
+              <w:t>24</w:t>
             </w:r>
           </w:p>
         </w:tc>
@@ -4693,7 +4798,16 @@
                 <w:rFonts w:cs="TH Sarabun New"/>
                 <w:sz w:val="28"/>
               </w:rPr>
-              <w:t>R3 ความเห็นหัวหน้ากลุ่มสาระ</w:t>
+              <w:t xml:space="preserve">R2 </w:t>
+            </w:r>
+            <w:r>
+              <w:rPr>
+                <w:rFonts w:cs="TH Sarabun New"/>
+                <w:sz w:val="28"/>
+                <w:cs/>
+                <w:lang w:bidi="th-TH"/>
+              </w:rPr>
+              <w:t>ความเห็นที่ปรึกษา</w:t>
             </w:r>
           </w:p>
         </w:tc>
@@ -4714,7 +4828,7 @@
                 <w:rFonts w:cs="TH Sarabun New"/>
                 <w:sz w:val="28"/>
               </w:rPr>
-              <w:t>23</w:t>
+              <w:t>25</w:t>
             </w:r>
           </w:p>
         </w:tc>
@@ -4740,7 +4854,16 @@
                 <w:rFonts w:cs="TH Sarabun New"/>
                 <w:sz w:val="28"/>
               </w:rPr>
-              <w:t>R4 คำอนุมัติจากผู้อำนวยการ</w:t>
+              <w:t xml:space="preserve">R3 </w:t>
+            </w:r>
+            <w:r>
+              <w:rPr>
+                <w:rFonts w:cs="TH Sarabun New"/>
+                <w:sz w:val="28"/>
+                <w:cs/>
+                <w:lang w:bidi="th-TH"/>
+              </w:rPr>
+              <w:t>ความเห็นหัวหน้ากลุ่มสาระ</w:t>
             </w:r>
           </w:p>
         </w:tc>
@@ -4761,7 +4884,7 @@
                 <w:rFonts w:cs="TH Sarabun New"/>
                 <w:sz w:val="28"/>
               </w:rPr>
-              <w:t>24</w:t>
+              <w:t>26</w:t>
             </w:r>
           </w:p>
         </w:tc>
@@ -4787,7 +4910,16 @@
                 <w:rFonts w:cs="TH Sarabun New"/>
                 <w:sz w:val="28"/>
               </w:rPr>
-              <w:t>R5 รายชื่อกรรมการตรวจแผน</w:t>
+              <w:t xml:space="preserve">R4 </w:t>
+            </w:r>
+            <w:r>
+              <w:rPr>
+                <w:rFonts w:cs="TH Sarabun New"/>
+                <w:sz w:val="28"/>
+                <w:cs/>
+                <w:lang w:bidi="th-TH"/>
+              </w:rPr>
+              <w:t>คำอนุมัติจากผู้อำนวยการ</w:t>
             </w:r>
           </w:p>
         </w:tc>
@@ -4808,7 +4940,7 @@
                 <w:rFonts w:cs="TH Sarabun New"/>
                 <w:sz w:val="28"/>
               </w:rPr>
-              <w:t>25</w:t>
+              <w:t>27</w:t>
             </w:r>
           </w:p>
         </w:tc>
@@ -4834,7 +4966,16 @@
                 <w:rFonts w:cs="TH Sarabun New"/>
                 <w:sz w:val="28"/>
               </w:rPr>
-              <w:t>R6 สรุปการยินยอมผู้ปกครอง</w:t>
+              <w:t xml:space="preserve">R5 </w:t>
+            </w:r>
+            <w:r>
+              <w:rPr>
+                <w:rFonts w:cs="TH Sarabun New"/>
+                <w:sz w:val="28"/>
+                <w:cs/>
+                <w:lang w:bidi="th-TH"/>
+              </w:rPr>
+              <w:t>รายชื่อกรรมการตรวจแผน</w:t>
             </w:r>
           </w:p>
         </w:tc>
@@ -4855,7 +4996,7 @@
                 <w:rFonts w:cs="TH Sarabun New"/>
                 <w:sz w:val="28"/>
               </w:rPr>
-              <w:t>26</w:t>
+              <w:t>28</w:t>
             </w:r>
           </w:p>
         </w:tc>
@@ -4881,6 +5022,64 @@
                 <w:rFonts w:cs="TH Sarabun New"/>
                 <w:sz w:val="28"/>
               </w:rPr>
+              <w:t xml:space="preserve">R6 </w:t>
+            </w:r>
+            <w:r>
+              <w:rPr>
+                <w:rFonts w:cs="TH Sarabun New"/>
+                <w:sz w:val="28"/>
+                <w:cs/>
+                <w:lang w:bidi="th-TH"/>
+              </w:rPr>
+              <w:t>สรุปการยินยอมผู้ปกครอง</w:t>
+            </w:r>
+          </w:p>
+        </w:tc>
+        <w:tc>
+          <w:tcPr>
+            <w:tcW w:w="1152" w:type="dxa"/>
+            <w:tcMar>
+              <w:top w:w="90" w:type="dxa"/>
+              <w:left w:w="120" w:type="dxa"/>
+              <w:bottom w:w="90" w:type="dxa"/>
+              <w:right w:w="120" w:type="dxa"/>
+            </w:tcMar>
+            <w:vAlign w:val="center"/>
+          </w:tcPr>
+          <w:p>
+            <w:r>
+              <w:rPr>
+                <w:rFonts w:cs="TH Sarabun New"/>
+                <w:sz w:val="28"/>
+              </w:rPr>
+              <w:t>29</w:t>
+            </w:r>
+          </w:p>
+        </w:tc>
+      </w:tr>
+      <w:tr>
+        <w:trPr>
+          <w:jc w:val="center"/>
+        </w:trPr>
+        <w:tc>
+          <w:tcPr>
+            <w:tcW w:w="8496" w:type="dxa"/>
+            <w:tcMar>
+              <w:top w:w="90" w:type="dxa"/>
+              <w:left w:w="120" w:type="dxa"/>
+              <w:bottom w:w="90" w:type="dxa"/>
+              <w:right w:w="120" w:type="dxa"/>
+            </w:tcMar>
+            <w:vAlign w:val="center"/>
+          </w:tcPr>
+          <w:p>
+            <w:r>
+              <w:rPr>
+                <w:rFonts w:cs="TH Sarabun New"/>
+                <w:sz w:val="28"/>
+                <w:cs/>
+                <w:lang w:bidi="th-TH"/>
+              </w:rPr>
               <w:t>บรรณานุกรมเบื้องต้น</w:t>
             </w:r>
           </w:p>
@@ -4902,7 +5101,7 @@
                 <w:rFonts w:cs="TH Sarabun New"/>
                 <w:sz w:val="28"/>
               </w:rPr>
-              <w:t>27</w:t>
+              <w:t>30</w:t>
             </w:r>
           </w:p>
         </w:tc>
@@ -4910,6 +5109,7 @@
     </w:tbl>
     <w:p>
       <w:r>
+        <w:lastRenderedPageBreak/>
         <w:br w:type="page"/>
       </w:r>
     </w:p>
@@ -8707,15 +8907,7 @@
           <w:color w:val="17365D"/>
           <w:sz w:val="30"/>
         </w:rPr>
-        <w:t xml:space="preserve">5.1 </w:t>
-      </w:r>
-      <w:r>
-        <w:rPr>
-          <w:rFonts w:ascii="TH Sarabun New" w:eastAsia="TH Sarabun New" w:hAnsi="TH Sarabun New" w:cs="TH Sarabun New"/>
-          <w:color w:val="17365D"/>
-          <w:sz w:val="30"/>
-        </w:rPr>
-        <w:t>สรุปผลการวิจัย</w:t>
+        <w:t>5.1 สรุปผลการวิจัย</w:t>
       </w:r>
     </w:p>
     <w:p>
@@ -8774,15 +8966,7 @@
           <w:color w:val="17365D"/>
           <w:sz w:val="30"/>
         </w:rPr>
-        <w:t xml:space="preserve">5.2 </w:t>
-      </w:r>
-      <w:r>
-        <w:rPr>
-          <w:rFonts w:ascii="TH Sarabun New" w:eastAsia="TH Sarabun New" w:hAnsi="TH Sarabun New" w:cs="TH Sarabun New"/>
-          <w:color w:val="17365D"/>
-          <w:sz w:val="30"/>
-        </w:rPr>
-        <w:t>อภิปรายผล</w:t>
+        <w:t>5.2 อภิปรายผล</w:t>
       </w:r>
     </w:p>
     <w:p>
@@ -8841,122 +9025,78 @@
           <w:color w:val="17365D"/>
           <w:sz w:val="30"/>
         </w:rPr>
-        <w:t xml:space="preserve">5.3 </w:t>
+        <w:t>5.3 ข้อเสนอแนะ</w:t>
       </w:r>
+    </w:p>
+    <w:p>
+      <w:pPr>
+        <w:spacing w:after="70"/>
+        <w:ind w:left="504" w:hanging="360"/>
+        <w:jc w:val="both"/>
+      </w:pPr>
+      <w:r>
+        <w:rPr>
+          <w:rFonts w:cs="TH Sarabun New"/>
+          <w:sz w:val="30"/>
+        </w:rPr>
+        <w:t>1. ครูควรจัดกิจกรรมเล่นเกมในช่วงเวลาที่แน่นอน และควบคุมให้ผู้เรียนเล่นตามจำนวนรอบที่กำหนด เพื่อให้ข้อมูลก่อนเรียนและหลังเรียนเปรียบเทียบกันได้อย่างเป็นธรรม</w:t>
+      </w:r>
+    </w:p>
+    <w:p>
+      <w:pPr>
+        <w:spacing w:after="70"/>
+        <w:ind w:left="504" w:hanging="360"/>
+        <w:jc w:val="both"/>
+      </w:pPr>
+      <w:r>
+        <w:rPr>
+          <w:rFonts w:cs="TH Sarabun New"/>
+          <w:sz w:val="30"/>
+        </w:rPr>
+        <w:lastRenderedPageBreak/>
+        <w:t>2. หลังเก็บข้อมูลจริง ควรตรวจรายชื่อนักเรียน คะแนนรายวัน และจำนวนรอบการเล่นก่อนนำไปคำนวณค่าเฉลี่ย เพื่อป้องกันข้อมูลขาดหรือข้อมูลเกินจากการเล่นนอกช่วงวิจัย</w:t>
+      </w:r>
+    </w:p>
+    <w:p>
+      <w:pPr>
+        <w:spacing w:after="70"/>
+        <w:ind w:left="504" w:hanging="360"/>
+        <w:jc w:val="both"/>
+      </w:pPr>
+      <w:r>
+        <w:rPr>
+          <w:rFonts w:cs="TH Sarabun New"/>
+          <w:sz w:val="30"/>
+        </w:rPr>
+        <w:t>3. ควรใช้ผลต่างรายบุคคลจัดกลุ่มสอนซ่อมเสริม โดยเน้นนักเรียนที่คะแนนหลังเรียนยังต่ำ หรือมีผลต่างเพิ่มขึ้นน้อยเมื่อเทียบกับเพื่อน</w:t>
+      </w:r>
+    </w:p>
+    <w:p>
+      <w:pPr>
+        <w:spacing w:after="70"/>
+        <w:ind w:left="504" w:hanging="360"/>
+        <w:jc w:val="both"/>
+      </w:pPr>
+      <w:r>
+        <w:rPr>
+          <w:rFonts w:cs="TH Sarabun New"/>
+          <w:sz w:val="30"/>
+        </w:rPr>
+        <w:t>4. หากต้องการอ้างผลสัมฤทธิ์ทางคณิตศาสตร์ในเชิงหลักสูตร ควรใช้แบบทดสอบก่อนเรียนและหลังเรียนที่ผ่านการตรวจคุณภาพควบคู่กับคะแนนจากเกม</w:t>
+      </w:r>
+    </w:p>
+    <w:p>
+      <w:pPr>
+        <w:pStyle w:val="21"/>
+        <w:spacing w:before="120" w:after="80"/>
+      </w:pPr>
       <w:r>
         <w:rPr>
           <w:rFonts w:ascii="TH Sarabun New" w:eastAsia="TH Sarabun New" w:hAnsi="TH Sarabun New" w:cs="TH Sarabun New"/>
           <w:color w:val="17365D"/>
           <w:sz w:val="30"/>
         </w:rPr>
-        <w:t>ข้อเสนอแนะ</w:t>
-      </w:r>
-    </w:p>
-    <w:p>
-      <w:pPr>
-        <w:spacing w:after="70"/>
-        <w:ind w:left="504" w:hanging="360"/>
-        <w:jc w:val="both"/>
-      </w:pPr>
-      <w:r>
-        <w:rPr>
-          <w:rFonts w:cs="TH Sarabun New"/>
-          <w:sz w:val="30"/>
-        </w:rPr>
-        <w:t xml:space="preserve">1. </w:t>
-      </w:r>
-      <w:r>
-        <w:rPr>
-          <w:rFonts w:cs="TH Sarabun New"/>
-          <w:sz w:val="30"/>
-        </w:rPr>
-        <w:t>ครูควรจัดกิจกรรมเล่นเกมในช่วงเวลาที่แน่นอน และควบคุมให้ผู้เรียนเล่นตามจำนวนรอบที่กำหนด เพื่อให้ข้อมูลก่อนเรียนและหลังเรียนเปรียบเทียบกันได้อย่างเป็นธรรม</w:t>
-      </w:r>
-    </w:p>
-    <w:p>
-      <w:pPr>
-        <w:spacing w:after="70"/>
-        <w:ind w:left="504" w:hanging="360"/>
-        <w:jc w:val="both"/>
-      </w:pPr>
-      <w:r>
-        <w:rPr>
-          <w:rFonts w:cs="TH Sarabun New"/>
-          <w:sz w:val="30"/>
-        </w:rPr>
-        <w:lastRenderedPageBreak/>
-        <w:t xml:space="preserve">2. </w:t>
-      </w:r>
-      <w:r>
-        <w:rPr>
-          <w:rFonts w:cs="TH Sarabun New"/>
-          <w:sz w:val="30"/>
-        </w:rPr>
-        <w:t>หลังเก็บข้อมูลจริง ควรตรวจรายชื่อนักเรียน คะแนนรายวัน และจำนวนรอบการเล่นก่อนนำไปคำนวณค่าเฉลี่ย เพื่อป้องกันข้อมูลขาดหรือข้อมูลเกินจากการเล่นนอกช่วงวิจัย</w:t>
-      </w:r>
-    </w:p>
-    <w:p>
-      <w:pPr>
-        <w:spacing w:after="70"/>
-        <w:ind w:left="504" w:hanging="360"/>
-        <w:jc w:val="both"/>
-      </w:pPr>
-      <w:r>
-        <w:rPr>
-          <w:rFonts w:cs="TH Sarabun New"/>
-          <w:sz w:val="30"/>
-        </w:rPr>
-        <w:t xml:space="preserve">3. </w:t>
-      </w:r>
-      <w:r>
-        <w:rPr>
-          <w:rFonts w:cs="TH Sarabun New"/>
-          <w:sz w:val="30"/>
-        </w:rPr>
-        <w:t>ควรใช้ผลต่างรายบุคคลจัดกลุ่มสอนซ่อมเสริม โดยเน้นนักเรียนที่คะแนนหลังเรียนยังต่ำ หรือมีผลต่างเพิ่มขึ้นน้อยเมื่อเทียบกับเพื่อน</w:t>
-      </w:r>
-    </w:p>
-    <w:p>
-      <w:pPr>
-        <w:spacing w:after="70"/>
-        <w:ind w:left="504" w:hanging="360"/>
-        <w:jc w:val="both"/>
-      </w:pPr>
-      <w:r>
-        <w:rPr>
-          <w:rFonts w:cs="TH Sarabun New"/>
-          <w:sz w:val="30"/>
-        </w:rPr>
-        <w:t xml:space="preserve">4. </w:t>
-      </w:r>
-      <w:r>
-        <w:rPr>
-          <w:rFonts w:cs="TH Sarabun New"/>
-          <w:sz w:val="30"/>
-        </w:rPr>
-        <w:t>หากต้องการอ้างผลสัมฤทธิ์ทางคณิตศาสตร์ในเชิงหลักสูตร ควรใช้แบบทดสอบก่อนเรียนและหลังเรียนที่ผ่านการตรวจคุณภาพควบคู่กับคะแนนจากเกม</w:t>
-      </w:r>
-    </w:p>
-    <w:p>
-      <w:pPr>
-        <w:pStyle w:val="21"/>
-        <w:spacing w:before="120" w:after="80"/>
-      </w:pPr>
-      <w:r>
-        <w:rPr>
-          <w:rFonts w:ascii="TH Sarabun New" w:eastAsia="TH Sarabun New" w:hAnsi="TH Sarabun New" w:cs="TH Sarabun New"/>
-          <w:color w:val="17365D"/>
-          <w:sz w:val="30"/>
-        </w:rPr>
-        <w:t xml:space="preserve">5.4 </w:t>
-      </w:r>
-      <w:r>
-        <w:rPr>
-          <w:rFonts w:ascii="TH Sarabun New" w:eastAsia="TH Sarabun New" w:hAnsi="TH Sarabun New" w:cs="TH Sarabun New"/>
-          <w:color w:val="17365D"/>
-          <w:sz w:val="30"/>
-        </w:rPr>
-        <w:t>สรุปผลโดยย่อ</w:t>
+        <w:t>5.4 สรุปผลโดยย่อ</w:t>
       </w:r>
     </w:p>
     <w:p>
@@ -11043,16 +11183,1317 @@
     </w:p>
     <w:p>
       <w:pPr>
-        <w:pStyle w:val="1"/>
-        <w:pageBreakBefore/>
-        <w:spacing w:before="280" w:after="160"/>
+        <w:rPr>
+          <w:rFonts w:cs="TH Sarabun New"/>
+          <w:b/>
+          <w:bCs/>
+          <w:color w:val="2E74B5"/>
+          <w:sz w:val="40"/>
+          <w:szCs w:val="28"/>
+        </w:rPr>
       </w:pPr>
       <w:r>
         <w:rPr>
-          <w:rFonts w:ascii="TH Sarabun New" w:eastAsia="TH Sarabun New" w:hAnsi="TH Sarabun New" w:cs="TH Sarabun New"/>
+          <w:rFonts w:cs="TH Sarabun New"/>
+        </w:rPr>
+        <w:br w:type="page"/>
+      </w:r>
+    </w:p>
+    <w:p>
+      <w:pPr>
+        <w:pStyle w:val="1"/>
+        <w:rPr>
+          <w:lang w:bidi="th-TH"/>
+        </w:rPr>
+      </w:pPr>
+      <w:r>
+        <w:rPr>
+          <w:rFonts w:hint="cs"/>
+          <w:cs/>
+          <w:lang w:bidi="th-TH"/>
         </w:rPr>
         <w:lastRenderedPageBreak/>
-        <w:t>R1 หนังสือขออนุญาตทำวิจัยในชั้นเรียน</w:t>
+        <w:t>ภาคผนวกแผน</w:t>
+      </w:r>
+      <w:r>
+        <w:rPr>
+          <w:cs/>
+          <w:lang w:bidi="th-TH"/>
+        </w:rPr>
+        <w:t xml:space="preserve"> </w:t>
+      </w:r>
+      <w:r>
+        <w:rPr>
+          <w:rFonts w:hint="cs"/>
+          <w:cs/>
+          <w:lang w:bidi="th-TH"/>
+        </w:rPr>
+        <w:t>จ</w:t>
+      </w:r>
+      <w:r>
+        <w:rPr>
+          <w:cs/>
+          <w:lang w:bidi="th-TH"/>
+        </w:rPr>
+        <w:t xml:space="preserve"> — </w:t>
+      </w:r>
+      <w:r>
+        <w:rPr>
+          <w:rFonts w:hint="cs"/>
+          <w:cs/>
+          <w:lang w:bidi="th-TH"/>
+        </w:rPr>
+        <w:t>แบบสังเกตพฤติกรรมการมีส่วนร่วมรายบุคคล</w:t>
+      </w:r>
+    </w:p>
+    <w:p>
+      <w:pPr>
+        <w:rPr>
+          <w:lang w:bidi="th-TH"/>
+        </w:rPr>
+      </w:pPr>
+      <w:r>
+        <w:rPr>
+          <w:cs/>
+          <w:lang w:bidi="th-TH"/>
+        </w:rPr>
+        <w:t>แบบสังเกตนี้ใช้ประกอบการตีความพฤติกรรมการมีส่วนร่วมของนักเรียนระหว่างการใช้เกมแข่งสูตรคูณในกิจกรรมวิจัย ไม่ใช้เป็นคะแนนผลสัมฤทธิ์ทางการเรียนโดยตรง ผู้สังเกตควรบันทึกหลังจบกิจกรรมในแต่ละช่วงหรือหลังครบกิจกรรมตามแผน</w:t>
+      </w:r>
+    </w:p>
+    <w:p>
+      <w:pPr>
+        <w:rPr>
+          <w:lang w:bidi="th-TH"/>
+        </w:rPr>
+      </w:pPr>
+      <w:r>
+        <w:rPr>
+          <w:cs/>
+          <w:lang w:bidi="th-TH"/>
+        </w:rPr>
+        <w:t xml:space="preserve">ผู้สังเกต ............................................................  วันที่สังเกต .......... / .......... / ..........  ช่วงกิจกรรม </w:t>
+      </w:r>
+      <w:r>
+        <w:rPr>
+          <w:rFonts w:ascii="Segoe UI Symbol" w:hAnsi="Segoe UI Symbol" w:cs="Segoe UI Symbol" w:hint="cs"/>
+          <w:cs/>
+          <w:lang w:bidi="th-TH"/>
+        </w:rPr>
+        <w:t>☐</w:t>
+      </w:r>
+      <w:r>
+        <w:rPr>
+          <w:cs/>
+          <w:lang w:bidi="th-TH"/>
+        </w:rPr>
+        <w:t xml:space="preserve"> </w:t>
+      </w:r>
+      <w:r>
+        <w:rPr>
+          <w:rFonts w:ascii="Cordia New" w:hAnsi="Cordia New" w:cs="Cordia New" w:hint="cs"/>
+          <w:cs/>
+          <w:lang w:bidi="th-TH"/>
+        </w:rPr>
+        <w:t>ก่อนเรียน</w:t>
+      </w:r>
+      <w:r>
+        <w:rPr>
+          <w:cs/>
+          <w:lang w:bidi="th-TH"/>
+        </w:rPr>
+        <w:t xml:space="preserve"> </w:t>
+      </w:r>
+      <w:r>
+        <w:rPr>
+          <w:rFonts w:ascii="Segoe UI Symbol" w:hAnsi="Segoe UI Symbol" w:cs="Segoe UI Symbol" w:hint="cs"/>
+          <w:cs/>
+          <w:lang w:bidi="th-TH"/>
+        </w:rPr>
+        <w:t>☐</w:t>
+      </w:r>
+      <w:r>
+        <w:rPr>
+          <w:cs/>
+          <w:lang w:bidi="th-TH"/>
+        </w:rPr>
+        <w:t xml:space="preserve"> </w:t>
+      </w:r>
+      <w:r>
+        <w:rPr>
+          <w:rFonts w:ascii="Cordia New" w:hAnsi="Cordia New" w:cs="Cordia New" w:hint="cs"/>
+          <w:cs/>
+          <w:lang w:bidi="th-TH"/>
+        </w:rPr>
+        <w:t>หลัง</w:t>
+      </w:r>
+      <w:r>
+        <w:rPr>
+          <w:cs/>
+          <w:lang w:bidi="th-TH"/>
+        </w:rPr>
+        <w:t>เรียน</w:t>
+      </w:r>
+    </w:p>
+    <w:p>
+      <w:pPr>
+        <w:rPr>
+          <w:lang w:bidi="th-TH"/>
+        </w:rPr>
+      </w:pPr>
+      <w:r>
+        <w:rPr>
+          <w:cs/>
+          <w:lang w:bidi="th-TH"/>
+        </w:rPr>
+        <w:t>เกณฑ์การให้คะแนนพฤติกรรมการมีส่วนร่วม</w:t>
+      </w:r>
+    </w:p>
+    <w:tbl>
+      <w:tblPr>
+        <w:tblW w:w="5000" w:type="pct"/>
+        <w:tblBorders>
+          <w:top w:val="single" w:sz="4" w:space="0" w:color="auto"/>
+          <w:left w:val="single" w:sz="4" w:space="0" w:color="auto"/>
+          <w:bottom w:val="single" w:sz="4" w:space="0" w:color="auto"/>
+          <w:right w:val="single" w:sz="4" w:space="0" w:color="auto"/>
+          <w:insideH w:val="single" w:sz="4" w:space="0" w:color="auto"/>
+          <w:insideV w:val="single" w:sz="4" w:space="0" w:color="auto"/>
+        </w:tblBorders>
+        <w:tblLook w:val="0000" w:firstRow="0" w:lastRow="0" w:firstColumn="0" w:lastColumn="0" w:noHBand="0" w:noVBand="0"/>
+      </w:tblPr>
+      <w:tblGrid>
+        <w:gridCol w:w="4838"/>
+        <w:gridCol w:w="4839"/>
+      </w:tblGrid>
+      <w:tr>
+        <w:tc>
+          <w:tcPr>
+            <w:tcW w:w="2500" w:type="pct"/>
+          </w:tcPr>
+          <w:p>
+            <w:r>
+              <w:rPr>
+                <w:cs/>
+                <w:lang w:bidi="th-TH"/>
+              </w:rPr>
+              <w:t>ระดับคะแนน</w:t>
+            </w:r>
+          </w:p>
+        </w:tc>
+        <w:tc>
+          <w:tcPr>
+            <w:tcW w:w="2500" w:type="pct"/>
+          </w:tcPr>
+          <w:p>
+            <w:r>
+              <w:rPr>
+                <w:cs/>
+                <w:lang w:bidi="th-TH"/>
+              </w:rPr>
+              <w:t>คำอธิบาย</w:t>
+            </w:r>
+          </w:p>
+        </w:tc>
+      </w:tr>
+      <w:tr>
+        <w:tc>
+          <w:tcPr>
+            <w:tcW w:w="2500" w:type="pct"/>
+          </w:tcPr>
+          <w:p>
+            <w:r>
+              <w:t>3</w:t>
+            </w:r>
+          </w:p>
+        </w:tc>
+        <w:tc>
+          <w:tcPr>
+            <w:tcW w:w="2500" w:type="pct"/>
+          </w:tcPr>
+          <w:p>
+            <w:r>
+              <w:rPr>
+                <w:cs/>
+                <w:lang w:bidi="th-TH"/>
+              </w:rPr>
+              <w:t>ปฏิบัติได้สม่ำเสมอ แสดงพฤติกรรมชัดเจนโดยไม่ต้องเตือน</w:t>
+            </w:r>
+          </w:p>
+        </w:tc>
+      </w:tr>
+      <w:tr>
+        <w:tc>
+          <w:tcPr>
+            <w:tcW w:w="2500" w:type="pct"/>
+          </w:tcPr>
+          <w:p>
+            <w:r>
+              <w:t>2</w:t>
+            </w:r>
+          </w:p>
+        </w:tc>
+        <w:tc>
+          <w:tcPr>
+            <w:tcW w:w="2500" w:type="pct"/>
+          </w:tcPr>
+          <w:p>
+            <w:r>
+              <w:rPr>
+                <w:cs/>
+                <w:lang w:bidi="th-TH"/>
+              </w:rPr>
+              <w:t>ปฏิบัติได้บางครั้ง หรือปฏิบัติได้เมื่อได้รับการเตือน/กระตุ้น</w:t>
+            </w:r>
+          </w:p>
+        </w:tc>
+      </w:tr>
+      <w:tr>
+        <w:tc>
+          <w:tcPr>
+            <w:tcW w:w="2500" w:type="pct"/>
+          </w:tcPr>
+          <w:p>
+            <w:r>
+              <w:t>1</w:t>
+            </w:r>
+          </w:p>
+        </w:tc>
+        <w:tc>
+          <w:tcPr>
+            <w:tcW w:w="2500" w:type="pct"/>
+          </w:tcPr>
+          <w:p>
+            <w:r>
+              <w:rPr>
+                <w:cs/>
+                <w:lang w:bidi="th-TH"/>
+              </w:rPr>
+              <w:t>ยังปฏิบัติได้น้อย ควรได้รับการส่งเสริมเพิ่มเติม</w:t>
+            </w:r>
+          </w:p>
+        </w:tc>
+      </w:tr>
+    </w:tbl>
+    <w:p/>
+    <w:p>
+      <w:pPr>
+        <w:rPr>
+          <w:lang w:bidi="th-TH"/>
+        </w:rPr>
+      </w:pPr>
+      <w:r>
+        <w:rPr>
+          <w:cs/>
+          <w:lang w:bidi="th-TH"/>
+        </w:rPr>
+        <w:t>ตารางบันทึกพฤติกรรมรายบุคคล</w:t>
+      </w:r>
+    </w:p>
+    <w:tbl>
+      <w:tblPr>
+        <w:tblW w:w="5000" w:type="pct"/>
+        <w:tblBorders>
+          <w:top w:val="single" w:sz="4" w:space="0" w:color="auto"/>
+          <w:left w:val="single" w:sz="4" w:space="0" w:color="auto"/>
+          <w:bottom w:val="single" w:sz="4" w:space="0" w:color="auto"/>
+          <w:right w:val="single" w:sz="4" w:space="0" w:color="auto"/>
+          <w:insideH w:val="single" w:sz="4" w:space="0" w:color="auto"/>
+          <w:insideV w:val="single" w:sz="4" w:space="0" w:color="auto"/>
+        </w:tblBorders>
+        <w:tblLook w:val="0000" w:firstRow="0" w:lastRow="0" w:firstColumn="0" w:lastColumn="0" w:noHBand="0" w:noVBand="0"/>
+      </w:tblPr>
+      <w:tblGrid>
+        <w:gridCol w:w="975"/>
+        <w:gridCol w:w="975"/>
+        <w:gridCol w:w="975"/>
+        <w:gridCol w:w="975"/>
+        <w:gridCol w:w="975"/>
+        <w:gridCol w:w="975"/>
+        <w:gridCol w:w="975"/>
+        <w:gridCol w:w="977"/>
+        <w:gridCol w:w="1875"/>
+      </w:tblGrid>
+      <w:tr>
+        <w:tc>
+          <w:tcPr>
+            <w:tcW w:w="555" w:type="pct"/>
+          </w:tcPr>
+          <w:p>
+            <w:r>
+              <w:rPr>
+                <w:cs/>
+                <w:lang w:bidi="th-TH"/>
+              </w:rPr>
+              <w:t>เลขที่</w:t>
+            </w:r>
+          </w:p>
+        </w:tc>
+        <w:tc>
+          <w:tcPr>
+            <w:tcW w:w="555" w:type="pct"/>
+          </w:tcPr>
+          <w:p>
+            <w:r>
+              <w:rPr>
+                <w:cs/>
+                <w:lang w:bidi="th-TH"/>
+              </w:rPr>
+              <w:t>รหัส</w:t>
+            </w:r>
+          </w:p>
+        </w:tc>
+        <w:tc>
+          <w:tcPr>
+            <w:tcW w:w="555" w:type="pct"/>
+          </w:tcPr>
+          <w:p>
+            <w:r>
+              <w:rPr>
+                <w:cs/>
+                <w:lang w:bidi="th-TH"/>
+              </w:rPr>
+              <w:t>ชื่อ-สกุล</w:t>
+            </w:r>
+          </w:p>
+        </w:tc>
+        <w:tc>
+          <w:tcPr>
+            <w:tcW w:w="555" w:type="pct"/>
+          </w:tcPr>
+          <w:p>
+            <w:r>
+              <w:rPr>
+                <w:cs/>
+                <w:lang w:bidi="th-TH"/>
+              </w:rPr>
+              <w:t>ตั้งใจ/ตรงเวลา</w:t>
+            </w:r>
+          </w:p>
+        </w:tc>
+        <w:tc>
+          <w:tcPr>
+            <w:tcW w:w="555" w:type="pct"/>
+          </w:tcPr>
+          <w:p>
+            <w:r>
+              <w:rPr>
+                <w:cs/>
+                <w:lang w:bidi="th-TH"/>
+              </w:rPr>
+              <w:t>เล่นตามกติกา</w:t>
+            </w:r>
+          </w:p>
+        </w:tc>
+        <w:tc>
+          <w:tcPr>
+            <w:tcW w:w="555" w:type="pct"/>
+          </w:tcPr>
+          <w:p>
+            <w:r>
+              <w:rPr>
+                <w:cs/>
+                <w:lang w:bidi="th-TH"/>
+              </w:rPr>
+              <w:t>แก้ไขเมื่อทำผิด</w:t>
+            </w:r>
+          </w:p>
+        </w:tc>
+        <w:tc>
+          <w:tcPr>
+            <w:tcW w:w="555" w:type="pct"/>
+          </w:tcPr>
+          <w:p>
+            <w:r>
+              <w:rPr>
+                <w:cs/>
+                <w:lang w:bidi="th-TH"/>
+              </w:rPr>
+              <w:t>ขอความช่วยเหลือ</w:t>
+            </w:r>
+          </w:p>
+        </w:tc>
+        <w:tc>
+          <w:tcPr>
+            <w:tcW w:w="556" w:type="pct"/>
+          </w:tcPr>
+          <w:p>
+            <w:r>
+              <w:rPr>
+                <w:cs/>
+                <w:lang w:bidi="th-TH"/>
+              </w:rPr>
+              <w:t>รวม</w:t>
+            </w:r>
+          </w:p>
+        </w:tc>
+        <w:tc>
+          <w:tcPr>
+            <w:tcW w:w="556" w:type="pct"/>
+          </w:tcPr>
+          <w:p>
+            <w:r>
+              <w:rPr>
+                <w:cs/>
+                <w:lang w:bidi="th-TH"/>
+              </w:rPr>
+              <w:t>หมายเหตุ</w:t>
+            </w:r>
+          </w:p>
+        </w:tc>
+      </w:tr>
+      <w:tr>
+        <w:tc>
+          <w:tcPr>
+            <w:tcW w:w="555" w:type="pct"/>
+          </w:tcPr>
+          <w:p>
+            <w:r>
+              <w:t>1</w:t>
+            </w:r>
+          </w:p>
+        </w:tc>
+        <w:tc>
+          <w:tcPr>
+            <w:tcW w:w="555" w:type="pct"/>
+          </w:tcPr>
+          <w:p>
+            <w:r>
+              <w:t>1319</w:t>
+            </w:r>
+          </w:p>
+        </w:tc>
+        <w:tc>
+          <w:tcPr>
+            <w:tcW w:w="555" w:type="pct"/>
+          </w:tcPr>
+          <w:p>
+            <w:r>
+              <w:rPr>
+                <w:cs/>
+                <w:lang w:bidi="th-TH"/>
+              </w:rPr>
+              <w:t>ด.ช.ชนาธิป แสงดี</w:t>
+            </w:r>
+          </w:p>
+        </w:tc>
+        <w:tc>
+          <w:tcPr>
+            <w:tcW w:w="555" w:type="pct"/>
+          </w:tcPr>
+          <w:p>
+            <w:r>
+              <w:t>____</w:t>
+            </w:r>
+          </w:p>
+        </w:tc>
+        <w:tc>
+          <w:tcPr>
+            <w:tcW w:w="555" w:type="pct"/>
+          </w:tcPr>
+          <w:p>
+            <w:r>
+              <w:t>____</w:t>
+            </w:r>
+          </w:p>
+        </w:tc>
+        <w:tc>
+          <w:tcPr>
+            <w:tcW w:w="555" w:type="pct"/>
+          </w:tcPr>
+          <w:p>
+            <w:r>
+              <w:t>____</w:t>
+            </w:r>
+          </w:p>
+        </w:tc>
+        <w:tc>
+          <w:tcPr>
+            <w:tcW w:w="555" w:type="pct"/>
+          </w:tcPr>
+          <w:p>
+            <w:r>
+              <w:t>____</w:t>
+            </w:r>
+          </w:p>
+        </w:tc>
+        <w:tc>
+          <w:tcPr>
+            <w:tcW w:w="556" w:type="pct"/>
+          </w:tcPr>
+          <w:p>
+            <w:r>
+              <w:t>____</w:t>
+            </w:r>
+          </w:p>
+        </w:tc>
+        <w:tc>
+          <w:tcPr>
+            <w:tcW w:w="556" w:type="pct"/>
+          </w:tcPr>
+          <w:p>
+            <w:r>
+              <w:t>................................</w:t>
+            </w:r>
+          </w:p>
+        </w:tc>
+      </w:tr>
+      <w:tr>
+        <w:tc>
+          <w:tcPr>
+            <w:tcW w:w="555" w:type="pct"/>
+          </w:tcPr>
+          <w:p>
+            <w:r>
+              <w:t>2</w:t>
+            </w:r>
+          </w:p>
+        </w:tc>
+        <w:tc>
+          <w:tcPr>
+            <w:tcW w:w="555" w:type="pct"/>
+          </w:tcPr>
+          <w:p>
+            <w:r>
+              <w:t>1320</w:t>
+            </w:r>
+          </w:p>
+        </w:tc>
+        <w:tc>
+          <w:tcPr>
+            <w:tcW w:w="555" w:type="pct"/>
+          </w:tcPr>
+          <w:p>
+            <w:r>
+              <w:rPr>
+                <w:cs/>
+                <w:lang w:bidi="th-TH"/>
+              </w:rPr>
+              <w:t>ด.ช.พชรพร จรุงพันธ์</w:t>
+            </w:r>
+          </w:p>
+        </w:tc>
+        <w:tc>
+          <w:tcPr>
+            <w:tcW w:w="555" w:type="pct"/>
+          </w:tcPr>
+          <w:p>
+            <w:r>
+              <w:t>____</w:t>
+            </w:r>
+          </w:p>
+        </w:tc>
+        <w:tc>
+          <w:tcPr>
+            <w:tcW w:w="555" w:type="pct"/>
+          </w:tcPr>
+          <w:p>
+            <w:r>
+              <w:t>____</w:t>
+            </w:r>
+          </w:p>
+        </w:tc>
+        <w:tc>
+          <w:tcPr>
+            <w:tcW w:w="555" w:type="pct"/>
+          </w:tcPr>
+          <w:p>
+            <w:r>
+              <w:t>____</w:t>
+            </w:r>
+          </w:p>
+        </w:tc>
+        <w:tc>
+          <w:tcPr>
+            <w:tcW w:w="555" w:type="pct"/>
+          </w:tcPr>
+          <w:p>
+            <w:r>
+              <w:t>____</w:t>
+            </w:r>
+          </w:p>
+        </w:tc>
+        <w:tc>
+          <w:tcPr>
+            <w:tcW w:w="556" w:type="pct"/>
+          </w:tcPr>
+          <w:p>
+            <w:r>
+              <w:t>____</w:t>
+            </w:r>
+          </w:p>
+        </w:tc>
+        <w:tc>
+          <w:tcPr>
+            <w:tcW w:w="556" w:type="pct"/>
+          </w:tcPr>
+          <w:p>
+            <w:r>
+              <w:t>................................</w:t>
+            </w:r>
+          </w:p>
+        </w:tc>
+      </w:tr>
+      <w:tr>
+        <w:tc>
+          <w:tcPr>
+            <w:tcW w:w="555" w:type="pct"/>
+          </w:tcPr>
+          <w:p>
+            <w:r>
+              <w:t>3</w:t>
+            </w:r>
+          </w:p>
+        </w:tc>
+        <w:tc>
+          <w:tcPr>
+            <w:tcW w:w="555" w:type="pct"/>
+          </w:tcPr>
+          <w:p>
+            <w:r>
+              <w:t>1321</w:t>
+            </w:r>
+          </w:p>
+        </w:tc>
+        <w:tc>
+          <w:tcPr>
+            <w:tcW w:w="555" w:type="pct"/>
+          </w:tcPr>
+          <w:p>
+            <w:r>
+              <w:rPr>
+                <w:cs/>
+                <w:lang w:bidi="th-TH"/>
+              </w:rPr>
+              <w:t>ด.ช.พีรวัส นิโม</w:t>
+            </w:r>
+          </w:p>
+        </w:tc>
+        <w:tc>
+          <w:tcPr>
+            <w:tcW w:w="555" w:type="pct"/>
+          </w:tcPr>
+          <w:p>
+            <w:r>
+              <w:t>____</w:t>
+            </w:r>
+          </w:p>
+        </w:tc>
+        <w:tc>
+          <w:tcPr>
+            <w:tcW w:w="555" w:type="pct"/>
+          </w:tcPr>
+          <w:p>
+            <w:r>
+              <w:t>____</w:t>
+            </w:r>
+          </w:p>
+        </w:tc>
+        <w:tc>
+          <w:tcPr>
+            <w:tcW w:w="555" w:type="pct"/>
+          </w:tcPr>
+          <w:p>
+            <w:r>
+              <w:t>____</w:t>
+            </w:r>
+          </w:p>
+        </w:tc>
+        <w:tc>
+          <w:tcPr>
+            <w:tcW w:w="555" w:type="pct"/>
+          </w:tcPr>
+          <w:p>
+            <w:r>
+              <w:t>____</w:t>
+            </w:r>
+          </w:p>
+        </w:tc>
+        <w:tc>
+          <w:tcPr>
+            <w:tcW w:w="556" w:type="pct"/>
+          </w:tcPr>
+          <w:p>
+            <w:r>
+              <w:t>____</w:t>
+            </w:r>
+          </w:p>
+        </w:tc>
+        <w:tc>
+          <w:tcPr>
+            <w:tcW w:w="556" w:type="pct"/>
+          </w:tcPr>
+          <w:p>
+            <w:r>
+              <w:t>................................</w:t>
+            </w:r>
+          </w:p>
+        </w:tc>
+      </w:tr>
+      <w:tr>
+        <w:tc>
+          <w:tcPr>
+            <w:tcW w:w="555" w:type="pct"/>
+          </w:tcPr>
+          <w:p>
+            <w:r>
+              <w:t>4</w:t>
+            </w:r>
+          </w:p>
+        </w:tc>
+        <w:tc>
+          <w:tcPr>
+            <w:tcW w:w="555" w:type="pct"/>
+          </w:tcPr>
+          <w:p>
+            <w:r>
+              <w:t>1322</w:t>
+            </w:r>
+          </w:p>
+        </w:tc>
+        <w:tc>
+          <w:tcPr>
+            <w:tcW w:w="555" w:type="pct"/>
+          </w:tcPr>
+          <w:p>
+            <w:r>
+              <w:rPr>
+                <w:cs/>
+                <w:lang w:bidi="th-TH"/>
+              </w:rPr>
+              <w:t>ด.ช.อดิศร ว่องไว</w:t>
+            </w:r>
+          </w:p>
+        </w:tc>
+        <w:tc>
+          <w:tcPr>
+            <w:tcW w:w="555" w:type="pct"/>
+          </w:tcPr>
+          <w:p>
+            <w:r>
+              <w:t>____</w:t>
+            </w:r>
+          </w:p>
+        </w:tc>
+        <w:tc>
+          <w:tcPr>
+            <w:tcW w:w="555" w:type="pct"/>
+          </w:tcPr>
+          <w:p>
+            <w:r>
+              <w:t>____</w:t>
+            </w:r>
+          </w:p>
+        </w:tc>
+        <w:tc>
+          <w:tcPr>
+            <w:tcW w:w="555" w:type="pct"/>
+          </w:tcPr>
+          <w:p>
+            <w:r>
+              <w:t>____</w:t>
+            </w:r>
+          </w:p>
+        </w:tc>
+        <w:tc>
+          <w:tcPr>
+            <w:tcW w:w="555" w:type="pct"/>
+          </w:tcPr>
+          <w:p>
+            <w:r>
+              <w:t>____</w:t>
+            </w:r>
+          </w:p>
+        </w:tc>
+        <w:tc>
+          <w:tcPr>
+            <w:tcW w:w="556" w:type="pct"/>
+          </w:tcPr>
+          <w:p>
+            <w:r>
+              <w:t>____</w:t>
+            </w:r>
+          </w:p>
+        </w:tc>
+        <w:tc>
+          <w:tcPr>
+            <w:tcW w:w="556" w:type="pct"/>
+          </w:tcPr>
+          <w:p>
+            <w:r>
+              <w:t>................................</w:t>
+            </w:r>
+          </w:p>
+        </w:tc>
+      </w:tr>
+      <w:tr>
+        <w:tc>
+          <w:tcPr>
+            <w:tcW w:w="555" w:type="pct"/>
+          </w:tcPr>
+          <w:p>
+            <w:r>
+              <w:t>5</w:t>
+            </w:r>
+          </w:p>
+        </w:tc>
+        <w:tc>
+          <w:tcPr>
+            <w:tcW w:w="555" w:type="pct"/>
+          </w:tcPr>
+          <w:p>
+            <w:r>
+              <w:t>1323</w:t>
+            </w:r>
+          </w:p>
+        </w:tc>
+        <w:tc>
+          <w:tcPr>
+            <w:tcW w:w="555" w:type="pct"/>
+          </w:tcPr>
+          <w:p>
+            <w:r>
+              <w:rPr>
+                <w:cs/>
+                <w:lang w:bidi="th-TH"/>
+              </w:rPr>
+              <w:t>ด.ญ.สรารัตน์ มฤกุล</w:t>
+            </w:r>
+          </w:p>
+        </w:tc>
+        <w:tc>
+          <w:tcPr>
+            <w:tcW w:w="555" w:type="pct"/>
+          </w:tcPr>
+          <w:p>
+            <w:r>
+              <w:t>____</w:t>
+            </w:r>
+          </w:p>
+        </w:tc>
+        <w:tc>
+          <w:tcPr>
+            <w:tcW w:w="555" w:type="pct"/>
+          </w:tcPr>
+          <w:p>
+            <w:r>
+              <w:t>____</w:t>
+            </w:r>
+          </w:p>
+        </w:tc>
+        <w:tc>
+          <w:tcPr>
+            <w:tcW w:w="555" w:type="pct"/>
+          </w:tcPr>
+          <w:p>
+            <w:r>
+              <w:t>____</w:t>
+            </w:r>
+          </w:p>
+        </w:tc>
+        <w:tc>
+          <w:tcPr>
+            <w:tcW w:w="555" w:type="pct"/>
+          </w:tcPr>
+          <w:p>
+            <w:r>
+              <w:t>____</w:t>
+            </w:r>
+          </w:p>
+        </w:tc>
+        <w:tc>
+          <w:tcPr>
+            <w:tcW w:w="556" w:type="pct"/>
+          </w:tcPr>
+          <w:p>
+            <w:r>
+              <w:t>____</w:t>
+            </w:r>
+          </w:p>
+        </w:tc>
+        <w:tc>
+          <w:tcPr>
+            <w:tcW w:w="556" w:type="pct"/>
+          </w:tcPr>
+          <w:p>
+            <w:r>
+              <w:t>................................</w:t>
+            </w:r>
+          </w:p>
+        </w:tc>
+      </w:tr>
+      <w:tr>
+        <w:tc>
+          <w:tcPr>
+            <w:tcW w:w="555" w:type="pct"/>
+          </w:tcPr>
+          <w:p>
+            <w:r>
+              <w:t>6</w:t>
+            </w:r>
+          </w:p>
+        </w:tc>
+        <w:tc>
+          <w:tcPr>
+            <w:tcW w:w="555" w:type="pct"/>
+          </w:tcPr>
+          <w:p>
+            <w:r>
+              <w:t>1324</w:t>
+            </w:r>
+          </w:p>
+        </w:tc>
+        <w:tc>
+          <w:tcPr>
+            <w:tcW w:w="555" w:type="pct"/>
+          </w:tcPr>
+          <w:p>
+            <w:r>
+              <w:rPr>
+                <w:cs/>
+                <w:lang w:bidi="th-TH"/>
+              </w:rPr>
+              <w:t>ด.ญ.อัญมณี เบิกบานดี</w:t>
+            </w:r>
+          </w:p>
+        </w:tc>
+        <w:tc>
+          <w:tcPr>
+            <w:tcW w:w="555" w:type="pct"/>
+          </w:tcPr>
+          <w:p>
+            <w:r>
+              <w:t>____</w:t>
+            </w:r>
+          </w:p>
+        </w:tc>
+        <w:tc>
+          <w:tcPr>
+            <w:tcW w:w="555" w:type="pct"/>
+          </w:tcPr>
+          <w:p>
+            <w:r>
+              <w:t>____</w:t>
+            </w:r>
+          </w:p>
+        </w:tc>
+        <w:tc>
+          <w:tcPr>
+            <w:tcW w:w="555" w:type="pct"/>
+          </w:tcPr>
+          <w:p>
+            <w:r>
+              <w:t>____</w:t>
+            </w:r>
+          </w:p>
+        </w:tc>
+        <w:tc>
+          <w:tcPr>
+            <w:tcW w:w="555" w:type="pct"/>
+          </w:tcPr>
+          <w:p>
+            <w:r>
+              <w:t>____</w:t>
+            </w:r>
+          </w:p>
+        </w:tc>
+        <w:tc>
+          <w:tcPr>
+            <w:tcW w:w="556" w:type="pct"/>
+          </w:tcPr>
+          <w:p>
+            <w:r>
+              <w:t>____</w:t>
+            </w:r>
+          </w:p>
+        </w:tc>
+        <w:tc>
+          <w:tcPr>
+            <w:tcW w:w="556" w:type="pct"/>
+          </w:tcPr>
+          <w:p>
+            <w:r>
+              <w:t>................................</w:t>
+            </w:r>
+          </w:p>
+        </w:tc>
+      </w:tr>
+      <w:tr>
+        <w:tc>
+          <w:tcPr>
+            <w:tcW w:w="555" w:type="pct"/>
+          </w:tcPr>
+          <w:p>
+            <w:r>
+              <w:t>7</w:t>
+            </w:r>
+          </w:p>
+        </w:tc>
+        <w:tc>
+          <w:tcPr>
+            <w:tcW w:w="555" w:type="pct"/>
+          </w:tcPr>
+          <w:p>
+            <w:r>
+              <w:t>1326</w:t>
+            </w:r>
+          </w:p>
+        </w:tc>
+        <w:tc>
+          <w:tcPr>
+            <w:tcW w:w="555" w:type="pct"/>
+          </w:tcPr>
+          <w:p>
+            <w:r>
+              <w:rPr>
+                <w:cs/>
+                <w:lang w:bidi="th-TH"/>
+              </w:rPr>
+              <w:t>ด.ญ.สุพิชฌาย์ ศรีนาดี</w:t>
+            </w:r>
+          </w:p>
+        </w:tc>
+        <w:tc>
+          <w:tcPr>
+            <w:tcW w:w="555" w:type="pct"/>
+          </w:tcPr>
+          <w:p>
+            <w:r>
+              <w:t>____</w:t>
+            </w:r>
+          </w:p>
+        </w:tc>
+        <w:tc>
+          <w:tcPr>
+            <w:tcW w:w="555" w:type="pct"/>
+          </w:tcPr>
+          <w:p>
+            <w:r>
+              <w:t>____</w:t>
+            </w:r>
+          </w:p>
+        </w:tc>
+        <w:tc>
+          <w:tcPr>
+            <w:tcW w:w="555" w:type="pct"/>
+          </w:tcPr>
+          <w:p>
+            <w:r>
+              <w:t>____</w:t>
+            </w:r>
+          </w:p>
+        </w:tc>
+        <w:tc>
+          <w:tcPr>
+            <w:tcW w:w="555" w:type="pct"/>
+          </w:tcPr>
+          <w:p>
+            <w:r>
+              <w:t>____</w:t>
+            </w:r>
+          </w:p>
+        </w:tc>
+        <w:tc>
+          <w:tcPr>
+            <w:tcW w:w="556" w:type="pct"/>
+          </w:tcPr>
+          <w:p>
+            <w:r>
+              <w:t>____</w:t>
+            </w:r>
+          </w:p>
+        </w:tc>
+        <w:tc>
+          <w:tcPr>
+            <w:tcW w:w="556" w:type="pct"/>
+          </w:tcPr>
+          <w:p>
+            <w:r>
+              <w:t>................................</w:t>
+            </w:r>
+          </w:p>
+        </w:tc>
+      </w:tr>
+      <w:tr>
+        <w:tc>
+          <w:tcPr>
+            <w:tcW w:w="555" w:type="pct"/>
+          </w:tcPr>
+          <w:p>
+            <w:r>
+              <w:lastRenderedPageBreak/>
+              <w:t>8</w:t>
+            </w:r>
+          </w:p>
+        </w:tc>
+        <w:tc>
+          <w:tcPr>
+            <w:tcW w:w="555" w:type="pct"/>
+          </w:tcPr>
+          <w:p>
+            <w:r>
+              <w:t>1327</w:t>
+            </w:r>
+          </w:p>
+        </w:tc>
+        <w:tc>
+          <w:tcPr>
+            <w:tcW w:w="555" w:type="pct"/>
+          </w:tcPr>
+          <w:p>
+            <w:r>
+              <w:rPr>
+                <w:cs/>
+                <w:lang w:bidi="th-TH"/>
+              </w:rPr>
+              <w:t>ด.ช.มนต์มนัส คณิโรจน์</w:t>
+            </w:r>
+          </w:p>
+        </w:tc>
+        <w:tc>
+          <w:tcPr>
+            <w:tcW w:w="555" w:type="pct"/>
+          </w:tcPr>
+          <w:p>
+            <w:r>
+              <w:t>____</w:t>
+            </w:r>
+          </w:p>
+        </w:tc>
+        <w:tc>
+          <w:tcPr>
+            <w:tcW w:w="555" w:type="pct"/>
+          </w:tcPr>
+          <w:p>
+            <w:r>
+              <w:t>____</w:t>
+            </w:r>
+          </w:p>
+        </w:tc>
+        <w:tc>
+          <w:tcPr>
+            <w:tcW w:w="555" w:type="pct"/>
+          </w:tcPr>
+          <w:p>
+            <w:r>
+              <w:t>____</w:t>
+            </w:r>
+          </w:p>
+        </w:tc>
+        <w:tc>
+          <w:tcPr>
+            <w:tcW w:w="555" w:type="pct"/>
+          </w:tcPr>
+          <w:p>
+            <w:r>
+              <w:t>____</w:t>
+            </w:r>
+          </w:p>
+        </w:tc>
+        <w:tc>
+          <w:tcPr>
+            <w:tcW w:w="556" w:type="pct"/>
+          </w:tcPr>
+          <w:p>
+            <w:r>
+              <w:t>____</w:t>
+            </w:r>
+          </w:p>
+        </w:tc>
+        <w:tc>
+          <w:tcPr>
+            <w:tcW w:w="556" w:type="pct"/>
+          </w:tcPr>
+          <w:p>
+            <w:r>
+              <w:t>................................</w:t>
+            </w:r>
+          </w:p>
+        </w:tc>
+      </w:tr>
+    </w:tbl>
+    <w:p/>
+    <w:p>
+      <w:pPr>
+        <w:rPr>
+          <w:lang w:bidi="th-TH"/>
+        </w:rPr>
+      </w:pPr>
+      <w:r>
+        <w:rPr>
+          <w:cs/>
+          <w:lang w:bidi="th-TH"/>
+        </w:rPr>
+        <w:t xml:space="preserve">รายการสังเกต </w:t>
+      </w:r>
+      <w:r>
+        <w:t xml:space="preserve">4 </w:t>
+      </w:r>
+      <w:r>
+        <w:rPr>
+          <w:cs/>
+          <w:lang w:bidi="th-TH"/>
+        </w:rPr>
+        <w:t>รายการ ได้แก่ (</w:t>
+      </w:r>
+      <w:r>
+        <w:t xml:space="preserve">1) </w:t>
+      </w:r>
+      <w:r>
+        <w:rPr>
+          <w:cs/>
+          <w:lang w:bidi="th-TH"/>
+        </w:rPr>
+        <w:t>ตั้งใจและเริ่มกิจกรรมตามเวลา (</w:t>
+      </w:r>
+      <w:r>
+        <w:t xml:space="preserve">2) </w:t>
+      </w:r>
+      <w:r>
+        <w:rPr>
+          <w:cs/>
+          <w:lang w:bidi="th-TH"/>
+        </w:rPr>
+        <w:t>เล่นตามกติกาและไม่ใช้บัญชีผู้อื่น (</w:t>
+      </w:r>
+      <w:r>
+        <w:t xml:space="preserve">3) </w:t>
+      </w:r>
+      <w:r>
+        <w:rPr>
+          <w:cs/>
+          <w:lang w:bidi="th-TH"/>
+        </w:rPr>
+        <w:t>พยายามแก้ไขเมื่อทำผิด และ (</w:t>
+      </w:r>
+      <w:r>
+        <w:t xml:space="preserve">4) </w:t>
+      </w:r>
+      <w:r>
+        <w:rPr>
+          <w:cs/>
+          <w:lang w:bidi="th-TH"/>
+        </w:rPr>
+        <w:t>ขอความช่วยเหลืออย่างเหมาะสม</w:t>
+      </w:r>
+    </w:p>
+    <w:p>
+      <w:r>
+        <w:br w:type="page"/>
+      </w:r>
+    </w:p>
+    <w:p>
+      <w:pPr>
+        <w:pStyle w:val="1"/>
+      </w:pPr>
+      <w:r>
+        <w:lastRenderedPageBreak/>
+        <w:t xml:space="preserve">R1 </w:t>
+      </w:r>
+      <w:r>
+        <w:rPr>
+          <w:rFonts w:ascii="Browallia New" w:hAnsi="Browallia New" w:cs="Browallia New"/>
+        </w:rPr>
+        <w:t>หนังสือขออนุญาตทำวิจัยในชั้นเรียน</w:t>
       </w:r>
     </w:p>
     <w:p>

</xml_diff>